<commit_message>
creacion de agenda para un doctor hecho
</commit_message>
<xml_diff>
--- a/Relaciones.docx
+++ b/Relaciones.docx
@@ -162,7 +162,7 @@
     <w:p>
       <w:r>
         <w:pict w14:anchorId="690922E2">
-          <v:rect id="_x0000_i1073" style="width:0;height:1.5pt" o:hralign="center" o:hrstd="t" o:hr="t" fillcolor="#a0a0a0" stroked="f"/>
+          <v:rect id="_x0000_i1025" style="width:0;height:1.5pt" o:hralign="center" o:hrstd="t" o:hr="t" fillcolor="#a0a0a0" stroked="f"/>
         </w:pict>
       </w:r>
     </w:p>
@@ -334,7 +334,7 @@
       <w:r>
         <w:lastRenderedPageBreak/>
         <w:pict w14:anchorId="1E8C1FCE">
-          <v:rect id="_x0000_i1074" style="width:0;height:1.5pt" o:hralign="center" o:hrstd="t" o:hr="t" fillcolor="#a0a0a0" stroked="f"/>
+          <v:rect id="_x0000_i1026" style="width:0;height:1.5pt" o:hralign="center" o:hrstd="t" o:hr="t" fillcolor="#a0a0a0" stroked="f"/>
         </w:pict>
       </w:r>
     </w:p>
@@ -367,22 +367,7 @@
       </w:r>
       <w:r>
         <w:br/>
-      </w:r>
-      <w:proofErr w:type="spellStart"/>
-      <w:r>
-        <w:t>public</w:t>
-      </w:r>
-      <w:proofErr w:type="spellEnd"/>
-      <w:r>
-        <w:t xml:space="preserve"> </w:t>
-      </w:r>
-      <w:proofErr w:type="spellStart"/>
-      <w:r>
-        <w:t>class</w:t>
-      </w:r>
-      <w:proofErr w:type="spellEnd"/>
-      <w:r>
-        <w:t xml:space="preserve"> Paciente {</w:t>
+        <w:t>public class Paciente {</w:t>
       </w:r>
       <w:r>
         <w:br/>
@@ -393,101 +378,29 @@
       </w:r>
       <w:r>
         <w:br/>
-        <w:t xml:space="preserve">    </w:t>
-      </w:r>
-      <w:proofErr w:type="spellStart"/>
-      <w:r>
-        <w:t>private</w:t>
-      </w:r>
-      <w:proofErr w:type="spellEnd"/>
-      <w:r>
-        <w:t xml:space="preserve"> UUID id;</w:t>
-      </w:r>
-      <w:r>
-        <w:br/>
-      </w:r>
-      <w:r>
-        <w:br/>
-        <w:t xml:space="preserve">    </w:t>
-      </w:r>
-      <w:proofErr w:type="spellStart"/>
-      <w:r>
-        <w:t>private</w:t>
-      </w:r>
-      <w:proofErr w:type="spellEnd"/>
-      <w:r>
-        <w:t xml:space="preserve"> String </w:t>
-      </w:r>
-      <w:proofErr w:type="spellStart"/>
-      <w:r>
-        <w:t>name</w:t>
-      </w:r>
-      <w:proofErr w:type="spellEnd"/>
-      <w:r>
-        <w:t>;</w:t>
-      </w:r>
-      <w:r>
-        <w:br/>
-        <w:t xml:space="preserve">    </w:t>
-      </w:r>
-      <w:proofErr w:type="spellStart"/>
-      <w:r>
-        <w:t>private</w:t>
-      </w:r>
-      <w:proofErr w:type="spellEnd"/>
-      <w:r>
-        <w:t xml:space="preserve"> String </w:t>
-      </w:r>
-      <w:proofErr w:type="spellStart"/>
-      <w:r>
-        <w:t>lastName</w:t>
-      </w:r>
-      <w:proofErr w:type="spellEnd"/>
-      <w:r>
-        <w:t>;</w:t>
-      </w:r>
-      <w:r>
-        <w:br/>
-      </w:r>
-      <w:r>
-        <w:br/>
-        <w:t xml:space="preserve">    </w:t>
-      </w:r>
-      <w:proofErr w:type="spellStart"/>
-      <w:r>
-        <w:t>private</w:t>
-      </w:r>
-      <w:proofErr w:type="spellEnd"/>
-      <w:r>
-        <w:t xml:space="preserve"> String </w:t>
-      </w:r>
-      <w:proofErr w:type="spellStart"/>
-      <w:r>
-        <w:t>phone</w:t>
-      </w:r>
-      <w:proofErr w:type="spellEnd"/>
-      <w:r>
-        <w:t>;</w:t>
-      </w:r>
-      <w:r>
-        <w:br/>
-        <w:t xml:space="preserve">    </w:t>
-      </w:r>
-      <w:proofErr w:type="spellStart"/>
-      <w:r>
-        <w:t>private</w:t>
-      </w:r>
-      <w:proofErr w:type="spellEnd"/>
-      <w:r>
-        <w:t xml:space="preserve"> String </w:t>
-      </w:r>
-      <w:proofErr w:type="spellStart"/>
-      <w:r>
-        <w:t>dni</w:t>
-      </w:r>
-      <w:proofErr w:type="spellEnd"/>
-      <w:r>
-        <w:t>;</w:t>
+        <w:t xml:space="preserve">    private UUID id;</w:t>
+      </w:r>
+      <w:r>
+        <w:br/>
+      </w:r>
+      <w:r>
+        <w:br/>
+        <w:t xml:space="preserve">    private String name;</w:t>
+      </w:r>
+      <w:r>
+        <w:br/>
+        <w:t xml:space="preserve">    private String lastName;</w:t>
+      </w:r>
+      <w:r>
+        <w:br/>
+      </w:r>
+      <w:r>
+        <w:br/>
+        <w:t xml:space="preserve">    private String phone;</w:t>
+      </w:r>
+      <w:r>
+        <w:br/>
+        <w:t xml:space="preserve">    private String dni;</w:t>
       </w:r>
       <w:r>
         <w:br/>
@@ -502,23 +415,7 @@
       </w:r>
       <w:r>
         <w:br/>
-        <w:t xml:space="preserve">    </w:t>
-      </w:r>
-      <w:proofErr w:type="spellStart"/>
-      <w:r>
-        <w:t>private</w:t>
-      </w:r>
-      <w:proofErr w:type="spellEnd"/>
-      <w:r>
-        <w:t xml:space="preserve"> Usuario </w:t>
-      </w:r>
-      <w:proofErr w:type="spellStart"/>
-      <w:r>
-        <w:t>usuario</w:t>
-      </w:r>
-      <w:proofErr w:type="spellEnd"/>
-      <w:r>
-        <w:t>;</w:t>
+        <w:t xml:space="preserve">    private Usuario usuario;</w:t>
       </w:r>
       <w:r>
         <w:br/>
@@ -528,7 +425,7 @@
     <w:p>
       <w:r>
         <w:pict w14:anchorId="00ACE44D">
-          <v:rect id="_x0000_i1075" style="width:0;height:1.5pt" o:hralign="center" o:hrstd="t" o:hr="t" fillcolor="#a0a0a0" stroked="f"/>
+          <v:rect id="_x0000_i1027" style="width:0;height:1.5pt" o:hralign="center" o:hrstd="t" o:hr="t" fillcolor="#a0a0a0" stroked="f"/>
         </w:pict>
       </w:r>
     </w:p>
@@ -561,22 +458,7 @@
       </w:r>
       <w:r>
         <w:br/>
-      </w:r>
-      <w:proofErr w:type="spellStart"/>
-      <w:r>
-        <w:t>public</w:t>
-      </w:r>
-      <w:proofErr w:type="spellEnd"/>
-      <w:r>
-        <w:t xml:space="preserve"> </w:t>
-      </w:r>
-      <w:proofErr w:type="spellStart"/>
-      <w:r>
-        <w:t>class</w:t>
-      </w:r>
-      <w:proofErr w:type="spellEnd"/>
-      <w:r>
-        <w:t xml:space="preserve"> Cita {</w:t>
+        <w:t>public class Cita {</w:t>
       </w:r>
       <w:r>
         <w:br/>
@@ -587,15 +469,7 @@
       </w:r>
       <w:r>
         <w:br/>
-        <w:t xml:space="preserve">    </w:t>
-      </w:r>
-      <w:proofErr w:type="spellStart"/>
-      <w:r>
-        <w:t>private</w:t>
-      </w:r>
-      <w:proofErr w:type="spellEnd"/>
-      <w:r>
-        <w:t xml:space="preserve"> UUID id;</w:t>
+        <w:t xml:space="preserve">    private UUID id;</w:t>
       </w:r>
       <w:r>
         <w:br/>
@@ -606,23 +480,7 @@
       </w:r>
       <w:r>
         <w:br/>
-        <w:t xml:space="preserve">    </w:t>
-      </w:r>
-      <w:proofErr w:type="spellStart"/>
-      <w:r>
-        <w:t>private</w:t>
-      </w:r>
-      <w:proofErr w:type="spellEnd"/>
-      <w:r>
-        <w:t xml:space="preserve"> Doctor </w:t>
-      </w:r>
-      <w:proofErr w:type="spellStart"/>
-      <w:r>
-        <w:t>doctor</w:t>
-      </w:r>
-      <w:proofErr w:type="spellEnd"/>
-      <w:r>
-        <w:t>;</w:t>
+        <w:t xml:space="preserve">    private Doctor doctor;</w:t>
       </w:r>
       <w:r>
         <w:br/>
@@ -633,136 +491,40 @@
       </w:r>
       <w:r>
         <w:br/>
-        <w:t xml:space="preserve">    </w:t>
-      </w:r>
-      <w:proofErr w:type="spellStart"/>
-      <w:r>
-        <w:t>private</w:t>
-      </w:r>
-      <w:proofErr w:type="spellEnd"/>
-      <w:r>
-        <w:t xml:space="preserve"> Paciente </w:t>
-      </w:r>
-      <w:proofErr w:type="spellStart"/>
-      <w:r>
-        <w:t>paciente</w:t>
-      </w:r>
-      <w:proofErr w:type="spellEnd"/>
-      <w:r>
-        <w:t>;</w:t>
-      </w:r>
-      <w:r>
-        <w:br/>
-      </w:r>
-      <w:r>
-        <w:br/>
-        <w:t xml:space="preserve">    </w:t>
-      </w:r>
-      <w:proofErr w:type="spellStart"/>
-      <w:r>
-        <w:t>private</w:t>
-      </w:r>
-      <w:proofErr w:type="spellEnd"/>
-      <w:r>
-        <w:t xml:space="preserve"> </w:t>
-      </w:r>
-      <w:proofErr w:type="spellStart"/>
-      <w:r>
-        <w:t>LocalDateTime</w:t>
-      </w:r>
-      <w:proofErr w:type="spellEnd"/>
-      <w:r>
-        <w:t xml:space="preserve"> </w:t>
-      </w:r>
-      <w:proofErr w:type="spellStart"/>
-      <w:r>
-        <w:t>fechaInicio</w:t>
-      </w:r>
-      <w:proofErr w:type="spellEnd"/>
-      <w:r>
-        <w:t>;</w:t>
-      </w:r>
-      <w:r>
-        <w:br/>
-        <w:t xml:space="preserve">    </w:t>
-      </w:r>
-      <w:proofErr w:type="spellStart"/>
-      <w:r>
-        <w:t>private</w:t>
-      </w:r>
-      <w:proofErr w:type="spellEnd"/>
-      <w:r>
-        <w:t xml:space="preserve"> </w:t>
-      </w:r>
-      <w:proofErr w:type="spellStart"/>
-      <w:r>
-        <w:t>LocalDateTime</w:t>
-      </w:r>
-      <w:proofErr w:type="spellEnd"/>
-      <w:r>
-        <w:t xml:space="preserve"> </w:t>
-      </w:r>
-      <w:proofErr w:type="spellStart"/>
-      <w:r>
-        <w:t>fechaFin</w:t>
-      </w:r>
-      <w:proofErr w:type="spellEnd"/>
-      <w:r>
-        <w:t>;</w:t>
-      </w:r>
-      <w:r>
-        <w:br/>
-      </w:r>
-      <w:r>
-        <w:br/>
-        <w:t xml:space="preserve">    </w:t>
-      </w:r>
-      <w:proofErr w:type="spellStart"/>
-      <w:r>
-        <w:t>private</w:t>
-      </w:r>
-      <w:proofErr w:type="spellEnd"/>
-      <w:r>
-        <w:t xml:space="preserve"> String estado; // PENDIENTE, CONFIRMADA, CANCELADA</w:t>
-      </w:r>
-      <w:r>
-        <w:br/>
-        <w:t xml:space="preserve">    </w:t>
-      </w:r>
-      <w:proofErr w:type="spellStart"/>
-      <w:r>
-        <w:t>private</w:t>
-      </w:r>
-      <w:proofErr w:type="spellEnd"/>
-      <w:r>
-        <w:t xml:space="preserve"> String motivo;</w:t>
-      </w:r>
-      <w:r>
-        <w:br/>
-        <w:t xml:space="preserve">    </w:t>
-      </w:r>
-      <w:proofErr w:type="spellStart"/>
-      <w:r>
-        <w:t>private</w:t>
-      </w:r>
-      <w:proofErr w:type="spellEnd"/>
-      <w:r>
-        <w:t xml:space="preserve"> String notas;</w:t>
+        <w:t xml:space="preserve">    private Paciente paciente;</w:t>
+      </w:r>
+      <w:r>
+        <w:br/>
+      </w:r>
+      <w:r>
+        <w:br/>
+        <w:t xml:space="preserve">    private LocalDateTime fechaInicio;</w:t>
+      </w:r>
+      <w:r>
+        <w:br/>
+        <w:t xml:space="preserve">    private LocalDateTime fechaFin;</w:t>
+      </w:r>
+      <w:r>
+        <w:br/>
+      </w:r>
+      <w:r>
+        <w:br/>
+        <w:t xml:space="preserve">    private String estado; // PENDIENTE, CONFIRMADA, CANCELADA</w:t>
+      </w:r>
+      <w:r>
+        <w:br/>
+        <w:t xml:space="preserve">    private String motivo;</w:t>
+      </w:r>
+      <w:r>
+        <w:br/>
+        <w:t xml:space="preserve">    private String notas;</w:t>
       </w:r>
       <w:r>
         <w:br/>
       </w:r>
       <w:r>
         <w:lastRenderedPageBreak/>
-        <w:t xml:space="preserve">    </w:t>
-      </w:r>
-      <w:proofErr w:type="spellStart"/>
-      <w:r>
-        <w:t>private</w:t>
-      </w:r>
-      <w:proofErr w:type="spellEnd"/>
-      <w:r>
-        <w:t xml:space="preserve"> String sala;</w:t>
+        <w:t xml:space="preserve">    private String sala;</w:t>
       </w:r>
       <w:r>
         <w:br/>
@@ -772,7 +534,7 @@
     <w:p>
       <w:r>
         <w:pict w14:anchorId="03BF15E0">
-          <v:rect id="_x0000_i1076" style="width:0;height:1.5pt" o:hralign="center" o:hrstd="t" o:hr="t" fillcolor="#a0a0a0" stroked="f"/>
+          <v:rect id="_x0000_i1028" style="width:0;height:1.5pt" o:hralign="center" o:hrstd="t" o:hr="t" fillcolor="#a0a0a0" stroked="f"/>
         </w:pict>
       </w:r>
     </w:p>
@@ -805,30 +567,7 @@
       </w:r>
       <w:r>
         <w:br/>
-      </w:r>
-      <w:proofErr w:type="spellStart"/>
-      <w:r>
-        <w:t>public</w:t>
-      </w:r>
-      <w:proofErr w:type="spellEnd"/>
-      <w:r>
-        <w:t xml:space="preserve"> </w:t>
-      </w:r>
-      <w:proofErr w:type="spellStart"/>
-      <w:r>
-        <w:t>class</w:t>
-      </w:r>
-      <w:proofErr w:type="spellEnd"/>
-      <w:r>
-        <w:t xml:space="preserve"> </w:t>
-      </w:r>
-      <w:proofErr w:type="spellStart"/>
-      <w:r>
-        <w:t>ListaEspera</w:t>
-      </w:r>
-      <w:proofErr w:type="spellEnd"/>
-      <w:r>
-        <w:t xml:space="preserve"> {</w:t>
+        <w:t>public class ListaEspera {</w:t>
       </w:r>
       <w:r>
         <w:br/>
@@ -839,15 +578,7 @@
       </w:r>
       <w:r>
         <w:br/>
-        <w:t xml:space="preserve">    </w:t>
-      </w:r>
-      <w:proofErr w:type="spellStart"/>
-      <w:r>
-        <w:t>private</w:t>
-      </w:r>
-      <w:proofErr w:type="spellEnd"/>
-      <w:r>
-        <w:t xml:space="preserve"> UUID id;</w:t>
+        <w:t xml:space="preserve">    private UUID id;</w:t>
       </w:r>
       <w:r>
         <w:br/>
@@ -858,107 +589,35 @@
       </w:r>
       <w:r>
         <w:br/>
-        <w:t xml:space="preserve">    </w:t>
-      </w:r>
-      <w:proofErr w:type="spellStart"/>
-      <w:r>
-        <w:t>private</w:t>
-      </w:r>
-      <w:proofErr w:type="spellEnd"/>
-      <w:r>
-        <w:t xml:space="preserve"> Paciente </w:t>
-      </w:r>
-      <w:proofErr w:type="spellStart"/>
-      <w:r>
-        <w:t>paciente</w:t>
-      </w:r>
-      <w:proofErr w:type="spellEnd"/>
-      <w:r>
-        <w:t>;</w:t>
-      </w:r>
-      <w:r>
-        <w:br/>
-      </w:r>
-      <w:r>
-        <w:br/>
-        <w:t xml:space="preserve">    </w:t>
-      </w:r>
-      <w:proofErr w:type="spellStart"/>
-      <w:r>
-        <w:t>private</w:t>
-      </w:r>
-      <w:proofErr w:type="spellEnd"/>
-      <w:r>
-        <w:t xml:space="preserve"> String especialidad;</w:t>
-      </w:r>
-      <w:r>
-        <w:br/>
-      </w:r>
-      <w:r>
-        <w:br/>
-        <w:t xml:space="preserve">    </w:t>
-      </w:r>
-      <w:proofErr w:type="spellStart"/>
-      <w:r>
-        <w:t>private</w:t>
-      </w:r>
-      <w:proofErr w:type="spellEnd"/>
-      <w:r>
-        <w:t xml:space="preserve"> </w:t>
-      </w:r>
-      <w:proofErr w:type="spellStart"/>
-      <w:r>
-        <w:t>Integer</w:t>
-      </w:r>
-      <w:proofErr w:type="spellEnd"/>
-      <w:r>
-        <w:t xml:space="preserve"> prioridad;</w:t>
-      </w:r>
-      <w:r>
-        <w:br/>
-      </w:r>
-      <w:r>
-        <w:br/>
-        <w:t xml:space="preserve">    </w:t>
-      </w:r>
-      <w:proofErr w:type="spellStart"/>
-      <w:r>
-        <w:t>private</w:t>
-      </w:r>
-      <w:proofErr w:type="spellEnd"/>
-      <w:r>
-        <w:t xml:space="preserve"> </w:t>
-      </w:r>
-      <w:proofErr w:type="spellStart"/>
-      <w:r>
-        <w:t>LocalDateTime</w:t>
-      </w:r>
-      <w:proofErr w:type="spellEnd"/>
-      <w:r>
-        <w:t xml:space="preserve"> </w:t>
-      </w:r>
-      <w:proofErr w:type="spellStart"/>
-      <w:r>
-        <w:t>fechaRegistro</w:t>
-      </w:r>
-      <w:proofErr w:type="spellEnd"/>
-      <w:r>
-        <w:t>;</w:t>
-      </w:r>
-      <w:r>
-        <w:br/>
-      </w:r>
-      <w:r>
-        <w:br/>
-        <w:t xml:space="preserve">    </w:t>
-      </w:r>
-      <w:proofErr w:type="spellStart"/>
-      <w:r>
-        <w:t>private</w:t>
-      </w:r>
-      <w:proofErr w:type="spellEnd"/>
-      <w:r>
-        <w:t xml:space="preserve"> String estado; // ACTIVA, ASIGNADA, CANCELADA</w:t>
+        <w:t xml:space="preserve">    private Paciente paciente;</w:t>
+      </w:r>
+      <w:r>
+        <w:br/>
+      </w:r>
+      <w:r>
+        <w:br/>
+        <w:t xml:space="preserve">    private String especialidad;</w:t>
+      </w:r>
+      <w:r>
+        <w:br/>
+      </w:r>
+      <w:r>
+        <w:br/>
+        <w:t xml:space="preserve">    private Integer prioridad;</w:t>
+      </w:r>
+      <w:r>
+        <w:br/>
+      </w:r>
+      <w:r>
+        <w:br/>
+        <w:t xml:space="preserve">    private LocalDateTime fechaRegistro;</w:t>
+      </w:r>
+      <w:r>
+        <w:br/>
+      </w:r>
+      <w:r>
+        <w:br/>
+        <w:t xml:space="preserve">    private String estado; // ACTIVA, ASIGNADA, CANCELADA</w:t>
       </w:r>
       <w:r>
         <w:br/>
@@ -968,7 +627,7 @@
     <w:p>
       <w:r>
         <w:pict w14:anchorId="54B6D2D2">
-          <v:rect id="_x0000_i1077" style="width:0;height:1.5pt" o:hralign="center" o:hrstd="t" o:hr="t" fillcolor="#a0a0a0" stroked="f"/>
+          <v:rect id="_x0000_i1029" style="width:0;height:1.5pt" o:hralign="center" o:hrstd="t" o:hr="t" fillcolor="#a0a0a0" stroked="f"/>
         </w:pict>
       </w:r>
     </w:p>
@@ -1001,30 +660,7 @@
       </w:r>
       <w:r>
         <w:br/>
-      </w:r>
-      <w:proofErr w:type="spellStart"/>
-      <w:r>
-        <w:t>public</w:t>
-      </w:r>
-      <w:proofErr w:type="spellEnd"/>
-      <w:r>
-        <w:t xml:space="preserve"> </w:t>
-      </w:r>
-      <w:proofErr w:type="spellStart"/>
-      <w:r>
-        <w:t>class</w:t>
-      </w:r>
-      <w:proofErr w:type="spellEnd"/>
-      <w:r>
-        <w:t xml:space="preserve"> </w:t>
-      </w:r>
-      <w:proofErr w:type="spellStart"/>
-      <w:r>
-        <w:t>Notificacion</w:t>
-      </w:r>
-      <w:proofErr w:type="spellEnd"/>
-      <w:r>
-        <w:t xml:space="preserve"> {</w:t>
+        <w:t>public class Notificacion {</w:t>
       </w:r>
       <w:r>
         <w:br/>
@@ -1035,15 +671,7 @@
       </w:r>
       <w:r>
         <w:br/>
-        <w:t xml:space="preserve">    </w:t>
-      </w:r>
-      <w:proofErr w:type="spellStart"/>
-      <w:r>
-        <w:t>private</w:t>
-      </w:r>
-      <w:proofErr w:type="spellEnd"/>
-      <w:r>
-        <w:t xml:space="preserve"> UUID id;</w:t>
+        <w:t xml:space="preserve">    private UUID id;</w:t>
       </w:r>
       <w:r>
         <w:br/>
@@ -1054,84 +682,28 @@
       </w:r>
       <w:r>
         <w:br/>
-        <w:t xml:space="preserve">    </w:t>
-      </w:r>
-      <w:proofErr w:type="spellStart"/>
-      <w:r>
-        <w:t>private</w:t>
-      </w:r>
-      <w:proofErr w:type="spellEnd"/>
-      <w:r>
-        <w:t xml:space="preserve"> Paciente </w:t>
-      </w:r>
-      <w:proofErr w:type="spellStart"/>
-      <w:r>
-        <w:t>paciente</w:t>
-      </w:r>
-      <w:proofErr w:type="spellEnd"/>
-      <w:r>
-        <w:t>;</w:t>
-      </w:r>
-      <w:r>
-        <w:br/>
-      </w:r>
-      <w:r>
-        <w:br/>
-        <w:t xml:space="preserve">    </w:t>
-      </w:r>
-      <w:proofErr w:type="spellStart"/>
-      <w:r>
-        <w:t>private</w:t>
-      </w:r>
-      <w:proofErr w:type="spellEnd"/>
-      <w:r>
-        <w:t xml:space="preserve"> String tipo; // EMAIL, SISTEMA</w:t>
-      </w:r>
-      <w:r>
-        <w:br/>
-      </w:r>
-      <w:r>
-        <w:br/>
-        <w:t xml:space="preserve">    </w:t>
-      </w:r>
-      <w:proofErr w:type="spellStart"/>
-      <w:r>
-        <w:t>private</w:t>
-      </w:r>
-      <w:proofErr w:type="spellEnd"/>
-      <w:r>
-        <w:t xml:space="preserve"> String mensaje;</w:t>
-      </w:r>
-      <w:r>
-        <w:br/>
-      </w:r>
-      <w:r>
-        <w:br/>
-        <w:t xml:space="preserve">    </w:t>
-      </w:r>
-      <w:proofErr w:type="spellStart"/>
-      <w:r>
-        <w:t>private</w:t>
-      </w:r>
-      <w:proofErr w:type="spellEnd"/>
-      <w:r>
-        <w:t xml:space="preserve"> </w:t>
-      </w:r>
-      <w:proofErr w:type="spellStart"/>
-      <w:r>
-        <w:t>LocalDateTime</w:t>
-      </w:r>
-      <w:proofErr w:type="spellEnd"/>
-      <w:r>
-        <w:t xml:space="preserve"> </w:t>
-      </w:r>
-      <w:proofErr w:type="spellStart"/>
-      <w:r>
-        <w:t>fechaEnvio</w:t>
-      </w:r>
-      <w:proofErr w:type="spellEnd"/>
-      <w:r>
-        <w:t>;</w:t>
+        <w:t xml:space="preserve">    private Paciente paciente;</w:t>
+      </w:r>
+      <w:r>
+        <w:br/>
+      </w:r>
+      <w:r>
+        <w:br/>
+        <w:t xml:space="preserve">    private String tipo; // EMAIL, SISTEMA</w:t>
+      </w:r>
+      <w:r>
+        <w:br/>
+      </w:r>
+      <w:r>
+        <w:br/>
+        <w:t xml:space="preserve">    private String mensaje;</w:t>
+      </w:r>
+      <w:r>
+        <w:br/>
+      </w:r>
+      <w:r>
+        <w:br/>
+        <w:t xml:space="preserve">    private LocalDateTime fechaEnvio;</w:t>
       </w:r>
       <w:r>
         <w:br/>
@@ -1141,31 +713,7 @@
       </w:r>
       <w:r>
         <w:lastRenderedPageBreak/>
-        <w:t xml:space="preserve">    </w:t>
-      </w:r>
-      <w:proofErr w:type="spellStart"/>
-      <w:r>
-        <w:t>private</w:t>
-      </w:r>
-      <w:proofErr w:type="spellEnd"/>
-      <w:r>
-        <w:t xml:space="preserve"> </w:t>
-      </w:r>
-      <w:proofErr w:type="spellStart"/>
-      <w:r>
-        <w:t>boolean</w:t>
-      </w:r>
-      <w:proofErr w:type="spellEnd"/>
-      <w:r>
-        <w:t xml:space="preserve"> </w:t>
-      </w:r>
-      <w:proofErr w:type="spellStart"/>
-      <w:r>
-        <w:t>leida</w:t>
-      </w:r>
-      <w:proofErr w:type="spellEnd"/>
-      <w:r>
-        <w:t>;</w:t>
+        <w:t xml:space="preserve">    private boolean leida;</w:t>
       </w:r>
       <w:r>
         <w:br/>
@@ -1175,7 +723,7 @@
     <w:p>
       <w:r>
         <w:pict w14:anchorId="04C29A37">
-          <v:rect id="_x0000_i1078" style="width:0;height:1.5pt" o:hralign="center" o:hrstd="t" o:hr="t" fillcolor="#a0a0a0" stroked="f"/>
+          <v:rect id="_x0000_i1030" style="width:0;height:1.5pt" o:hralign="center" o:hrstd="t" o:hr="t" fillcolor="#a0a0a0" stroked="f"/>
         </w:pict>
       </w:r>
     </w:p>
@@ -1208,22 +756,7 @@
       </w:r>
       <w:r>
         <w:br/>
-      </w:r>
-      <w:proofErr w:type="spellStart"/>
-      <w:r>
-        <w:t>public</w:t>
-      </w:r>
-      <w:proofErr w:type="spellEnd"/>
-      <w:r>
-        <w:t xml:space="preserve"> </w:t>
-      </w:r>
-      <w:proofErr w:type="spellStart"/>
-      <w:r>
-        <w:t>class</w:t>
-      </w:r>
-      <w:proofErr w:type="spellEnd"/>
-      <w:r>
-        <w:t xml:space="preserve"> Auditoria {</w:t>
+        <w:t>public class Auditoria {</w:t>
       </w:r>
       <w:r>
         <w:br/>
@@ -1234,15 +767,7 @@
       </w:r>
       <w:r>
         <w:br/>
-        <w:t xml:space="preserve">    </w:t>
-      </w:r>
-      <w:proofErr w:type="spellStart"/>
-      <w:r>
-        <w:t>private</w:t>
-      </w:r>
-      <w:proofErr w:type="spellEnd"/>
-      <w:r>
-        <w:t xml:space="preserve"> UUID id;</w:t>
+        <w:t xml:space="preserve">    private UUID id;</w:t>
       </w:r>
       <w:r>
         <w:br/>
@@ -1253,124 +778,36 @@
       </w:r>
       <w:r>
         <w:br/>
-        <w:t xml:space="preserve">    </w:t>
-      </w:r>
-      <w:proofErr w:type="spellStart"/>
-      <w:r>
-        <w:t>private</w:t>
-      </w:r>
-      <w:proofErr w:type="spellEnd"/>
-      <w:r>
-        <w:t xml:space="preserve"> Usuario </w:t>
-      </w:r>
-      <w:proofErr w:type="spellStart"/>
-      <w:r>
-        <w:t>usuario</w:t>
-      </w:r>
-      <w:proofErr w:type="spellEnd"/>
-      <w:r>
-        <w:t>;</w:t>
-      </w:r>
-      <w:r>
-        <w:br/>
-      </w:r>
-      <w:r>
-        <w:br/>
-        <w:t xml:space="preserve">    </w:t>
-      </w:r>
-      <w:proofErr w:type="spellStart"/>
-      <w:r>
-        <w:t>private</w:t>
-      </w:r>
-      <w:proofErr w:type="spellEnd"/>
-      <w:r>
-        <w:t xml:space="preserve"> String </w:t>
-      </w:r>
-      <w:proofErr w:type="spellStart"/>
-      <w:r>
-        <w:t>accion</w:t>
-      </w:r>
-      <w:proofErr w:type="spellEnd"/>
-      <w:r>
-        <w:t>;</w:t>
-      </w:r>
-      <w:r>
-        <w:br/>
-        <w:t xml:space="preserve">    </w:t>
-      </w:r>
-      <w:proofErr w:type="spellStart"/>
-      <w:r>
-        <w:t>private</w:t>
-      </w:r>
-      <w:proofErr w:type="spellEnd"/>
-      <w:r>
-        <w:t xml:space="preserve"> String entidad;</w:t>
-      </w:r>
-      <w:r>
-        <w:br/>
-        <w:t xml:space="preserve">    </w:t>
-      </w:r>
-      <w:proofErr w:type="spellStart"/>
-      <w:r>
-        <w:t>private</w:t>
-      </w:r>
-      <w:proofErr w:type="spellEnd"/>
-      <w:r>
-        <w:t xml:space="preserve"> UUID </w:t>
-      </w:r>
-      <w:proofErr w:type="spellStart"/>
-      <w:r>
-        <w:t>entidadId</w:t>
-      </w:r>
-      <w:proofErr w:type="spellEnd"/>
-      <w:r>
-        <w:t>;</w:t>
-      </w:r>
-      <w:r>
-        <w:br/>
-      </w:r>
-      <w:r>
-        <w:br/>
-        <w:t xml:space="preserve">    </w:t>
-      </w:r>
-      <w:proofErr w:type="spellStart"/>
-      <w:r>
-        <w:t>private</w:t>
-      </w:r>
-      <w:proofErr w:type="spellEnd"/>
-      <w:r>
-        <w:t xml:space="preserve"> </w:t>
-      </w:r>
-      <w:proofErr w:type="spellStart"/>
-      <w:r>
-        <w:t>LocalDateTime</w:t>
-      </w:r>
-      <w:proofErr w:type="spellEnd"/>
-      <w:r>
-        <w:t xml:space="preserve"> fecha;</w:t>
-      </w:r>
-      <w:r>
-        <w:br/>
-      </w:r>
-      <w:r>
-        <w:br/>
-        <w:t xml:space="preserve">    </w:t>
-      </w:r>
-      <w:proofErr w:type="spellStart"/>
-      <w:r>
-        <w:t>private</w:t>
-      </w:r>
-      <w:proofErr w:type="spellEnd"/>
-      <w:r>
-        <w:t xml:space="preserve"> String </w:t>
-      </w:r>
-      <w:proofErr w:type="spellStart"/>
-      <w:r>
-        <w:t>ip</w:t>
-      </w:r>
-      <w:proofErr w:type="spellEnd"/>
-      <w:r>
-        <w:t>;</w:t>
+        <w:t xml:space="preserve">    private Usuario usuario;</w:t>
+      </w:r>
+      <w:r>
+        <w:br/>
+      </w:r>
+      <w:r>
+        <w:br/>
+        <w:t xml:space="preserve">    private String accion;</w:t>
+      </w:r>
+      <w:r>
+        <w:br/>
+        <w:t xml:space="preserve">    private String entidad;</w:t>
+      </w:r>
+      <w:r>
+        <w:br/>
+        <w:t xml:space="preserve">    private UUID entidadId;</w:t>
+      </w:r>
+      <w:r>
+        <w:br/>
+      </w:r>
+      <w:r>
+        <w:br/>
+        <w:t xml:space="preserve">    private LocalDateTime fecha;</w:t>
+      </w:r>
+      <w:r>
+        <w:br/>
+      </w:r>
+      <w:r>
+        <w:br/>
+        <w:t xml:space="preserve">    private String ip;</w:t>
       </w:r>
       <w:r>
         <w:br/>
@@ -1380,7 +817,7 @@
     <w:p>
       <w:r>
         <w:pict w14:anchorId="38A2F4FD">
-          <v:rect id="_x0000_i1079" style="width:0;height:1.5pt" o:hralign="center" o:hrstd="t" o:hr="t" fillcolor="#a0a0a0" stroked="f"/>
+          <v:rect id="_x0000_i1031" style="width:0;height:1.5pt" o:hralign="center" o:hrstd="t" o:hr="t" fillcolor="#a0a0a0" stroked="f"/>
         </w:pict>
       </w:r>
     </w:p>
@@ -1408,21 +845,8 @@
       </w:r>
     </w:p>
     <w:p>
-      <w:proofErr w:type="spellStart"/>
-      <w:r>
-        <w:t>public</w:t>
-      </w:r>
-      <w:proofErr w:type="spellEnd"/>
-      <w:r>
-        <w:t xml:space="preserve"> </w:t>
-      </w:r>
-      <w:proofErr w:type="spellStart"/>
-      <w:r>
-        <w:t>enum</w:t>
-      </w:r>
-      <w:proofErr w:type="spellEnd"/>
-      <w:r>
-        <w:t xml:space="preserve"> Rol {</w:t>
+      <w:r>
+        <w:t>public enum Rol {</w:t>
       </w:r>
       <w:r>
         <w:br/>
@@ -1444,7 +868,7 @@
     <w:p>
       <w:r>
         <w:pict w14:anchorId="5E9D72E9">
-          <v:rect id="_x0000_i1080" style="width:0;height:1.5pt" o:hralign="center" o:hrstd="t" o:hr="t" fillcolor="#a0a0a0" stroked="f"/>
+          <v:rect id="_x0000_i1032" style="width:0;height:1.5pt" o:hralign="center" o:hrstd="t" o:hr="t" fillcolor="#a0a0a0" stroked="f"/>
         </w:pict>
       </w:r>
     </w:p>
@@ -1665,6 +1089,251 @@
       <w:proofErr w:type="gramEnd"/>
       <w:r>
         <w:t xml:space="preserve"> NOTIFICACION</w:t>
+      </w:r>
+    </w:p>
+    <w:p/>
+    <w:p>
+      <w:pPr>
+        <w:rPr>
+          <w:b/>
+          <w:bCs/>
+        </w:rPr>
+      </w:pPr>
+      <w:r>
+        <w:rPr>
+          <w:b/>
+          <w:bCs/>
+        </w:rPr>
+        <w:t>Roles del sistema</w:t>
+      </w:r>
+    </w:p>
+    <w:p>
+      <w:pPr>
+        <w:rPr>
+          <w:b/>
+          <w:bCs/>
+        </w:rPr>
+      </w:pPr>
+      <w:r>
+        <w:rPr>
+          <w:b/>
+          <w:bCs/>
+        </w:rPr>
+        <w:t>ADMIN</w:t>
+      </w:r>
+    </w:p>
+    <w:p>
+      <w:r>
+        <w:t>Puede:</w:t>
+      </w:r>
+    </w:p>
+    <w:p>
+      <w:pPr>
+        <w:numPr>
+          <w:ilvl w:val="0"/>
+          <w:numId w:val="1"/>
+        </w:numPr>
+      </w:pPr>
+      <w:r>
+        <w:t xml:space="preserve">Crear médicos. </w:t>
+      </w:r>
+    </w:p>
+    <w:p>
+      <w:pPr>
+        <w:numPr>
+          <w:ilvl w:val="0"/>
+          <w:numId w:val="1"/>
+        </w:numPr>
+      </w:pPr>
+      <w:r>
+        <w:t xml:space="preserve">Gestionar agendas. </w:t>
+      </w:r>
+    </w:p>
+    <w:p>
+      <w:pPr>
+        <w:numPr>
+          <w:ilvl w:val="0"/>
+          <w:numId w:val="1"/>
+        </w:numPr>
+      </w:pPr>
+      <w:r>
+        <w:t xml:space="preserve">Ver todas las citas. </w:t>
+      </w:r>
+    </w:p>
+    <w:p>
+      <w:pPr>
+        <w:numPr>
+          <w:ilvl w:val="0"/>
+          <w:numId w:val="1"/>
+        </w:numPr>
+      </w:pPr>
+      <w:r>
+        <w:t xml:space="preserve">Cancelar o reasignar citas. </w:t>
+      </w:r>
+    </w:p>
+    <w:p>
+      <w:r>
+        <w:pict w14:anchorId="45C6CBF4">
+          <v:rect id="_x0000_i1045" style="width:0;height:1.5pt" o:hralign="center" o:hrstd="t" o:hr="t" fillcolor="#a0a0a0" stroked="f"/>
+        </w:pict>
+      </w:r>
+    </w:p>
+    <w:p>
+      <w:pPr>
+        <w:rPr>
+          <w:b/>
+          <w:bCs/>
+        </w:rPr>
+      </w:pPr>
+      <w:r>
+        <w:rPr>
+          <w:b/>
+          <w:bCs/>
+        </w:rPr>
+        <w:t>DOCTOR</w:t>
+      </w:r>
+    </w:p>
+    <w:p>
+      <w:r>
+        <w:t>Puede:</w:t>
+      </w:r>
+    </w:p>
+    <w:p>
+      <w:pPr>
+        <w:numPr>
+          <w:ilvl w:val="0"/>
+          <w:numId w:val="2"/>
+        </w:numPr>
+      </w:pPr>
+      <w:r>
+        <w:t xml:space="preserve">Ver sus citas del día. </w:t>
+      </w:r>
+    </w:p>
+    <w:p>
+      <w:pPr>
+        <w:numPr>
+          <w:ilvl w:val="0"/>
+          <w:numId w:val="2"/>
+        </w:numPr>
+      </w:pPr>
+      <w:r>
+        <w:t xml:space="preserve">Ver el historial del paciente. </w:t>
+      </w:r>
+    </w:p>
+    <w:p>
+      <w:pPr>
+        <w:numPr>
+          <w:ilvl w:val="0"/>
+          <w:numId w:val="2"/>
+        </w:numPr>
+      </w:pPr>
+      <w:r>
+        <w:t xml:space="preserve">Confirmar o completar consultas. </w:t>
+      </w:r>
+    </w:p>
+    <w:p>
+      <w:pPr>
+        <w:numPr>
+          <w:ilvl w:val="0"/>
+          <w:numId w:val="2"/>
+        </w:numPr>
+      </w:pPr>
+      <w:r>
+        <w:t xml:space="preserve">Añadir notas clínicas (si quieres implementarlo más adelante). </w:t>
+      </w:r>
+    </w:p>
+    <w:p>
+      <w:r>
+        <w:pict w14:anchorId="768B2F9F">
+          <v:rect id="_x0000_i1046" style="width:0;height:1.5pt" o:hralign="center" o:hrstd="t" o:hr="t" fillcolor="#a0a0a0" stroked="f"/>
+        </w:pict>
+      </w:r>
+    </w:p>
+    <w:p>
+      <w:pPr>
+        <w:rPr>
+          <w:b/>
+          <w:bCs/>
+        </w:rPr>
+      </w:pPr>
+      <w:r>
+        <w:rPr>
+          <w:b/>
+          <w:bCs/>
+        </w:rPr>
+        <w:t>PATIENT</w:t>
+      </w:r>
+    </w:p>
+    <w:p>
+      <w:r>
+        <w:t>Puede:</w:t>
+      </w:r>
+    </w:p>
+    <w:p>
+      <w:pPr>
+        <w:numPr>
+          <w:ilvl w:val="0"/>
+          <w:numId w:val="3"/>
+        </w:numPr>
+      </w:pPr>
+      <w:r>
+        <w:t xml:space="preserve">Ver médicos disponibles. </w:t>
+      </w:r>
+    </w:p>
+    <w:p>
+      <w:pPr>
+        <w:numPr>
+          <w:ilvl w:val="0"/>
+          <w:numId w:val="3"/>
+        </w:numPr>
+      </w:pPr>
+      <w:r>
+        <w:t xml:space="preserve">Consultar huecos libres. </w:t>
+      </w:r>
+    </w:p>
+    <w:p>
+      <w:pPr>
+        <w:numPr>
+          <w:ilvl w:val="0"/>
+          <w:numId w:val="3"/>
+        </w:numPr>
+      </w:pPr>
+      <w:r>
+        <w:t xml:space="preserve">Reservar citas. </w:t>
+      </w:r>
+    </w:p>
+    <w:p>
+      <w:pPr>
+        <w:numPr>
+          <w:ilvl w:val="0"/>
+          <w:numId w:val="3"/>
+        </w:numPr>
+      </w:pPr>
+      <w:r>
+        <w:t xml:space="preserve">Cancelar sus citas. </w:t>
+      </w:r>
+    </w:p>
+    <w:p>
+      <w:pPr>
+        <w:numPr>
+          <w:ilvl w:val="0"/>
+          <w:numId w:val="3"/>
+        </w:numPr>
+      </w:pPr>
+      <w:r>
+        <w:t xml:space="preserve">Consultar su historial de citas. </w:t>
+      </w:r>
+    </w:p>
+    <w:p>
+      <w:pPr>
+        <w:numPr>
+          <w:ilvl w:val="0"/>
+          <w:numId w:val="3"/>
+        </w:numPr>
+      </w:pPr>
+      <w:r>
+        <w:lastRenderedPageBreak/>
+        <w:t>Entrar en lista de espera.</w:t>
       </w:r>
     </w:p>
     <w:p/>
@@ -1676,6 +1345,467 @@
     </w:sectPr>
   </w:body>
 </w:document>
+</file>
+
+<file path=word/numbering.xml><?xml version="1.0" encoding="utf-8"?>
+<w:numbering xmlns:wpc="http://schemas.microsoft.com/office/word/2010/wordprocessingCanvas" xmlns:cx="http://schemas.microsoft.com/office/drawing/2014/chartex" xmlns:cx1="http://schemas.microsoft.com/office/drawing/2015/9/8/chartex" xmlns:cx2="http://schemas.microsoft.com/office/drawing/2015/10/21/chartex" xmlns:cx3="http://schemas.microsoft.com/office/drawing/2016/5/9/chartex" xmlns:cx4="http://schemas.microsoft.com/office/drawing/2016/5/10/chartex" xmlns:cx5="http://schemas.microsoft.com/office/drawing/2016/5/11/chartex" xmlns:cx6="http://schemas.microsoft.com/office/drawing/2016/5/12/chartex" xmlns:cx7="http://schemas.microsoft.com/office/drawing/2016/5/13/chartex" xmlns:cx8="http://schemas.microsoft.com/office/drawing/2016/5/14/chartex" xmlns:mc="http://schemas.openxmlformats.org/markup-compatibility/2006" xmlns:aink="http://schemas.microsoft.com/office/drawing/2016/ink" xmlns:am3d="http://schemas.microsoft.com/office/drawing/2017/model3d" xmlns:o="urn:schemas-microsoft-com:office:office" xmlns:oel="http://schemas.microsoft.com/office/2019/extlst" xmlns:r="http://schemas.openxmlformats.org/officeDocument/2006/relationships" xmlns:m="http://schemas.openxmlformats.org/officeDocument/2006/math" xmlns:v="urn:schemas-microsoft-com:vml" xmlns:wp14="http://schemas.microsoft.com/office/word/2010/wordprocessingDrawing" xmlns:wp="http://schemas.openxmlformats.org/drawingml/2006/wordprocessingDrawing" xmlns:w10="urn:schemas-microsoft-com:office:word" xmlns:w="http://schemas.openxmlformats.org/wordprocessingml/2006/main" xmlns:w14="http://schemas.microsoft.com/office/word/2010/wordml" xmlns:w15="http://schemas.microsoft.com/office/word/2012/wordml" xmlns:w16cex="http://schemas.microsoft.com/office/word/2018/wordml/cex" xmlns:w16cid="http://schemas.microsoft.com/office/word/2016/wordml/cid" xmlns:w16="http://schemas.microsoft.com/office/word/2018/wordml" xmlns:w16du="http://schemas.microsoft.com/office/word/2023/wordml/word16du" xmlns:w16sdtdh="http://schemas.microsoft.com/office/word/2020/wordml/sdtdatahash" xmlns:w16sdtfl="http://schemas.microsoft.com/office/word/2024/wordml/sdtformatlock" xmlns:w16se="http://schemas.microsoft.com/office/word/2015/wordml/symex" xmlns:wpg="http://schemas.microsoft.com/office/word/2010/wordprocessingGroup" xmlns:wpi="http://schemas.microsoft.com/office/word/2010/wordprocessingInk" xmlns:wne="http://schemas.microsoft.com/office/word/2006/wordml" xmlns:wps="http://schemas.microsoft.com/office/word/2010/wordprocessingShape" mc:Ignorable="w14 w15 w16se w16cid w16 w16cex w16sdtdh w16sdtfl w16du wp14">
+  <w:abstractNum w:abstractNumId="0" w15:restartNumberingAfterBreak="0">
+    <w:nsid w:val="296373B1"/>
+    <w:multiLevelType w:val="multilevel"/>
+    <w:tmpl w:val="2E5C01D2"/>
+    <w:lvl w:ilvl="0">
+      <w:start w:val="1"/>
+      <w:numFmt w:val="bullet"/>
+      <w:lvlText w:val=""/>
+      <w:lvlJc w:val="left"/>
+      <w:pPr>
+        <w:tabs>
+          <w:tab w:val="num" w:pos="720"/>
+        </w:tabs>
+        <w:ind w:left="720" w:hanging="360"/>
+      </w:pPr>
+      <w:rPr>
+        <w:rFonts w:ascii="Symbol" w:hAnsi="Symbol" w:hint="default"/>
+        <w:sz w:val="20"/>
+      </w:rPr>
+    </w:lvl>
+    <w:lvl w:ilvl="1" w:tentative="1">
+      <w:start w:val="1"/>
+      <w:numFmt w:val="bullet"/>
+      <w:lvlText w:val="o"/>
+      <w:lvlJc w:val="left"/>
+      <w:pPr>
+        <w:tabs>
+          <w:tab w:val="num" w:pos="1440"/>
+        </w:tabs>
+        <w:ind w:left="1440" w:hanging="360"/>
+      </w:pPr>
+      <w:rPr>
+        <w:rFonts w:ascii="Courier New" w:hAnsi="Courier New" w:hint="default"/>
+        <w:sz w:val="20"/>
+      </w:rPr>
+    </w:lvl>
+    <w:lvl w:ilvl="2" w:tentative="1">
+      <w:start w:val="1"/>
+      <w:numFmt w:val="bullet"/>
+      <w:lvlText w:val=""/>
+      <w:lvlJc w:val="left"/>
+      <w:pPr>
+        <w:tabs>
+          <w:tab w:val="num" w:pos="2160"/>
+        </w:tabs>
+        <w:ind w:left="2160" w:hanging="360"/>
+      </w:pPr>
+      <w:rPr>
+        <w:rFonts w:ascii="Wingdings" w:hAnsi="Wingdings" w:hint="default"/>
+        <w:sz w:val="20"/>
+      </w:rPr>
+    </w:lvl>
+    <w:lvl w:ilvl="3" w:tentative="1">
+      <w:start w:val="1"/>
+      <w:numFmt w:val="bullet"/>
+      <w:lvlText w:val=""/>
+      <w:lvlJc w:val="left"/>
+      <w:pPr>
+        <w:tabs>
+          <w:tab w:val="num" w:pos="2880"/>
+        </w:tabs>
+        <w:ind w:left="2880" w:hanging="360"/>
+      </w:pPr>
+      <w:rPr>
+        <w:rFonts w:ascii="Wingdings" w:hAnsi="Wingdings" w:hint="default"/>
+        <w:sz w:val="20"/>
+      </w:rPr>
+    </w:lvl>
+    <w:lvl w:ilvl="4" w:tentative="1">
+      <w:start w:val="1"/>
+      <w:numFmt w:val="bullet"/>
+      <w:lvlText w:val=""/>
+      <w:lvlJc w:val="left"/>
+      <w:pPr>
+        <w:tabs>
+          <w:tab w:val="num" w:pos="3600"/>
+        </w:tabs>
+        <w:ind w:left="3600" w:hanging="360"/>
+      </w:pPr>
+      <w:rPr>
+        <w:rFonts w:ascii="Wingdings" w:hAnsi="Wingdings" w:hint="default"/>
+        <w:sz w:val="20"/>
+      </w:rPr>
+    </w:lvl>
+    <w:lvl w:ilvl="5" w:tentative="1">
+      <w:start w:val="1"/>
+      <w:numFmt w:val="bullet"/>
+      <w:lvlText w:val=""/>
+      <w:lvlJc w:val="left"/>
+      <w:pPr>
+        <w:tabs>
+          <w:tab w:val="num" w:pos="4320"/>
+        </w:tabs>
+        <w:ind w:left="4320" w:hanging="360"/>
+      </w:pPr>
+      <w:rPr>
+        <w:rFonts w:ascii="Wingdings" w:hAnsi="Wingdings" w:hint="default"/>
+        <w:sz w:val="20"/>
+      </w:rPr>
+    </w:lvl>
+    <w:lvl w:ilvl="6" w:tentative="1">
+      <w:start w:val="1"/>
+      <w:numFmt w:val="bullet"/>
+      <w:lvlText w:val=""/>
+      <w:lvlJc w:val="left"/>
+      <w:pPr>
+        <w:tabs>
+          <w:tab w:val="num" w:pos="5040"/>
+        </w:tabs>
+        <w:ind w:left="5040" w:hanging="360"/>
+      </w:pPr>
+      <w:rPr>
+        <w:rFonts w:ascii="Wingdings" w:hAnsi="Wingdings" w:hint="default"/>
+        <w:sz w:val="20"/>
+      </w:rPr>
+    </w:lvl>
+    <w:lvl w:ilvl="7" w:tentative="1">
+      <w:start w:val="1"/>
+      <w:numFmt w:val="bullet"/>
+      <w:lvlText w:val=""/>
+      <w:lvlJc w:val="left"/>
+      <w:pPr>
+        <w:tabs>
+          <w:tab w:val="num" w:pos="5760"/>
+        </w:tabs>
+        <w:ind w:left="5760" w:hanging="360"/>
+      </w:pPr>
+      <w:rPr>
+        <w:rFonts w:ascii="Wingdings" w:hAnsi="Wingdings" w:hint="default"/>
+        <w:sz w:val="20"/>
+      </w:rPr>
+    </w:lvl>
+    <w:lvl w:ilvl="8" w:tentative="1">
+      <w:start w:val="1"/>
+      <w:numFmt w:val="bullet"/>
+      <w:lvlText w:val=""/>
+      <w:lvlJc w:val="left"/>
+      <w:pPr>
+        <w:tabs>
+          <w:tab w:val="num" w:pos="6480"/>
+        </w:tabs>
+        <w:ind w:left="6480" w:hanging="360"/>
+      </w:pPr>
+      <w:rPr>
+        <w:rFonts w:ascii="Wingdings" w:hAnsi="Wingdings" w:hint="default"/>
+        <w:sz w:val="20"/>
+      </w:rPr>
+    </w:lvl>
+  </w:abstractNum>
+  <w:abstractNum w:abstractNumId="1" w15:restartNumberingAfterBreak="0">
+    <w:nsid w:val="41E479F2"/>
+    <w:multiLevelType w:val="multilevel"/>
+    <w:tmpl w:val="11264DF2"/>
+    <w:lvl w:ilvl="0">
+      <w:start w:val="1"/>
+      <w:numFmt w:val="bullet"/>
+      <w:lvlText w:val=""/>
+      <w:lvlJc w:val="left"/>
+      <w:pPr>
+        <w:tabs>
+          <w:tab w:val="num" w:pos="720"/>
+        </w:tabs>
+        <w:ind w:left="720" w:hanging="360"/>
+      </w:pPr>
+      <w:rPr>
+        <w:rFonts w:ascii="Symbol" w:hAnsi="Symbol" w:hint="default"/>
+        <w:sz w:val="20"/>
+      </w:rPr>
+    </w:lvl>
+    <w:lvl w:ilvl="1" w:tentative="1">
+      <w:start w:val="1"/>
+      <w:numFmt w:val="bullet"/>
+      <w:lvlText w:val="o"/>
+      <w:lvlJc w:val="left"/>
+      <w:pPr>
+        <w:tabs>
+          <w:tab w:val="num" w:pos="1440"/>
+        </w:tabs>
+        <w:ind w:left="1440" w:hanging="360"/>
+      </w:pPr>
+      <w:rPr>
+        <w:rFonts w:ascii="Courier New" w:hAnsi="Courier New" w:hint="default"/>
+        <w:sz w:val="20"/>
+      </w:rPr>
+    </w:lvl>
+    <w:lvl w:ilvl="2" w:tentative="1">
+      <w:start w:val="1"/>
+      <w:numFmt w:val="bullet"/>
+      <w:lvlText w:val=""/>
+      <w:lvlJc w:val="left"/>
+      <w:pPr>
+        <w:tabs>
+          <w:tab w:val="num" w:pos="2160"/>
+        </w:tabs>
+        <w:ind w:left="2160" w:hanging="360"/>
+      </w:pPr>
+      <w:rPr>
+        <w:rFonts w:ascii="Wingdings" w:hAnsi="Wingdings" w:hint="default"/>
+        <w:sz w:val="20"/>
+      </w:rPr>
+    </w:lvl>
+    <w:lvl w:ilvl="3" w:tentative="1">
+      <w:start w:val="1"/>
+      <w:numFmt w:val="bullet"/>
+      <w:lvlText w:val=""/>
+      <w:lvlJc w:val="left"/>
+      <w:pPr>
+        <w:tabs>
+          <w:tab w:val="num" w:pos="2880"/>
+        </w:tabs>
+        <w:ind w:left="2880" w:hanging="360"/>
+      </w:pPr>
+      <w:rPr>
+        <w:rFonts w:ascii="Wingdings" w:hAnsi="Wingdings" w:hint="default"/>
+        <w:sz w:val="20"/>
+      </w:rPr>
+    </w:lvl>
+    <w:lvl w:ilvl="4" w:tentative="1">
+      <w:start w:val="1"/>
+      <w:numFmt w:val="bullet"/>
+      <w:lvlText w:val=""/>
+      <w:lvlJc w:val="left"/>
+      <w:pPr>
+        <w:tabs>
+          <w:tab w:val="num" w:pos="3600"/>
+        </w:tabs>
+        <w:ind w:left="3600" w:hanging="360"/>
+      </w:pPr>
+      <w:rPr>
+        <w:rFonts w:ascii="Wingdings" w:hAnsi="Wingdings" w:hint="default"/>
+        <w:sz w:val="20"/>
+      </w:rPr>
+    </w:lvl>
+    <w:lvl w:ilvl="5" w:tentative="1">
+      <w:start w:val="1"/>
+      <w:numFmt w:val="bullet"/>
+      <w:lvlText w:val=""/>
+      <w:lvlJc w:val="left"/>
+      <w:pPr>
+        <w:tabs>
+          <w:tab w:val="num" w:pos="4320"/>
+        </w:tabs>
+        <w:ind w:left="4320" w:hanging="360"/>
+      </w:pPr>
+      <w:rPr>
+        <w:rFonts w:ascii="Wingdings" w:hAnsi="Wingdings" w:hint="default"/>
+        <w:sz w:val="20"/>
+      </w:rPr>
+    </w:lvl>
+    <w:lvl w:ilvl="6" w:tentative="1">
+      <w:start w:val="1"/>
+      <w:numFmt w:val="bullet"/>
+      <w:lvlText w:val=""/>
+      <w:lvlJc w:val="left"/>
+      <w:pPr>
+        <w:tabs>
+          <w:tab w:val="num" w:pos="5040"/>
+        </w:tabs>
+        <w:ind w:left="5040" w:hanging="360"/>
+      </w:pPr>
+      <w:rPr>
+        <w:rFonts w:ascii="Wingdings" w:hAnsi="Wingdings" w:hint="default"/>
+        <w:sz w:val="20"/>
+      </w:rPr>
+    </w:lvl>
+    <w:lvl w:ilvl="7" w:tentative="1">
+      <w:start w:val="1"/>
+      <w:numFmt w:val="bullet"/>
+      <w:lvlText w:val=""/>
+      <w:lvlJc w:val="left"/>
+      <w:pPr>
+        <w:tabs>
+          <w:tab w:val="num" w:pos="5760"/>
+        </w:tabs>
+        <w:ind w:left="5760" w:hanging="360"/>
+      </w:pPr>
+      <w:rPr>
+        <w:rFonts w:ascii="Wingdings" w:hAnsi="Wingdings" w:hint="default"/>
+        <w:sz w:val="20"/>
+      </w:rPr>
+    </w:lvl>
+    <w:lvl w:ilvl="8" w:tentative="1">
+      <w:start w:val="1"/>
+      <w:numFmt w:val="bullet"/>
+      <w:lvlText w:val=""/>
+      <w:lvlJc w:val="left"/>
+      <w:pPr>
+        <w:tabs>
+          <w:tab w:val="num" w:pos="6480"/>
+        </w:tabs>
+        <w:ind w:left="6480" w:hanging="360"/>
+      </w:pPr>
+      <w:rPr>
+        <w:rFonts w:ascii="Wingdings" w:hAnsi="Wingdings" w:hint="default"/>
+        <w:sz w:val="20"/>
+      </w:rPr>
+    </w:lvl>
+  </w:abstractNum>
+  <w:abstractNum w:abstractNumId="2" w15:restartNumberingAfterBreak="0">
+    <w:nsid w:val="7BD74BB7"/>
+    <w:multiLevelType w:val="multilevel"/>
+    <w:tmpl w:val="F64686CA"/>
+    <w:lvl w:ilvl="0">
+      <w:start w:val="1"/>
+      <w:numFmt w:val="bullet"/>
+      <w:lvlText w:val=""/>
+      <w:lvlJc w:val="left"/>
+      <w:pPr>
+        <w:tabs>
+          <w:tab w:val="num" w:pos="720"/>
+        </w:tabs>
+        <w:ind w:left="720" w:hanging="360"/>
+      </w:pPr>
+      <w:rPr>
+        <w:rFonts w:ascii="Symbol" w:hAnsi="Symbol" w:hint="default"/>
+        <w:sz w:val="20"/>
+      </w:rPr>
+    </w:lvl>
+    <w:lvl w:ilvl="1" w:tentative="1">
+      <w:start w:val="1"/>
+      <w:numFmt w:val="bullet"/>
+      <w:lvlText w:val="o"/>
+      <w:lvlJc w:val="left"/>
+      <w:pPr>
+        <w:tabs>
+          <w:tab w:val="num" w:pos="1440"/>
+        </w:tabs>
+        <w:ind w:left="1440" w:hanging="360"/>
+      </w:pPr>
+      <w:rPr>
+        <w:rFonts w:ascii="Courier New" w:hAnsi="Courier New" w:hint="default"/>
+        <w:sz w:val="20"/>
+      </w:rPr>
+    </w:lvl>
+    <w:lvl w:ilvl="2" w:tentative="1">
+      <w:start w:val="1"/>
+      <w:numFmt w:val="bullet"/>
+      <w:lvlText w:val=""/>
+      <w:lvlJc w:val="left"/>
+      <w:pPr>
+        <w:tabs>
+          <w:tab w:val="num" w:pos="2160"/>
+        </w:tabs>
+        <w:ind w:left="2160" w:hanging="360"/>
+      </w:pPr>
+      <w:rPr>
+        <w:rFonts w:ascii="Wingdings" w:hAnsi="Wingdings" w:hint="default"/>
+        <w:sz w:val="20"/>
+      </w:rPr>
+    </w:lvl>
+    <w:lvl w:ilvl="3" w:tentative="1">
+      <w:start w:val="1"/>
+      <w:numFmt w:val="bullet"/>
+      <w:lvlText w:val=""/>
+      <w:lvlJc w:val="left"/>
+      <w:pPr>
+        <w:tabs>
+          <w:tab w:val="num" w:pos="2880"/>
+        </w:tabs>
+        <w:ind w:left="2880" w:hanging="360"/>
+      </w:pPr>
+      <w:rPr>
+        <w:rFonts w:ascii="Wingdings" w:hAnsi="Wingdings" w:hint="default"/>
+        <w:sz w:val="20"/>
+      </w:rPr>
+    </w:lvl>
+    <w:lvl w:ilvl="4" w:tentative="1">
+      <w:start w:val="1"/>
+      <w:numFmt w:val="bullet"/>
+      <w:lvlText w:val=""/>
+      <w:lvlJc w:val="left"/>
+      <w:pPr>
+        <w:tabs>
+          <w:tab w:val="num" w:pos="3600"/>
+        </w:tabs>
+        <w:ind w:left="3600" w:hanging="360"/>
+      </w:pPr>
+      <w:rPr>
+        <w:rFonts w:ascii="Wingdings" w:hAnsi="Wingdings" w:hint="default"/>
+        <w:sz w:val="20"/>
+      </w:rPr>
+    </w:lvl>
+    <w:lvl w:ilvl="5" w:tentative="1">
+      <w:start w:val="1"/>
+      <w:numFmt w:val="bullet"/>
+      <w:lvlText w:val=""/>
+      <w:lvlJc w:val="left"/>
+      <w:pPr>
+        <w:tabs>
+          <w:tab w:val="num" w:pos="4320"/>
+        </w:tabs>
+        <w:ind w:left="4320" w:hanging="360"/>
+      </w:pPr>
+      <w:rPr>
+        <w:rFonts w:ascii="Wingdings" w:hAnsi="Wingdings" w:hint="default"/>
+        <w:sz w:val="20"/>
+      </w:rPr>
+    </w:lvl>
+    <w:lvl w:ilvl="6" w:tentative="1">
+      <w:start w:val="1"/>
+      <w:numFmt w:val="bullet"/>
+      <w:lvlText w:val=""/>
+      <w:lvlJc w:val="left"/>
+      <w:pPr>
+        <w:tabs>
+          <w:tab w:val="num" w:pos="5040"/>
+        </w:tabs>
+        <w:ind w:left="5040" w:hanging="360"/>
+      </w:pPr>
+      <w:rPr>
+        <w:rFonts w:ascii="Wingdings" w:hAnsi="Wingdings" w:hint="default"/>
+        <w:sz w:val="20"/>
+      </w:rPr>
+    </w:lvl>
+    <w:lvl w:ilvl="7" w:tentative="1">
+      <w:start w:val="1"/>
+      <w:numFmt w:val="bullet"/>
+      <w:lvlText w:val=""/>
+      <w:lvlJc w:val="left"/>
+      <w:pPr>
+        <w:tabs>
+          <w:tab w:val="num" w:pos="5760"/>
+        </w:tabs>
+        <w:ind w:left="5760" w:hanging="360"/>
+      </w:pPr>
+      <w:rPr>
+        <w:rFonts w:ascii="Wingdings" w:hAnsi="Wingdings" w:hint="default"/>
+        <w:sz w:val="20"/>
+      </w:rPr>
+    </w:lvl>
+    <w:lvl w:ilvl="8" w:tentative="1">
+      <w:start w:val="1"/>
+      <w:numFmt w:val="bullet"/>
+      <w:lvlText w:val=""/>
+      <w:lvlJc w:val="left"/>
+      <w:pPr>
+        <w:tabs>
+          <w:tab w:val="num" w:pos="6480"/>
+        </w:tabs>
+        <w:ind w:left="6480" w:hanging="360"/>
+      </w:pPr>
+      <w:rPr>
+        <w:rFonts w:ascii="Wingdings" w:hAnsi="Wingdings" w:hint="default"/>
+        <w:sz w:val="20"/>
+      </w:rPr>
+    </w:lvl>
+  </w:abstractNum>
+  <w:num w:numId="1" w16cid:durableId="1447694239">
+    <w:abstractNumId w:val="1"/>
+  </w:num>
+  <w:num w:numId="2" w16cid:durableId="989020114">
+    <w:abstractNumId w:val="2"/>
+  </w:num>
+  <w:num w:numId="3" w16cid:durableId="523445481">
+    <w:abstractNumId w:val="0"/>
+  </w:num>
+</w:numbering>
 </file>
 
 <file path=word/styles.xml><?xml version="1.0" encoding="utf-8"?>

</xml_diff>

<commit_message>
actualizacion del documento word
</commit_message>
<xml_diff>
--- a/Relaciones.docx
+++ b/Relaciones.docx
@@ -7,16 +7,983 @@
         <w:rPr>
           <w:b/>
           <w:bCs/>
-          <w:lang w:val="en-US"/>
-        </w:rPr>
-      </w:pPr>
-      <w:r>
-        <w:rPr>
-          <w:b/>
-          <w:bCs/>
-          <w:lang w:val="en-US"/>
-        </w:rPr>
-        <w:t>USUARIO (auth + seguridad)</w:t>
+        </w:rPr>
+      </w:pPr>
+      <w:r>
+        <w:rPr>
+          <w:b/>
+          <w:bCs/>
+        </w:rPr>
+        <w:t>Sistema de Gestión Inteligente de Citas Médicas</w:t>
+      </w:r>
+    </w:p>
+    <w:p>
+      <w:r>
+        <w:t>No una agenda.</w:t>
+      </w:r>
+    </w:p>
+    <w:p>
+      <w:r>
+        <w:t>No un CRUD de pacientes.</w:t>
+      </w:r>
+    </w:p>
+    <w:p>
+      <w:r>
+        <w:t>Algo mucho más cercano a un producto real.</w:t>
+      </w:r>
+    </w:p>
+    <w:p>
+      <w:pPr>
+        <w:rPr>
+          <w:b/>
+          <w:bCs/>
+        </w:rPr>
+      </w:pPr>
+      <w:r>
+        <w:rPr>
+          <w:b/>
+          <w:bCs/>
+        </w:rPr>
+        <w:t>Problema real</w:t>
+      </w:r>
+    </w:p>
+    <w:p>
+      <w:r>
+        <w:t>Muchos centros sanitarios tienen:</w:t>
+      </w:r>
+    </w:p>
+    <w:p>
+      <w:pPr>
+        <w:numPr>
+          <w:ilvl w:val="0"/>
+          <w:numId w:val="4"/>
+        </w:numPr>
+      </w:pPr>
+      <w:r>
+        <w:t xml:space="preserve">cancelaciones de última hora, </w:t>
+      </w:r>
+    </w:p>
+    <w:p>
+      <w:pPr>
+        <w:numPr>
+          <w:ilvl w:val="0"/>
+          <w:numId w:val="4"/>
+        </w:numPr>
+      </w:pPr>
+      <w:r>
+        <w:t xml:space="preserve">huecos perdidos, </w:t>
+      </w:r>
+    </w:p>
+    <w:p>
+      <w:pPr>
+        <w:numPr>
+          <w:ilvl w:val="0"/>
+          <w:numId w:val="4"/>
+        </w:numPr>
+      </w:pPr>
+      <w:r>
+        <w:t xml:space="preserve">pacientes en lista de espera, </w:t>
+      </w:r>
+    </w:p>
+    <w:p>
+      <w:pPr>
+        <w:numPr>
+          <w:ilvl w:val="0"/>
+          <w:numId w:val="4"/>
+        </w:numPr>
+      </w:pPr>
+      <w:r>
+        <w:t xml:space="preserve">dificultad para reorganizar agendas. </w:t>
+      </w:r>
+    </w:p>
+    <w:p>
+      <w:r>
+        <w:t>Tu sistema optimiza automáticamente las citas.</w:t>
+      </w:r>
+    </w:p>
+    <w:p>
+      <w:r>
+        <w:pict w14:anchorId="4673816D">
+          <v:rect id="_x0000_i1125" style="width:0;height:1.5pt" o:hralign="center" o:hrstd="t" o:hr="t" fillcolor="#a0a0a0" stroked="f"/>
+        </w:pict>
+      </w:r>
+    </w:p>
+    <w:p>
+      <w:pPr>
+        <w:rPr>
+          <w:b/>
+          <w:bCs/>
+        </w:rPr>
+      </w:pPr>
+      <w:r>
+        <w:rPr>
+          <w:b/>
+          <w:bCs/>
+        </w:rPr>
+        <w:t>¿Qué hace?</w:t>
+      </w:r>
+    </w:p>
+    <w:p>
+      <w:pPr>
+        <w:rPr>
+          <w:b/>
+          <w:bCs/>
+        </w:rPr>
+      </w:pPr>
+      <w:r>
+        <w:rPr>
+          <w:b/>
+          <w:bCs/>
+        </w:rPr>
+        <w:t>Para el personal sanitario</w:t>
+      </w:r>
+    </w:p>
+    <w:p>
+      <w:pPr>
+        <w:numPr>
+          <w:ilvl w:val="0"/>
+          <w:numId w:val="5"/>
+        </w:numPr>
+      </w:pPr>
+      <w:r>
+        <w:t xml:space="preserve">Gestionar profesionales. </w:t>
+      </w:r>
+    </w:p>
+    <w:p>
+      <w:pPr>
+        <w:numPr>
+          <w:ilvl w:val="0"/>
+          <w:numId w:val="5"/>
+        </w:numPr>
+      </w:pPr>
+      <w:r>
+        <w:t xml:space="preserve">Gestionar agendas. </w:t>
+      </w:r>
+    </w:p>
+    <w:p>
+      <w:pPr>
+        <w:numPr>
+          <w:ilvl w:val="0"/>
+          <w:numId w:val="5"/>
+        </w:numPr>
+      </w:pPr>
+      <w:r>
+        <w:t xml:space="preserve">Gestionar especialidades. </w:t>
+      </w:r>
+    </w:p>
+    <w:p>
+      <w:pPr>
+        <w:numPr>
+          <w:ilvl w:val="0"/>
+          <w:numId w:val="5"/>
+        </w:numPr>
+      </w:pPr>
+      <w:r>
+        <w:t xml:space="preserve">Ver disponibilidad. </w:t>
+      </w:r>
+    </w:p>
+    <w:p>
+      <w:pPr>
+        <w:rPr>
+          <w:b/>
+          <w:bCs/>
+        </w:rPr>
+      </w:pPr>
+      <w:r>
+        <w:rPr>
+          <w:b/>
+          <w:bCs/>
+        </w:rPr>
+        <w:t>Para pacientes</w:t>
+      </w:r>
+    </w:p>
+    <w:p>
+      <w:pPr>
+        <w:numPr>
+          <w:ilvl w:val="0"/>
+          <w:numId w:val="6"/>
+        </w:numPr>
+      </w:pPr>
+      <w:r>
+        <w:t xml:space="preserve">Solicitar cita. </w:t>
+      </w:r>
+    </w:p>
+    <w:p>
+      <w:pPr>
+        <w:numPr>
+          <w:ilvl w:val="0"/>
+          <w:numId w:val="6"/>
+        </w:numPr>
+      </w:pPr>
+      <w:r>
+        <w:t xml:space="preserve">Entrar en lista de espera. </w:t>
+      </w:r>
+    </w:p>
+    <w:p>
+      <w:pPr>
+        <w:numPr>
+          <w:ilvl w:val="0"/>
+          <w:numId w:val="6"/>
+        </w:numPr>
+      </w:pPr>
+      <w:r>
+        <w:t xml:space="preserve">Cancelar citas. </w:t>
+      </w:r>
+    </w:p>
+    <w:p>
+      <w:pPr>
+        <w:rPr>
+          <w:b/>
+          <w:bCs/>
+        </w:rPr>
+      </w:pPr>
+      <w:r>
+        <w:rPr>
+          <w:b/>
+          <w:bCs/>
+        </w:rPr>
+        <w:t>Motor inteligente</w:t>
+      </w:r>
+    </w:p>
+    <w:p>
+      <w:r>
+        <w:t>Cuando alguien cancela:</w:t>
+      </w:r>
+    </w:p>
+    <w:p>
+      <w:r>
+        <w:t>el sistema busca automáticamente el mejor candidato para ocupar ese hueco.</w:t>
+      </w:r>
+    </w:p>
+    <w:p>
+      <w:r>
+        <w:t>Por ejemplo:</w:t>
+      </w:r>
+    </w:p>
+    <w:p>
+      <w:pPr>
+        <w:numPr>
+          <w:ilvl w:val="0"/>
+          <w:numId w:val="7"/>
+        </w:numPr>
+      </w:pPr>
+      <w:r>
+        <w:t xml:space="preserve">misma especialidad, </w:t>
+      </w:r>
+    </w:p>
+    <w:p>
+      <w:pPr>
+        <w:numPr>
+          <w:ilvl w:val="0"/>
+          <w:numId w:val="7"/>
+        </w:numPr>
+      </w:pPr>
+      <w:r>
+        <w:t xml:space="preserve">mayor antigüedad esperando, </w:t>
+      </w:r>
+    </w:p>
+    <w:p>
+      <w:pPr>
+        <w:numPr>
+          <w:ilvl w:val="0"/>
+          <w:numId w:val="7"/>
+        </w:numPr>
+      </w:pPr>
+      <w:r>
+        <w:lastRenderedPageBreak/>
+        <w:t xml:space="preserve">cercanía de fecha preferida, </w:t>
+      </w:r>
+    </w:p>
+    <w:p>
+      <w:pPr>
+        <w:numPr>
+          <w:ilvl w:val="0"/>
+          <w:numId w:val="7"/>
+        </w:numPr>
+      </w:pPr>
+      <w:r>
+        <w:t xml:space="preserve">prioridad médica. </w:t>
+      </w:r>
+    </w:p>
+    <w:p>
+      <w:r>
+        <w:pict w14:anchorId="58390E15">
+          <v:rect id="_x0000_i1126" style="width:0;height:1.5pt" o:hralign="center" o:hrstd="t" o:hr="t" fillcolor="#a0a0a0" stroked="f"/>
+        </w:pict>
+      </w:r>
+    </w:p>
+    <w:p>
+      <w:pPr>
+        <w:rPr>
+          <w:b/>
+          <w:bCs/>
+        </w:rPr>
+      </w:pPr>
+      <w:r>
+        <w:rPr>
+          <w:b/>
+          <w:bCs/>
+        </w:rPr>
+        <w:t>Donde entra Python</w:t>
+      </w:r>
+    </w:p>
+    <w:p>
+      <w:r>
+        <w:t>Microservicio de optimización.</w:t>
+      </w:r>
+    </w:p>
+    <w:p>
+      <w:r>
+        <w:t>Puede encargarse de:</w:t>
+      </w:r>
+    </w:p>
+    <w:p>
+      <w:pPr>
+        <w:numPr>
+          <w:ilvl w:val="0"/>
+          <w:numId w:val="8"/>
+        </w:numPr>
+      </w:pPr>
+      <w:r>
+        <w:t xml:space="preserve">calcular prioridades, </w:t>
+      </w:r>
+    </w:p>
+    <w:p>
+      <w:pPr>
+        <w:numPr>
+          <w:ilvl w:val="0"/>
+          <w:numId w:val="8"/>
+        </w:numPr>
+      </w:pPr>
+      <w:r>
+        <w:t xml:space="preserve">recomendar reorganizaciones, </w:t>
+      </w:r>
+    </w:p>
+    <w:p>
+      <w:pPr>
+        <w:numPr>
+          <w:ilvl w:val="0"/>
+          <w:numId w:val="8"/>
+        </w:numPr>
+      </w:pPr>
+      <w:r>
+        <w:t xml:space="preserve">predecir huecos desperdiciados, </w:t>
+      </w:r>
+    </w:p>
+    <w:p>
+      <w:pPr>
+        <w:numPr>
+          <w:ilvl w:val="0"/>
+          <w:numId w:val="8"/>
+        </w:numPr>
+      </w:pPr>
+      <w:r>
+        <w:t xml:space="preserve">generar estadísticas. </w:t>
+      </w:r>
+    </w:p>
+    <w:p>
+      <w:r>
+        <w:t>No necesitas IA generativa.</w:t>
+      </w:r>
+    </w:p>
+    <w:p>
+      <w:r>
+        <w:t xml:space="preserve">Simplemente un servicio </w:t>
+      </w:r>
+      <w:proofErr w:type="spellStart"/>
+      <w:r>
+        <w:t>FastAPI</w:t>
+      </w:r>
+      <w:proofErr w:type="spellEnd"/>
+      <w:r>
+        <w:t>.</w:t>
+      </w:r>
+    </w:p>
+    <w:p>
+      <w:r>
+        <w:t>En una entrevista podrás decir:</w:t>
+      </w:r>
+    </w:p>
+    <w:p>
+      <w:r>
+        <w:t>"Separé la lógica de optimización en Python para aislar algoritmos complejos."</w:t>
+      </w:r>
+    </w:p>
+    <w:p>
+      <w:r>
+        <w:t>Eso suena muy profesional.</w:t>
+      </w:r>
+    </w:p>
+    <w:p>
+      <w:r>
+        <w:pict w14:anchorId="1FDE3384">
+          <v:rect id="_x0000_i1127" style="width:0;height:1.5pt" o:hralign="center" o:hrstd="t" o:hr="t" fillcolor="#a0a0a0" stroked="f"/>
+        </w:pict>
+      </w:r>
+    </w:p>
+    <w:p>
+      <w:pPr>
+        <w:rPr>
+          <w:b/>
+          <w:bCs/>
+        </w:rPr>
+      </w:pPr>
+      <w:r>
+        <w:rPr>
+          <w:b/>
+          <w:bCs/>
+        </w:rPr>
+        <w:t>Arquitectura</w:t>
+      </w:r>
+    </w:p>
+    <w:p>
+      <w:r>
+        <w:t>Angular</w:t>
+      </w:r>
+      <w:r>
+        <w:br/>
+        <w:t xml:space="preserve">   ↓</w:t>
+      </w:r>
+      <w:r>
+        <w:br/>
+        <w:t>Spring Boot API</w:t>
+      </w:r>
+      <w:r>
+        <w:br/>
+        <w:t xml:space="preserve">   ↓</w:t>
+      </w:r>
+      <w:r>
+        <w:br/>
+        <w:t>PostgreSQL</w:t>
+      </w:r>
+      <w:r>
+        <w:br/>
+      </w:r>
+      <w:r>
+        <w:br/>
+        <w:t>Spring Boot</w:t>
+      </w:r>
+      <w:r>
+        <w:br/>
+        <w:t xml:space="preserve">   ↓ REST</w:t>
+      </w:r>
+      <w:r>
+        <w:br/>
+      </w:r>
+      <w:proofErr w:type="spellStart"/>
+      <w:r>
+        <w:t>FastAPI</w:t>
+      </w:r>
+      <w:proofErr w:type="spellEnd"/>
+      <w:r>
+        <w:t xml:space="preserve"> (Python)</w:t>
+      </w:r>
+      <w:r>
+        <w:br/>
+        <w:t xml:space="preserve">   ↓</w:t>
+      </w:r>
+      <w:r>
+        <w:br/>
+        <w:t>Algoritmos de optimización</w:t>
+      </w:r>
+      <w:r>
+        <w:br/>
+      </w:r>
+      <w:r>
+        <w:br/>
+        <w:t xml:space="preserve">Docker </w:t>
+      </w:r>
+      <w:proofErr w:type="spellStart"/>
+      <w:r>
+        <w:t>Compose</w:t>
+      </w:r>
+      <w:proofErr w:type="spellEnd"/>
+    </w:p>
+    <w:p>
+      <w:r>
+        <w:pict w14:anchorId="2A6B1A68">
+          <v:rect id="_x0000_i1128" style="width:0;height:1.5pt" o:hralign="center" o:hrstd="t" o:hr="t" fillcolor="#a0a0a0" stroked="f"/>
+        </w:pict>
+      </w:r>
+    </w:p>
+    <w:p>
+      <w:pPr>
+        <w:rPr>
+          <w:b/>
+          <w:bCs/>
+        </w:rPr>
+      </w:pPr>
+      <w:r>
+        <w:rPr>
+          <w:b/>
+          <w:bCs/>
+        </w:rPr>
+        <w:t>Tecnologías</w:t>
+      </w:r>
+    </w:p>
+    <w:p>
+      <w:proofErr w:type="spellStart"/>
+      <w:r>
+        <w:lastRenderedPageBreak/>
+        <w:t>Frontend</w:t>
+      </w:r>
+      <w:proofErr w:type="spellEnd"/>
+      <w:r>
+        <w:t>:</w:t>
+      </w:r>
+    </w:p>
+    <w:p>
+      <w:pPr>
+        <w:numPr>
+          <w:ilvl w:val="0"/>
+          <w:numId w:val="9"/>
+        </w:numPr>
+      </w:pPr>
+      <w:r>
+        <w:t xml:space="preserve">Angular </w:t>
+      </w:r>
+    </w:p>
+    <w:p>
+      <w:pPr>
+        <w:numPr>
+          <w:ilvl w:val="0"/>
+          <w:numId w:val="9"/>
+        </w:numPr>
+      </w:pPr>
+      <w:r>
+        <w:t xml:space="preserve">Angular Material </w:t>
+      </w:r>
+    </w:p>
+    <w:p>
+      <w:pPr>
+        <w:numPr>
+          <w:ilvl w:val="0"/>
+          <w:numId w:val="9"/>
+        </w:numPr>
+      </w:pPr>
+      <w:proofErr w:type="spellStart"/>
+      <w:r>
+        <w:t>RxJS</w:t>
+      </w:r>
+      <w:proofErr w:type="spellEnd"/>
+      <w:r>
+        <w:t xml:space="preserve"> </w:t>
+      </w:r>
+    </w:p>
+    <w:p>
+      <w:proofErr w:type="spellStart"/>
+      <w:r>
+        <w:t>Backend</w:t>
+      </w:r>
+      <w:proofErr w:type="spellEnd"/>
+      <w:r>
+        <w:t>:</w:t>
+      </w:r>
+    </w:p>
+    <w:p>
+      <w:pPr>
+        <w:numPr>
+          <w:ilvl w:val="0"/>
+          <w:numId w:val="10"/>
+        </w:numPr>
+      </w:pPr>
+      <w:r>
+        <w:t xml:space="preserve">Spring Boot </w:t>
+      </w:r>
+    </w:p>
+    <w:p>
+      <w:pPr>
+        <w:numPr>
+          <w:ilvl w:val="0"/>
+          <w:numId w:val="10"/>
+        </w:numPr>
+      </w:pPr>
+      <w:r>
+        <w:t xml:space="preserve">Spring Security </w:t>
+      </w:r>
+    </w:p>
+    <w:p>
+      <w:pPr>
+        <w:numPr>
+          <w:ilvl w:val="0"/>
+          <w:numId w:val="10"/>
+        </w:numPr>
+      </w:pPr>
+      <w:r>
+        <w:t xml:space="preserve">JWT </w:t>
+      </w:r>
+    </w:p>
+    <w:p>
+      <w:pPr>
+        <w:numPr>
+          <w:ilvl w:val="0"/>
+          <w:numId w:val="10"/>
+        </w:numPr>
+      </w:pPr>
+      <w:r>
+        <w:t>JPA/</w:t>
+      </w:r>
+      <w:proofErr w:type="spellStart"/>
+      <w:r>
+        <w:t>Hibernate</w:t>
+      </w:r>
+      <w:proofErr w:type="spellEnd"/>
+      <w:r>
+        <w:t xml:space="preserve"> </w:t>
+      </w:r>
+    </w:p>
+    <w:p>
+      <w:pPr>
+        <w:numPr>
+          <w:ilvl w:val="0"/>
+          <w:numId w:val="10"/>
+        </w:numPr>
+      </w:pPr>
+      <w:proofErr w:type="spellStart"/>
+      <w:r>
+        <w:t>MapStruct</w:t>
+      </w:r>
+      <w:proofErr w:type="spellEnd"/>
+      <w:r>
+        <w:t xml:space="preserve"> </w:t>
+      </w:r>
+    </w:p>
+    <w:p>
+      <w:pPr>
+        <w:numPr>
+          <w:ilvl w:val="0"/>
+          <w:numId w:val="10"/>
+        </w:numPr>
+      </w:pPr>
+      <w:proofErr w:type="spellStart"/>
+      <w:r>
+        <w:t>Flyway</w:t>
+      </w:r>
+      <w:proofErr w:type="spellEnd"/>
+      <w:r>
+        <w:t xml:space="preserve"> </w:t>
+      </w:r>
+    </w:p>
+    <w:p>
+      <w:r>
+        <w:t>Base de datos:</w:t>
+      </w:r>
+    </w:p>
+    <w:p>
+      <w:pPr>
+        <w:numPr>
+          <w:ilvl w:val="0"/>
+          <w:numId w:val="11"/>
+        </w:numPr>
+      </w:pPr>
+      <w:r>
+        <w:t xml:space="preserve">PostgreSQL </w:t>
+      </w:r>
+    </w:p>
+    <w:p>
+      <w:r>
+        <w:t>Python:</w:t>
+      </w:r>
+    </w:p>
+    <w:p>
+      <w:pPr>
+        <w:numPr>
+          <w:ilvl w:val="0"/>
+          <w:numId w:val="12"/>
+        </w:numPr>
+      </w:pPr>
+      <w:proofErr w:type="spellStart"/>
+      <w:r>
+        <w:t>FastAPI</w:t>
+      </w:r>
+      <w:proofErr w:type="spellEnd"/>
+      <w:r>
+        <w:t xml:space="preserve"> </w:t>
+      </w:r>
+    </w:p>
+    <w:p>
+      <w:pPr>
+        <w:numPr>
+          <w:ilvl w:val="0"/>
+          <w:numId w:val="12"/>
+        </w:numPr>
+      </w:pPr>
+      <w:r>
+        <w:t xml:space="preserve">Pandas </w:t>
+      </w:r>
+    </w:p>
+    <w:p>
+      <w:r>
+        <w:t>Infraestructura:</w:t>
+      </w:r>
+    </w:p>
+    <w:p>
+      <w:pPr>
+        <w:numPr>
+          <w:ilvl w:val="0"/>
+          <w:numId w:val="13"/>
+        </w:numPr>
+      </w:pPr>
+      <w:r>
+        <w:t xml:space="preserve">Docker </w:t>
+      </w:r>
+    </w:p>
+    <w:p>
+      <w:pPr>
+        <w:numPr>
+          <w:ilvl w:val="0"/>
+          <w:numId w:val="13"/>
+        </w:numPr>
+      </w:pPr>
+      <w:r>
+        <w:t xml:space="preserve">Docker </w:t>
+      </w:r>
+      <w:proofErr w:type="spellStart"/>
+      <w:r>
+        <w:t>Compose</w:t>
+      </w:r>
+      <w:proofErr w:type="spellEnd"/>
+      <w:r>
+        <w:t xml:space="preserve"> </w:t>
+      </w:r>
+    </w:p>
+    <w:p>
+      <w:pPr>
+        <w:numPr>
+          <w:ilvl w:val="0"/>
+          <w:numId w:val="13"/>
+        </w:numPr>
+      </w:pPr>
+      <w:r>
+        <w:t xml:space="preserve">GitHub </w:t>
+      </w:r>
+      <w:proofErr w:type="spellStart"/>
+      <w:r>
+        <w:t>Actions</w:t>
+      </w:r>
+      <w:proofErr w:type="spellEnd"/>
+      <w:r>
+        <w:t xml:space="preserve"> </w:t>
+      </w:r>
+    </w:p>
+    <w:p>
+      <w:proofErr w:type="spellStart"/>
+      <w:r>
+        <w:t>Testing</w:t>
+      </w:r>
+      <w:proofErr w:type="spellEnd"/>
+      <w:r>
+        <w:t>:</w:t>
+      </w:r>
+    </w:p>
+    <w:p>
+      <w:pPr>
+        <w:numPr>
+          <w:ilvl w:val="0"/>
+          <w:numId w:val="14"/>
+        </w:numPr>
+      </w:pPr>
+      <w:proofErr w:type="spellStart"/>
+      <w:r>
+        <w:t>JUnit</w:t>
+      </w:r>
+      <w:proofErr w:type="spellEnd"/>
+      <w:r>
+        <w:t xml:space="preserve"> </w:t>
+      </w:r>
+    </w:p>
+    <w:p>
+      <w:pPr>
+        <w:numPr>
+          <w:ilvl w:val="0"/>
+          <w:numId w:val="14"/>
+        </w:numPr>
+      </w:pPr>
+      <w:proofErr w:type="spellStart"/>
+      <w:r>
+        <w:t>Mockito</w:t>
+      </w:r>
+      <w:proofErr w:type="spellEnd"/>
+      <w:r>
+        <w:t xml:space="preserve"> </w:t>
+      </w:r>
+    </w:p>
+    <w:p>
+      <w:pPr>
+        <w:numPr>
+          <w:ilvl w:val="0"/>
+          <w:numId w:val="14"/>
+        </w:numPr>
+      </w:pPr>
+      <w:proofErr w:type="spellStart"/>
+      <w:r>
+        <w:t>Pytest</w:t>
+      </w:r>
+      <w:proofErr w:type="spellEnd"/>
+      <w:r>
+        <w:t xml:space="preserve"> </w:t>
+      </w:r>
+    </w:p>
+    <w:p>
+      <w:r>
+        <w:pict w14:anchorId="69E0DE3F">
+          <v:rect id="_x0000_i1129" style="width:0;height:1.5pt" o:hralign="center" o:hrstd="t" o:hr="t" fillcolor="#a0a0a0" stroked="f"/>
+        </w:pict>
+      </w:r>
+    </w:p>
+    <w:p>
+      <w:pPr>
+        <w:rPr>
+          <w:b/>
+          <w:bCs/>
+        </w:rPr>
+      </w:pPr>
+      <w:r>
+        <w:rPr>
+          <w:b/>
+          <w:bCs/>
+        </w:rPr>
+        <w:t>Qué impresiona aquí</w:t>
+      </w:r>
+    </w:p>
+    <w:p>
+      <w:r>
+        <w:t>No las funcionalidades.</w:t>
+      </w:r>
+    </w:p>
+    <w:p>
+      <w:r>
+        <w:t>Sino que demuestras:</w:t>
+      </w:r>
+    </w:p>
+    <w:p>
+      <w:r>
+        <w:lastRenderedPageBreak/>
+        <w:t>✓ Arquitectura multicapa.</w:t>
+      </w:r>
+    </w:p>
+    <w:p>
+      <w:r>
+        <w:t>✓ Microservicios.</w:t>
+      </w:r>
+    </w:p>
+    <w:p>
+      <w:r>
+        <w:t>✓ Integración entre tecnologías.</w:t>
+      </w:r>
+    </w:p>
+    <w:p>
+      <w:r>
+        <w:t>✓ Seguridad.</w:t>
+      </w:r>
+    </w:p>
+    <w:p>
+      <w:r>
+        <w:t xml:space="preserve">✓ </w:t>
+      </w:r>
+      <w:proofErr w:type="spellStart"/>
+      <w:r>
+        <w:t>Testing</w:t>
+      </w:r>
+      <w:proofErr w:type="spellEnd"/>
+      <w:r>
+        <w:t>.</w:t>
+      </w:r>
+    </w:p>
+    <w:p>
+      <w:r>
+        <w:t>✓ Migraciones.</w:t>
+      </w:r>
+    </w:p>
+    <w:p>
+      <w:r>
+        <w:t>✓ Contenedores.</w:t>
+      </w:r>
+    </w:p>
+    <w:p>
+      <w:r>
+        <w:t>✓ CI/CD.</w:t>
+      </w:r>
+    </w:p>
+    <w:p>
+      <w:r>
+        <w:t xml:space="preserve">Eso es prácticamente el </w:t>
+      </w:r>
+      <w:proofErr w:type="spellStart"/>
+      <w:r>
+        <w:t>stack</w:t>
+      </w:r>
+      <w:proofErr w:type="spellEnd"/>
+      <w:r>
+        <w:t xml:space="preserve"> de muchas consultoras y startups.</w:t>
+      </w:r>
+    </w:p>
+    <w:p/>
+    <w:p>
+      <w:pPr>
+        <w:rPr>
+          <w:b/>
+          <w:bCs/>
+        </w:rPr>
+      </w:pPr>
+    </w:p>
+    <w:p>
+      <w:pPr>
+        <w:rPr>
+          <w:b/>
+          <w:bCs/>
+        </w:rPr>
+      </w:pPr>
+    </w:p>
+    <w:p>
+      <w:pPr>
+        <w:rPr>
+          <w:b/>
+          <w:bCs/>
+        </w:rPr>
+      </w:pPr>
+    </w:p>
+    <w:p>
+      <w:pPr>
+        <w:rPr>
+          <w:b/>
+          <w:bCs/>
+        </w:rPr>
+      </w:pPr>
+    </w:p>
+    <w:p>
+      <w:pPr>
+        <w:rPr>
+          <w:b/>
+          <w:bCs/>
+          <w:lang w:val="en-US"/>
+        </w:rPr>
+      </w:pPr>
+      <w:r>
+        <w:rPr>
+          <w:b/>
+          <w:bCs/>
+          <w:lang w:val="en-US"/>
+        </w:rPr>
+        <w:t xml:space="preserve">USUARIO (auth + </w:t>
+      </w:r>
+      <w:proofErr w:type="spellStart"/>
+      <w:r>
+        <w:rPr>
+          <w:b/>
+          <w:bCs/>
+          <w:lang w:val="en-US"/>
+        </w:rPr>
+        <w:t>seguridad</w:t>
+      </w:r>
+      <w:proofErr w:type="spellEnd"/>
+      <w:r>
+        <w:rPr>
+          <w:b/>
+          <w:bCs/>
+          <w:lang w:val="en-US"/>
+        </w:rPr>
+        <w:t>)</w:t>
       </w:r>
     </w:p>
     <w:p>
@@ -36,7 +1003,21 @@
           <w:lang w:val="en-US"/>
         </w:rPr>
         <w:br/>
-        <w:t>public class Usuario {</w:t>
+        <w:t xml:space="preserve">public class </w:t>
+      </w:r>
+      <w:proofErr w:type="spellStart"/>
+      <w:r>
+        <w:rPr>
+          <w:lang w:val="en-US"/>
+        </w:rPr>
+        <w:t>Usuario</w:t>
+      </w:r>
+      <w:proofErr w:type="spellEnd"/>
+      <w:r>
+        <w:rPr>
+          <w:lang w:val="en-US"/>
+        </w:rPr>
+        <w:t xml:space="preserve"> {</w:t>
       </w:r>
       <w:r>
         <w:rPr>
@@ -122,7 +1103,21 @@
           <w:lang w:val="en-US"/>
         </w:rPr>
         <w:br/>
-        <w:t xml:space="preserve">    @ElementCollection(fetch = FetchType.EAGER)</w:t>
+        <w:t xml:space="preserve">    @ElementCollection(fetch = </w:t>
+      </w:r>
+      <w:proofErr w:type="spellStart"/>
+      <w:r>
+        <w:rPr>
+          <w:lang w:val="en-US"/>
+        </w:rPr>
+        <w:t>FetchType.EAGER</w:t>
+      </w:r>
+      <w:proofErr w:type="spellEnd"/>
+      <w:r>
+        <w:rPr>
+          <w:lang w:val="en-US"/>
+        </w:rPr>
+        <w:t>)</w:t>
       </w:r>
       <w:r>
         <w:rPr>
@@ -149,7 +1144,27 @@
           <w:lang w:val="en-US"/>
         </w:rPr>
         <w:br/>
-        <w:t xml:space="preserve">    private boolean enabled;</w:t>
+      </w:r>
+      <w:r>
+        <w:rPr>
+          <w:lang w:val="en-US"/>
+        </w:rPr>
+        <w:lastRenderedPageBreak/>
+        <w:t xml:space="preserve">    private </w:t>
+      </w:r>
+      <w:proofErr w:type="spellStart"/>
+      <w:r>
+        <w:rPr>
+          <w:lang w:val="en-US"/>
+        </w:rPr>
+        <w:t>boolean</w:t>
+      </w:r>
+      <w:proofErr w:type="spellEnd"/>
+      <w:r>
+        <w:rPr>
+          <w:lang w:val="en-US"/>
+        </w:rPr>
+        <w:t xml:space="preserve"> enabled;</w:t>
       </w:r>
       <w:r>
         <w:rPr>
@@ -213,7 +1228,43 @@
           <w:bCs/>
           <w:lang w:val="en-US"/>
         </w:rPr>
-        <w:t xml:space="preserve"> DOCTOR (perfil profesional)</w:t>
+        <w:t xml:space="preserve"> DOCTOR (</w:t>
+      </w:r>
+      <w:proofErr w:type="spellStart"/>
+      <w:r>
+        <w:rPr>
+          <w:b/>
+          <w:bCs/>
+          <w:lang w:val="en-US"/>
+        </w:rPr>
+        <w:t>perfil</w:t>
+      </w:r>
+      <w:proofErr w:type="spellEnd"/>
+      <w:r>
+        <w:rPr>
+          <w:b/>
+          <w:bCs/>
+          <w:lang w:val="en-US"/>
+        </w:rPr>
+        <w:t xml:space="preserve"> </w:t>
+      </w:r>
+      <w:proofErr w:type="spellStart"/>
+      <w:r>
+        <w:rPr>
+          <w:b/>
+          <w:bCs/>
+          <w:lang w:val="en-US"/>
+        </w:rPr>
+        <w:t>profesional</w:t>
+      </w:r>
+      <w:proofErr w:type="spellEnd"/>
+      <w:r>
+        <w:rPr>
+          <w:b/>
+          <w:bCs/>
+          <w:lang w:val="en-US"/>
+        </w:rPr>
+        <w:t>)</w:t>
       </w:r>
     </w:p>
     <w:p>
@@ -273,20 +1324,48 @@
           <w:lang w:val="en-US"/>
         </w:rPr>
         <w:br/>
-        <w:t xml:space="preserve">    private String lastName;</w:t>
-      </w:r>
-      <w:r>
-        <w:rPr>
-          <w:lang w:val="en-US"/>
-        </w:rPr>
-        <w:br/>
-      </w:r>
-      <w:r>
-        <w:rPr>
-          <w:lang w:val="en-US"/>
-        </w:rPr>
-        <w:br/>
-        <w:t xml:space="preserve">    private String speciality;</w:t>
+        <w:t xml:space="preserve">    private String </w:t>
+      </w:r>
+      <w:proofErr w:type="spellStart"/>
+      <w:r>
+        <w:rPr>
+          <w:lang w:val="en-US"/>
+        </w:rPr>
+        <w:t>lastName</w:t>
+      </w:r>
+      <w:proofErr w:type="spellEnd"/>
+      <w:r>
+        <w:rPr>
+          <w:lang w:val="en-US"/>
+        </w:rPr>
+        <w:t>;</w:t>
+      </w:r>
+      <w:r>
+        <w:rPr>
+          <w:lang w:val="en-US"/>
+        </w:rPr>
+        <w:br/>
+      </w:r>
+      <w:r>
+        <w:rPr>
+          <w:lang w:val="en-US"/>
+        </w:rPr>
+        <w:br/>
+        <w:t xml:space="preserve">    private String </w:t>
+      </w:r>
+      <w:proofErr w:type="spellStart"/>
+      <w:r>
+        <w:rPr>
+          <w:lang w:val="en-US"/>
+        </w:rPr>
+        <w:t>speciality</w:t>
+      </w:r>
+      <w:proofErr w:type="spellEnd"/>
+      <w:r>
+        <w:rPr>
+          <w:lang w:val="en-US"/>
+        </w:rPr>
+        <w:t>;</w:t>
       </w:r>
       <w:r>
         <w:rPr>
@@ -320,7 +1399,35 @@
           <w:lang w:val="en-US"/>
         </w:rPr>
         <w:br/>
-        <w:t xml:space="preserve">    private Usuario usuario;</w:t>
+        <w:t xml:space="preserve">    private </w:t>
+      </w:r>
+      <w:proofErr w:type="spellStart"/>
+      <w:r>
+        <w:rPr>
+          <w:lang w:val="en-US"/>
+        </w:rPr>
+        <w:t>Usuario</w:t>
+      </w:r>
+      <w:proofErr w:type="spellEnd"/>
+      <w:r>
+        <w:rPr>
+          <w:lang w:val="en-US"/>
+        </w:rPr>
+        <w:t xml:space="preserve"> </w:t>
+      </w:r>
+      <w:proofErr w:type="spellStart"/>
+      <w:r>
+        <w:rPr>
+          <w:lang w:val="en-US"/>
+        </w:rPr>
+        <w:t>usuario</w:t>
+      </w:r>
+      <w:proofErr w:type="spellEnd"/>
+      <w:r>
+        <w:rPr>
+          <w:lang w:val="en-US"/>
+        </w:rPr>
+        <w:t>;</w:t>
       </w:r>
       <w:r>
         <w:rPr>
@@ -332,7 +1439,6 @@
     </w:p>
     <w:p>
       <w:r>
-        <w:lastRenderedPageBreak/>
         <w:pict w14:anchorId="1E8C1FCE">
           <v:rect id="_x0000_i1026" style="width:0;height:1.5pt" o:hralign="center" o:hrstd="t" o:hr="t" fillcolor="#a0a0a0" stroked="f"/>
         </w:pict>
@@ -367,7 +1473,22 @@
       </w:r>
       <w:r>
         <w:br/>
-        <w:t>public class Paciente {</w:t>
+      </w:r>
+      <w:proofErr w:type="spellStart"/>
+      <w:r>
+        <w:t>public</w:t>
+      </w:r>
+      <w:proofErr w:type="spellEnd"/>
+      <w:r>
+        <w:t xml:space="preserve"> </w:t>
+      </w:r>
+      <w:proofErr w:type="spellStart"/>
+      <w:r>
+        <w:t>class</w:t>
+      </w:r>
+      <w:proofErr w:type="spellEnd"/>
+      <w:r>
+        <w:t xml:space="preserve"> Paciente {</w:t>
       </w:r>
       <w:r>
         <w:br/>
@@ -378,29 +1499,101 @@
       </w:r>
       <w:r>
         <w:br/>
-        <w:t xml:space="preserve">    private UUID id;</w:t>
-      </w:r>
-      <w:r>
-        <w:br/>
-      </w:r>
-      <w:r>
-        <w:br/>
-        <w:t xml:space="preserve">    private String name;</w:t>
-      </w:r>
-      <w:r>
-        <w:br/>
-        <w:t xml:space="preserve">    private String lastName;</w:t>
-      </w:r>
-      <w:r>
-        <w:br/>
-      </w:r>
-      <w:r>
-        <w:br/>
-        <w:t xml:space="preserve">    private String phone;</w:t>
-      </w:r>
-      <w:r>
-        <w:br/>
-        <w:t xml:space="preserve">    private String dni;</w:t>
+        <w:t xml:space="preserve">    </w:t>
+      </w:r>
+      <w:proofErr w:type="spellStart"/>
+      <w:r>
+        <w:t>private</w:t>
+      </w:r>
+      <w:proofErr w:type="spellEnd"/>
+      <w:r>
+        <w:t xml:space="preserve"> UUID id;</w:t>
+      </w:r>
+      <w:r>
+        <w:br/>
+      </w:r>
+      <w:r>
+        <w:br/>
+        <w:t xml:space="preserve">    </w:t>
+      </w:r>
+      <w:proofErr w:type="spellStart"/>
+      <w:r>
+        <w:t>private</w:t>
+      </w:r>
+      <w:proofErr w:type="spellEnd"/>
+      <w:r>
+        <w:t xml:space="preserve"> String </w:t>
+      </w:r>
+      <w:proofErr w:type="spellStart"/>
+      <w:r>
+        <w:t>name</w:t>
+      </w:r>
+      <w:proofErr w:type="spellEnd"/>
+      <w:r>
+        <w:t>;</w:t>
+      </w:r>
+      <w:r>
+        <w:br/>
+        <w:t xml:space="preserve">    </w:t>
+      </w:r>
+      <w:proofErr w:type="spellStart"/>
+      <w:r>
+        <w:t>private</w:t>
+      </w:r>
+      <w:proofErr w:type="spellEnd"/>
+      <w:r>
+        <w:t xml:space="preserve"> String </w:t>
+      </w:r>
+      <w:proofErr w:type="spellStart"/>
+      <w:r>
+        <w:t>lastName</w:t>
+      </w:r>
+      <w:proofErr w:type="spellEnd"/>
+      <w:r>
+        <w:t>;</w:t>
+      </w:r>
+      <w:r>
+        <w:br/>
+      </w:r>
+      <w:r>
+        <w:br/>
+        <w:t xml:space="preserve">    </w:t>
+      </w:r>
+      <w:proofErr w:type="spellStart"/>
+      <w:r>
+        <w:t>private</w:t>
+      </w:r>
+      <w:proofErr w:type="spellEnd"/>
+      <w:r>
+        <w:t xml:space="preserve"> String </w:t>
+      </w:r>
+      <w:proofErr w:type="spellStart"/>
+      <w:r>
+        <w:t>phone</w:t>
+      </w:r>
+      <w:proofErr w:type="spellEnd"/>
+      <w:r>
+        <w:t>;</w:t>
+      </w:r>
+      <w:r>
+        <w:br/>
+        <w:t xml:space="preserve">    </w:t>
+      </w:r>
+      <w:proofErr w:type="spellStart"/>
+      <w:r>
+        <w:t>private</w:t>
+      </w:r>
+      <w:proofErr w:type="spellEnd"/>
+      <w:r>
+        <w:t xml:space="preserve"> String </w:t>
+      </w:r>
+      <w:proofErr w:type="spellStart"/>
+      <w:r>
+        <w:t>dni</w:t>
+      </w:r>
+      <w:proofErr w:type="spellEnd"/>
+      <w:r>
+        <w:t>;</w:t>
       </w:r>
       <w:r>
         <w:br/>
@@ -415,7 +1608,23 @@
       </w:r>
       <w:r>
         <w:br/>
-        <w:t xml:space="preserve">    private Usuario usuario;</w:t>
+        <w:t xml:space="preserve">    </w:t>
+      </w:r>
+      <w:proofErr w:type="spellStart"/>
+      <w:r>
+        <w:t>private</w:t>
+      </w:r>
+      <w:proofErr w:type="spellEnd"/>
+      <w:r>
+        <w:t xml:space="preserve"> Usuario </w:t>
+      </w:r>
+      <w:proofErr w:type="spellStart"/>
+      <w:r>
+        <w:t>usuario</w:t>
+      </w:r>
+      <w:proofErr w:type="spellEnd"/>
+      <w:r>
+        <w:t>;</w:t>
       </w:r>
       <w:r>
         <w:br/>
@@ -424,6 +1633,7 @@
     </w:p>
     <w:p>
       <w:r>
+        <w:lastRenderedPageBreak/>
         <w:pict w14:anchorId="00ACE44D">
           <v:rect id="_x0000_i1027" style="width:0;height:1.5pt" o:hralign="center" o:hrstd="t" o:hr="t" fillcolor="#a0a0a0" stroked="f"/>
         </w:pict>
@@ -458,7 +1668,22 @@
       </w:r>
       <w:r>
         <w:br/>
-        <w:t>public class Cita {</w:t>
+      </w:r>
+      <w:proofErr w:type="spellStart"/>
+      <w:r>
+        <w:t>public</w:t>
+      </w:r>
+      <w:proofErr w:type="spellEnd"/>
+      <w:r>
+        <w:t xml:space="preserve"> </w:t>
+      </w:r>
+      <w:proofErr w:type="spellStart"/>
+      <w:r>
+        <w:t>class</w:t>
+      </w:r>
+      <w:proofErr w:type="spellEnd"/>
+      <w:r>
+        <w:t xml:space="preserve"> Cita {</w:t>
       </w:r>
       <w:r>
         <w:br/>
@@ -469,7 +1694,15 @@
       </w:r>
       <w:r>
         <w:br/>
-        <w:t xml:space="preserve">    private UUID id;</w:t>
+        <w:t xml:space="preserve">    </w:t>
+      </w:r>
+      <w:proofErr w:type="spellStart"/>
+      <w:r>
+        <w:t>private</w:t>
+      </w:r>
+      <w:proofErr w:type="spellEnd"/>
+      <w:r>
+        <w:t xml:space="preserve"> UUID id;</w:t>
       </w:r>
       <w:r>
         <w:br/>
@@ -480,7 +1713,23 @@
       </w:r>
       <w:r>
         <w:br/>
-        <w:t xml:space="preserve">    private Doctor doctor;</w:t>
+        <w:t xml:space="preserve">    </w:t>
+      </w:r>
+      <w:proofErr w:type="spellStart"/>
+      <w:r>
+        <w:t>private</w:t>
+      </w:r>
+      <w:proofErr w:type="spellEnd"/>
+      <w:r>
+        <w:t xml:space="preserve"> Doctor </w:t>
+      </w:r>
+      <w:proofErr w:type="spellStart"/>
+      <w:r>
+        <w:t>doctor</w:t>
+      </w:r>
+      <w:proofErr w:type="spellEnd"/>
+      <w:r>
+        <w:t>;</w:t>
       </w:r>
       <w:r>
         <w:br/>
@@ -491,40 +1740,133 @@
       </w:r>
       <w:r>
         <w:br/>
-        <w:t xml:space="preserve">    private Paciente paciente;</w:t>
-      </w:r>
-      <w:r>
-        <w:br/>
-      </w:r>
-      <w:r>
-        <w:br/>
-        <w:t xml:space="preserve">    private LocalDateTime fechaInicio;</w:t>
-      </w:r>
-      <w:r>
-        <w:br/>
-        <w:t xml:space="preserve">    private LocalDateTime fechaFin;</w:t>
-      </w:r>
-      <w:r>
-        <w:br/>
-      </w:r>
-      <w:r>
-        <w:br/>
-        <w:t xml:space="preserve">    private String estado; // PENDIENTE, CONFIRMADA, CANCELADA</w:t>
-      </w:r>
-      <w:r>
-        <w:br/>
-        <w:t xml:space="preserve">    private String motivo;</w:t>
-      </w:r>
-      <w:r>
-        <w:br/>
-        <w:t xml:space="preserve">    private String notas;</w:t>
-      </w:r>
-      <w:r>
-        <w:br/>
-      </w:r>
-      <w:r>
-        <w:lastRenderedPageBreak/>
-        <w:t xml:space="preserve">    private String sala;</w:t>
+        <w:t xml:space="preserve">    </w:t>
+      </w:r>
+      <w:proofErr w:type="spellStart"/>
+      <w:r>
+        <w:t>private</w:t>
+      </w:r>
+      <w:proofErr w:type="spellEnd"/>
+      <w:r>
+        <w:t xml:space="preserve"> Paciente </w:t>
+      </w:r>
+      <w:proofErr w:type="spellStart"/>
+      <w:r>
+        <w:t>paciente</w:t>
+      </w:r>
+      <w:proofErr w:type="spellEnd"/>
+      <w:r>
+        <w:t>;</w:t>
+      </w:r>
+      <w:r>
+        <w:br/>
+      </w:r>
+      <w:r>
+        <w:br/>
+        <w:t xml:space="preserve">    </w:t>
+      </w:r>
+      <w:proofErr w:type="spellStart"/>
+      <w:r>
+        <w:t>private</w:t>
+      </w:r>
+      <w:proofErr w:type="spellEnd"/>
+      <w:r>
+        <w:t xml:space="preserve"> </w:t>
+      </w:r>
+      <w:proofErr w:type="spellStart"/>
+      <w:r>
+        <w:t>LocalDateTime</w:t>
+      </w:r>
+      <w:proofErr w:type="spellEnd"/>
+      <w:r>
+        <w:t xml:space="preserve"> </w:t>
+      </w:r>
+      <w:proofErr w:type="spellStart"/>
+      <w:r>
+        <w:t>fechaInicio</w:t>
+      </w:r>
+      <w:proofErr w:type="spellEnd"/>
+      <w:r>
+        <w:t>;</w:t>
+      </w:r>
+      <w:r>
+        <w:br/>
+        <w:t xml:space="preserve">    </w:t>
+      </w:r>
+      <w:proofErr w:type="spellStart"/>
+      <w:r>
+        <w:t>private</w:t>
+      </w:r>
+      <w:proofErr w:type="spellEnd"/>
+      <w:r>
+        <w:t xml:space="preserve"> </w:t>
+      </w:r>
+      <w:proofErr w:type="spellStart"/>
+      <w:r>
+        <w:t>LocalDateTime</w:t>
+      </w:r>
+      <w:proofErr w:type="spellEnd"/>
+      <w:r>
+        <w:t xml:space="preserve"> </w:t>
+      </w:r>
+      <w:proofErr w:type="spellStart"/>
+      <w:r>
+        <w:t>fechaFin</w:t>
+      </w:r>
+      <w:proofErr w:type="spellEnd"/>
+      <w:r>
+        <w:t>;</w:t>
+      </w:r>
+      <w:r>
+        <w:br/>
+      </w:r>
+      <w:r>
+        <w:br/>
+        <w:t xml:space="preserve">    </w:t>
+      </w:r>
+      <w:proofErr w:type="spellStart"/>
+      <w:r>
+        <w:t>private</w:t>
+      </w:r>
+      <w:proofErr w:type="spellEnd"/>
+      <w:r>
+        <w:t xml:space="preserve"> String estado; // PENDIENTE, CONFIRMADA, CANCELADA</w:t>
+      </w:r>
+      <w:r>
+        <w:br/>
+        <w:t xml:space="preserve">    </w:t>
+      </w:r>
+      <w:proofErr w:type="spellStart"/>
+      <w:r>
+        <w:t>private</w:t>
+      </w:r>
+      <w:proofErr w:type="spellEnd"/>
+      <w:r>
+        <w:t xml:space="preserve"> String motivo;</w:t>
+      </w:r>
+      <w:r>
+        <w:br/>
+        <w:t xml:space="preserve">    </w:t>
+      </w:r>
+      <w:proofErr w:type="spellStart"/>
+      <w:r>
+        <w:t>private</w:t>
+      </w:r>
+      <w:proofErr w:type="spellEnd"/>
+      <w:r>
+        <w:t xml:space="preserve"> String notas;</w:t>
+      </w:r>
+      <w:r>
+        <w:br/>
+        <w:t xml:space="preserve">    </w:t>
+      </w:r>
+      <w:proofErr w:type="spellStart"/>
+      <w:r>
+        <w:t>private</w:t>
+      </w:r>
+      <w:proofErr w:type="spellEnd"/>
+      <w:r>
+        <w:t xml:space="preserve"> String sala;</w:t>
       </w:r>
       <w:r>
         <w:br/>
@@ -567,7 +1909,30 @@
       </w:r>
       <w:r>
         <w:br/>
-        <w:t>public class ListaEspera {</w:t>
+      </w:r>
+      <w:proofErr w:type="spellStart"/>
+      <w:r>
+        <w:t>public</w:t>
+      </w:r>
+      <w:proofErr w:type="spellEnd"/>
+      <w:r>
+        <w:t xml:space="preserve"> </w:t>
+      </w:r>
+      <w:proofErr w:type="spellStart"/>
+      <w:r>
+        <w:t>class</w:t>
+      </w:r>
+      <w:proofErr w:type="spellEnd"/>
+      <w:r>
+        <w:t xml:space="preserve"> </w:t>
+      </w:r>
+      <w:proofErr w:type="spellStart"/>
+      <w:r>
+        <w:t>ListaEspera</w:t>
+      </w:r>
+      <w:proofErr w:type="spellEnd"/>
+      <w:r>
+        <w:t xml:space="preserve"> {</w:t>
       </w:r>
       <w:r>
         <w:br/>
@@ -578,7 +1943,15 @@
       </w:r>
       <w:r>
         <w:br/>
-        <w:t xml:space="preserve">    private UUID id;</w:t>
+        <w:t xml:space="preserve">    </w:t>
+      </w:r>
+      <w:proofErr w:type="spellStart"/>
+      <w:r>
+        <w:t>private</w:t>
+      </w:r>
+      <w:proofErr w:type="spellEnd"/>
+      <w:r>
+        <w:t xml:space="preserve"> UUID id;</w:t>
       </w:r>
       <w:r>
         <w:br/>
@@ -589,35 +1962,108 @@
       </w:r>
       <w:r>
         <w:br/>
-        <w:t xml:space="preserve">    private Paciente paciente;</w:t>
-      </w:r>
-      <w:r>
-        <w:br/>
-      </w:r>
-      <w:r>
-        <w:br/>
-        <w:t xml:space="preserve">    private String especialidad;</w:t>
-      </w:r>
-      <w:r>
-        <w:br/>
-      </w:r>
-      <w:r>
-        <w:br/>
-        <w:t xml:space="preserve">    private Integer prioridad;</w:t>
-      </w:r>
-      <w:r>
-        <w:br/>
-      </w:r>
-      <w:r>
-        <w:br/>
-        <w:t xml:space="preserve">    private LocalDateTime fechaRegistro;</w:t>
-      </w:r>
-      <w:r>
-        <w:br/>
-      </w:r>
-      <w:r>
-        <w:br/>
-        <w:t xml:space="preserve">    private String estado; // ACTIVA, ASIGNADA, CANCELADA</w:t>
+        <w:t xml:space="preserve">    </w:t>
+      </w:r>
+      <w:proofErr w:type="spellStart"/>
+      <w:r>
+        <w:t>private</w:t>
+      </w:r>
+      <w:proofErr w:type="spellEnd"/>
+      <w:r>
+        <w:t xml:space="preserve"> Paciente </w:t>
+      </w:r>
+      <w:proofErr w:type="spellStart"/>
+      <w:r>
+        <w:t>paciente</w:t>
+      </w:r>
+      <w:proofErr w:type="spellEnd"/>
+      <w:r>
+        <w:t>;</w:t>
+      </w:r>
+      <w:r>
+        <w:br/>
+      </w:r>
+      <w:r>
+        <w:br/>
+        <w:t xml:space="preserve">    </w:t>
+      </w:r>
+      <w:proofErr w:type="spellStart"/>
+      <w:r>
+        <w:t>private</w:t>
+      </w:r>
+      <w:proofErr w:type="spellEnd"/>
+      <w:r>
+        <w:t xml:space="preserve"> String especialidad;</w:t>
+      </w:r>
+      <w:r>
+        <w:br/>
+      </w:r>
+      <w:r>
+        <w:br/>
+        <w:t xml:space="preserve">    </w:t>
+      </w:r>
+      <w:proofErr w:type="spellStart"/>
+      <w:r>
+        <w:t>private</w:t>
+      </w:r>
+      <w:proofErr w:type="spellEnd"/>
+      <w:r>
+        <w:t xml:space="preserve"> </w:t>
+      </w:r>
+      <w:proofErr w:type="spellStart"/>
+      <w:r>
+        <w:t>Integer</w:t>
+      </w:r>
+      <w:proofErr w:type="spellEnd"/>
+      <w:r>
+        <w:t xml:space="preserve"> prioridad;</w:t>
+      </w:r>
+      <w:r>
+        <w:br/>
+      </w:r>
+      <w:r>
+        <w:br/>
+        <w:t xml:space="preserve">    </w:t>
+      </w:r>
+      <w:proofErr w:type="spellStart"/>
+      <w:r>
+        <w:t>private</w:t>
+      </w:r>
+      <w:proofErr w:type="spellEnd"/>
+      <w:r>
+        <w:t xml:space="preserve"> </w:t>
+      </w:r>
+      <w:proofErr w:type="spellStart"/>
+      <w:r>
+        <w:t>LocalDateTime</w:t>
+      </w:r>
+      <w:proofErr w:type="spellEnd"/>
+      <w:r>
+        <w:t xml:space="preserve"> </w:t>
+      </w:r>
+      <w:proofErr w:type="spellStart"/>
+      <w:r>
+        <w:t>fechaRegistro</w:t>
+      </w:r>
+      <w:proofErr w:type="spellEnd"/>
+      <w:r>
+        <w:t>;</w:t>
+      </w:r>
+      <w:r>
+        <w:br/>
+      </w:r>
+      <w:r>
+        <w:lastRenderedPageBreak/>
+        <w:br/>
+        <w:t xml:space="preserve">    </w:t>
+      </w:r>
+      <w:proofErr w:type="spellStart"/>
+      <w:r>
+        <w:t>private</w:t>
+      </w:r>
+      <w:proofErr w:type="spellEnd"/>
+      <w:r>
+        <w:t xml:space="preserve"> String estado; // ACTIVA, ASIGNADA, CANCELADA</w:t>
       </w:r>
       <w:r>
         <w:br/>
@@ -660,7 +2106,30 @@
       </w:r>
       <w:r>
         <w:br/>
-        <w:t>public class Notificacion {</w:t>
+      </w:r>
+      <w:proofErr w:type="spellStart"/>
+      <w:r>
+        <w:t>public</w:t>
+      </w:r>
+      <w:proofErr w:type="spellEnd"/>
+      <w:r>
+        <w:t xml:space="preserve"> </w:t>
+      </w:r>
+      <w:proofErr w:type="spellStart"/>
+      <w:r>
+        <w:t>class</w:t>
+      </w:r>
+      <w:proofErr w:type="spellEnd"/>
+      <w:r>
+        <w:t xml:space="preserve"> </w:t>
+      </w:r>
+      <w:proofErr w:type="spellStart"/>
+      <w:r>
+        <w:t>Notificacion</w:t>
+      </w:r>
+      <w:proofErr w:type="spellEnd"/>
+      <w:r>
+        <w:t xml:space="preserve"> {</w:t>
       </w:r>
       <w:r>
         <w:br/>
@@ -671,7 +2140,15 @@
       </w:r>
       <w:r>
         <w:br/>
-        <w:t xml:space="preserve">    private UUID id;</w:t>
+        <w:t xml:space="preserve">    </w:t>
+      </w:r>
+      <w:proofErr w:type="spellStart"/>
+      <w:r>
+        <w:t>private</w:t>
+      </w:r>
+      <w:proofErr w:type="spellEnd"/>
+      <w:r>
+        <w:t xml:space="preserve"> UUID id;</w:t>
       </w:r>
       <w:r>
         <w:br/>
@@ -682,38 +2159,115 @@
       </w:r>
       <w:r>
         <w:br/>
-        <w:t xml:space="preserve">    private Paciente paciente;</w:t>
-      </w:r>
-      <w:r>
-        <w:br/>
-      </w:r>
-      <w:r>
-        <w:br/>
-        <w:t xml:space="preserve">    private String tipo; // EMAIL, SISTEMA</w:t>
-      </w:r>
-      <w:r>
-        <w:br/>
-      </w:r>
-      <w:r>
-        <w:br/>
-        <w:t xml:space="preserve">    private String mensaje;</w:t>
-      </w:r>
-      <w:r>
-        <w:br/>
-      </w:r>
-      <w:r>
-        <w:br/>
-        <w:t xml:space="preserve">    private LocalDateTime fechaEnvio;</w:t>
-      </w:r>
-      <w:r>
-        <w:br/>
-      </w:r>
-      <w:r>
-        <w:br/>
-      </w:r>
-      <w:r>
-        <w:lastRenderedPageBreak/>
-        <w:t xml:space="preserve">    private boolean leida;</w:t>
+        <w:t xml:space="preserve">    </w:t>
+      </w:r>
+      <w:proofErr w:type="spellStart"/>
+      <w:r>
+        <w:t>private</w:t>
+      </w:r>
+      <w:proofErr w:type="spellEnd"/>
+      <w:r>
+        <w:t xml:space="preserve"> Paciente </w:t>
+      </w:r>
+      <w:proofErr w:type="spellStart"/>
+      <w:r>
+        <w:t>paciente</w:t>
+      </w:r>
+      <w:proofErr w:type="spellEnd"/>
+      <w:r>
+        <w:t>;</w:t>
+      </w:r>
+      <w:r>
+        <w:br/>
+      </w:r>
+      <w:r>
+        <w:br/>
+        <w:t xml:space="preserve">    </w:t>
+      </w:r>
+      <w:proofErr w:type="spellStart"/>
+      <w:r>
+        <w:t>private</w:t>
+      </w:r>
+      <w:proofErr w:type="spellEnd"/>
+      <w:r>
+        <w:t xml:space="preserve"> String tipo; // EMAIL, SISTEMA</w:t>
+      </w:r>
+      <w:r>
+        <w:br/>
+      </w:r>
+      <w:r>
+        <w:br/>
+        <w:t xml:space="preserve">    </w:t>
+      </w:r>
+      <w:proofErr w:type="spellStart"/>
+      <w:r>
+        <w:t>private</w:t>
+      </w:r>
+      <w:proofErr w:type="spellEnd"/>
+      <w:r>
+        <w:t xml:space="preserve"> String mensaje;</w:t>
+      </w:r>
+      <w:r>
+        <w:br/>
+      </w:r>
+      <w:r>
+        <w:br/>
+        <w:t xml:space="preserve">    </w:t>
+      </w:r>
+      <w:proofErr w:type="spellStart"/>
+      <w:r>
+        <w:t>private</w:t>
+      </w:r>
+      <w:proofErr w:type="spellEnd"/>
+      <w:r>
+        <w:t xml:space="preserve"> </w:t>
+      </w:r>
+      <w:proofErr w:type="spellStart"/>
+      <w:r>
+        <w:t>LocalDateTime</w:t>
+      </w:r>
+      <w:proofErr w:type="spellEnd"/>
+      <w:r>
+        <w:t xml:space="preserve"> </w:t>
+      </w:r>
+      <w:proofErr w:type="spellStart"/>
+      <w:r>
+        <w:t>fechaEnvio</w:t>
+      </w:r>
+      <w:proofErr w:type="spellEnd"/>
+      <w:r>
+        <w:t>;</w:t>
+      </w:r>
+      <w:r>
+        <w:br/>
+      </w:r>
+      <w:r>
+        <w:br/>
+        <w:t xml:space="preserve">    </w:t>
+      </w:r>
+      <w:proofErr w:type="spellStart"/>
+      <w:r>
+        <w:t>private</w:t>
+      </w:r>
+      <w:proofErr w:type="spellEnd"/>
+      <w:r>
+        <w:t xml:space="preserve"> </w:t>
+      </w:r>
+      <w:proofErr w:type="spellStart"/>
+      <w:r>
+        <w:t>boolean</w:t>
+      </w:r>
+      <w:proofErr w:type="spellEnd"/>
+      <w:r>
+        <w:t xml:space="preserve"> </w:t>
+      </w:r>
+      <w:proofErr w:type="spellStart"/>
+      <w:r>
+        <w:t>leida</w:t>
+      </w:r>
+      <w:proofErr w:type="spellEnd"/>
+      <w:r>
+        <w:t>;</w:t>
       </w:r>
       <w:r>
         <w:br/>
@@ -756,7 +2310,22 @@
       </w:r>
       <w:r>
         <w:br/>
-        <w:t>public class Auditoria {</w:t>
+      </w:r>
+      <w:proofErr w:type="spellStart"/>
+      <w:r>
+        <w:t>public</w:t>
+      </w:r>
+      <w:proofErr w:type="spellEnd"/>
+      <w:r>
+        <w:t xml:space="preserve"> </w:t>
+      </w:r>
+      <w:proofErr w:type="spellStart"/>
+      <w:r>
+        <w:t>class</w:t>
+      </w:r>
+      <w:proofErr w:type="spellEnd"/>
+      <w:r>
+        <w:t xml:space="preserve"> Auditoria {</w:t>
       </w:r>
       <w:r>
         <w:br/>
@@ -767,7 +2336,15 @@
       </w:r>
       <w:r>
         <w:br/>
-        <w:t xml:space="preserve">    private UUID id;</w:t>
+        <w:t xml:space="preserve">    </w:t>
+      </w:r>
+      <w:proofErr w:type="spellStart"/>
+      <w:r>
+        <w:t>private</w:t>
+      </w:r>
+      <w:proofErr w:type="spellEnd"/>
+      <w:r>
+        <w:t xml:space="preserve"> UUID id;</w:t>
       </w:r>
       <w:r>
         <w:br/>
@@ -778,36 +2355,125 @@
       </w:r>
       <w:r>
         <w:br/>
-        <w:t xml:space="preserve">    private Usuario usuario;</w:t>
-      </w:r>
-      <w:r>
-        <w:br/>
-      </w:r>
-      <w:r>
-        <w:br/>
-        <w:t xml:space="preserve">    private String accion;</w:t>
-      </w:r>
-      <w:r>
-        <w:br/>
-        <w:t xml:space="preserve">    private String entidad;</w:t>
-      </w:r>
-      <w:r>
-        <w:br/>
-        <w:t xml:space="preserve">    private UUID entidadId;</w:t>
-      </w:r>
-      <w:r>
-        <w:br/>
-      </w:r>
-      <w:r>
-        <w:br/>
-        <w:t xml:space="preserve">    private LocalDateTime fecha;</w:t>
-      </w:r>
-      <w:r>
-        <w:br/>
-      </w:r>
-      <w:r>
-        <w:br/>
-        <w:t xml:space="preserve">    private String ip;</w:t>
+        <w:t xml:space="preserve">    </w:t>
+      </w:r>
+      <w:proofErr w:type="spellStart"/>
+      <w:r>
+        <w:t>private</w:t>
+      </w:r>
+      <w:proofErr w:type="spellEnd"/>
+      <w:r>
+        <w:t xml:space="preserve"> Usuario </w:t>
+      </w:r>
+      <w:proofErr w:type="spellStart"/>
+      <w:r>
+        <w:t>usuario</w:t>
+      </w:r>
+      <w:proofErr w:type="spellEnd"/>
+      <w:r>
+        <w:t>;</w:t>
+      </w:r>
+      <w:r>
+        <w:br/>
+      </w:r>
+      <w:r>
+        <w:br/>
+        <w:t xml:space="preserve">    </w:t>
+      </w:r>
+      <w:proofErr w:type="spellStart"/>
+      <w:r>
+        <w:t>private</w:t>
+      </w:r>
+      <w:proofErr w:type="spellEnd"/>
+      <w:r>
+        <w:t xml:space="preserve"> String </w:t>
+      </w:r>
+      <w:proofErr w:type="spellStart"/>
+      <w:r>
+        <w:t>accion</w:t>
+      </w:r>
+      <w:proofErr w:type="spellEnd"/>
+      <w:r>
+        <w:t>;</w:t>
+      </w:r>
+      <w:r>
+        <w:br/>
+        <w:t xml:space="preserve">    </w:t>
+      </w:r>
+      <w:proofErr w:type="spellStart"/>
+      <w:r>
+        <w:t>private</w:t>
+      </w:r>
+      <w:proofErr w:type="spellEnd"/>
+      <w:r>
+        <w:t xml:space="preserve"> String entidad;</w:t>
+      </w:r>
+      <w:r>
+        <w:br/>
+        <w:t xml:space="preserve">    </w:t>
+      </w:r>
+      <w:proofErr w:type="spellStart"/>
+      <w:r>
+        <w:t>private</w:t>
+      </w:r>
+      <w:proofErr w:type="spellEnd"/>
+      <w:r>
+        <w:t xml:space="preserve"> UUID </w:t>
+      </w:r>
+      <w:proofErr w:type="spellStart"/>
+      <w:r>
+        <w:t>entidadId</w:t>
+      </w:r>
+      <w:proofErr w:type="spellEnd"/>
+      <w:r>
+        <w:t>;</w:t>
+      </w:r>
+      <w:r>
+        <w:br/>
+      </w:r>
+      <w:r>
+        <w:br/>
+        <w:t xml:space="preserve">    </w:t>
+      </w:r>
+      <w:proofErr w:type="spellStart"/>
+      <w:r>
+        <w:t>private</w:t>
+      </w:r>
+      <w:proofErr w:type="spellEnd"/>
+      <w:r>
+        <w:t xml:space="preserve"> </w:t>
+      </w:r>
+      <w:proofErr w:type="spellStart"/>
+      <w:r>
+        <w:t>LocalDateTime</w:t>
+      </w:r>
+      <w:proofErr w:type="spellEnd"/>
+      <w:r>
+        <w:t xml:space="preserve"> fecha;</w:t>
+      </w:r>
+      <w:r>
+        <w:br/>
+      </w:r>
+      <w:r>
+        <w:lastRenderedPageBreak/>
+        <w:br/>
+        <w:t xml:space="preserve">    </w:t>
+      </w:r>
+      <w:proofErr w:type="spellStart"/>
+      <w:r>
+        <w:t>private</w:t>
+      </w:r>
+      <w:proofErr w:type="spellEnd"/>
+      <w:r>
+        <w:t xml:space="preserve"> String </w:t>
+      </w:r>
+      <w:proofErr w:type="spellStart"/>
+      <w:r>
+        <w:t>ip</w:t>
+      </w:r>
+      <w:proofErr w:type="spellEnd"/>
+      <w:r>
+        <w:t>;</w:t>
       </w:r>
       <w:r>
         <w:br/>
@@ -845,8 +2511,21 @@
       </w:r>
     </w:p>
     <w:p>
-      <w:r>
-        <w:t>public enum Rol {</w:t>
+      <w:proofErr w:type="spellStart"/>
+      <w:r>
+        <w:t>public</w:t>
+      </w:r>
+      <w:proofErr w:type="spellEnd"/>
+      <w:r>
+        <w:t xml:space="preserve"> </w:t>
+      </w:r>
+      <w:proofErr w:type="spellStart"/>
+      <w:r>
+        <w:t>enum</w:t>
+      </w:r>
+      <w:proofErr w:type="spellEnd"/>
+      <w:r>
+        <w:t xml:space="preserve"> Rol {</w:t>
       </w:r>
       <w:r>
         <w:br/>
@@ -954,15 +2633,27 @@
         <w:t>──</w:t>
       </w:r>
       <w:r>
+        <w:t xml:space="preserve"> 1:N AUDITORIA</w:t>
+      </w:r>
+      <w:r>
+        <w:br/>
         <w:t xml:space="preserve"> </w:t>
       </w:r>
-      <w:proofErr w:type="gramStart"/>
-      <w:r>
-        <w:t>1:N</w:t>
-      </w:r>
-      <w:proofErr w:type="gramEnd"/>
-      <w:r>
-        <w:t xml:space="preserve"> AUDITORIA</w:t>
+      <w:r>
+        <w:rPr>
+          <w:rFonts w:ascii="Aptos" w:hAnsi="Aptos" w:cs="Aptos"/>
+        </w:rPr>
+        <w:t>└──</w:t>
+      </w:r>
+      <w:r>
+        <w:t xml:space="preserve"> roles (ENUM)</w:t>
+      </w:r>
+      <w:r>
+        <w:br/>
+      </w:r>
+      <w:r>
+        <w:br/>
+        <w:t>DOCTOR</w:t>
       </w:r>
       <w:r>
         <w:br/>
@@ -975,17 +2666,14 @@
         <w:t>└──</w:t>
       </w:r>
       <w:r>
-        <w:t xml:space="preserve"> roles (ENUM)</w:t>
-      </w:r>
-      <w:r>
-        <w:br/>
-      </w:r>
-      <w:r>
-        <w:br/>
-      </w:r>
-      <w:r>
-        <w:lastRenderedPageBreak/>
-        <w:t>DOCTOR</w:t>
+        <w:t xml:space="preserve"> 1:N CITA</w:t>
+      </w:r>
+      <w:r>
+        <w:br/>
+      </w:r>
+      <w:r>
+        <w:br/>
+        <w:t>PACIENTE</w:t>
       </w:r>
       <w:r>
         <w:br/>
@@ -993,102 +2681,50 @@
       </w:r>
       <w:r>
         <w:rPr>
+          <w:rFonts w:ascii="MS Gothic" w:eastAsia="MS Gothic" w:hAnsi="MS Gothic" w:cs="MS Gothic" w:hint="eastAsia"/>
+        </w:rPr>
+        <w:t>├</w:t>
+      </w:r>
+      <w:r>
+        <w:rPr>
           <w:rFonts w:ascii="Aptos" w:hAnsi="Aptos" w:cs="Aptos"/>
         </w:rPr>
+        <w:t>──</w:t>
+      </w:r>
+      <w:r>
+        <w:t xml:space="preserve"> 1:N CITA</w:t>
+      </w:r>
+      <w:r>
+        <w:br/>
+        <w:t xml:space="preserve"> </w:t>
+      </w:r>
+      <w:r>
+        <w:rPr>
+          <w:rFonts w:ascii="MS Gothic" w:eastAsia="MS Gothic" w:hAnsi="MS Gothic" w:cs="MS Gothic" w:hint="eastAsia"/>
+        </w:rPr>
+        <w:t>├</w:t>
+      </w:r>
+      <w:r>
+        <w:rPr>
+          <w:rFonts w:ascii="Aptos" w:hAnsi="Aptos" w:cs="Aptos"/>
+        </w:rPr>
+        <w:t>──</w:t>
+      </w:r>
+      <w:r>
+        <w:t xml:space="preserve"> 1:N LISTA_ESPERA</w:t>
+      </w:r>
+      <w:r>
+        <w:br/>
+        <w:t xml:space="preserve"> </w:t>
+      </w:r>
+      <w:r>
+        <w:rPr>
+          <w:rFonts w:ascii="Aptos" w:hAnsi="Aptos" w:cs="Aptos"/>
+        </w:rPr>
         <w:t>└──</w:t>
       </w:r>
       <w:r>
-        <w:t xml:space="preserve"> </w:t>
-      </w:r>
-      <w:proofErr w:type="gramStart"/>
-      <w:r>
-        <w:t>1:N</w:t>
-      </w:r>
-      <w:proofErr w:type="gramEnd"/>
-      <w:r>
-        <w:t xml:space="preserve"> CITA</w:t>
-      </w:r>
-      <w:r>
-        <w:br/>
-      </w:r>
-      <w:r>
-        <w:br/>
-        <w:t>PACIENTE</w:t>
-      </w:r>
-      <w:r>
-        <w:br/>
-        <w:t xml:space="preserve"> </w:t>
-      </w:r>
-      <w:r>
-        <w:rPr>
-          <w:rFonts w:ascii="MS Gothic" w:eastAsia="MS Gothic" w:hAnsi="MS Gothic" w:cs="MS Gothic" w:hint="eastAsia"/>
-        </w:rPr>
-        <w:t>├</w:t>
-      </w:r>
-      <w:r>
-        <w:rPr>
-          <w:rFonts w:ascii="Aptos" w:hAnsi="Aptos" w:cs="Aptos"/>
-        </w:rPr>
-        <w:t>──</w:t>
-      </w:r>
-      <w:r>
-        <w:t xml:space="preserve"> </w:t>
-      </w:r>
-      <w:proofErr w:type="gramStart"/>
-      <w:r>
-        <w:t>1:N</w:t>
-      </w:r>
-      <w:proofErr w:type="gramEnd"/>
-      <w:r>
-        <w:t xml:space="preserve"> CITA</w:t>
-      </w:r>
-      <w:r>
-        <w:br/>
-        <w:t xml:space="preserve"> </w:t>
-      </w:r>
-      <w:r>
-        <w:rPr>
-          <w:rFonts w:ascii="MS Gothic" w:eastAsia="MS Gothic" w:hAnsi="MS Gothic" w:cs="MS Gothic" w:hint="eastAsia"/>
-        </w:rPr>
-        <w:t>├</w:t>
-      </w:r>
-      <w:r>
-        <w:rPr>
-          <w:rFonts w:ascii="Aptos" w:hAnsi="Aptos" w:cs="Aptos"/>
-        </w:rPr>
-        <w:t>──</w:t>
-      </w:r>
-      <w:r>
-        <w:t xml:space="preserve"> </w:t>
-      </w:r>
-      <w:proofErr w:type="gramStart"/>
-      <w:r>
-        <w:t>1:N</w:t>
-      </w:r>
-      <w:proofErr w:type="gramEnd"/>
-      <w:r>
-        <w:t xml:space="preserve"> LISTA_ESPERA</w:t>
-      </w:r>
-      <w:r>
-        <w:br/>
-        <w:t xml:space="preserve"> </w:t>
-      </w:r>
-      <w:r>
-        <w:rPr>
-          <w:rFonts w:ascii="Aptos" w:hAnsi="Aptos" w:cs="Aptos"/>
-        </w:rPr>
-        <w:t>└──</w:t>
-      </w:r>
-      <w:r>
-        <w:t xml:space="preserve"> </w:t>
-      </w:r>
-      <w:proofErr w:type="gramStart"/>
-      <w:r>
-        <w:t>1:N</w:t>
-      </w:r>
-      <w:proofErr w:type="gramEnd"/>
-      <w:r>
-        <w:t xml:space="preserve"> NOTIFICACION</w:t>
+        <w:t xml:space="preserve"> 1:N NOTIFICACION</w:t>
       </w:r>
     </w:p>
     <w:p/>
@@ -1173,8 +2809,9 @@
     </w:p>
     <w:p>
       <w:r>
+        <w:lastRenderedPageBreak/>
         <w:pict w14:anchorId="45C6CBF4">
-          <v:rect id="_x0000_i1045" style="width:0;height:1.5pt" o:hralign="center" o:hrstd="t" o:hr="t" fillcolor="#a0a0a0" stroked="f"/>
+          <v:rect id="_x0000_i1033" style="width:0;height:1.5pt" o:hralign="center" o:hrstd="t" o:hr="t" fillcolor="#a0a0a0" stroked="f"/>
         </w:pict>
       </w:r>
     </w:p>
@@ -1245,7 +2882,7 @@
     <w:p>
       <w:r>
         <w:pict w14:anchorId="768B2F9F">
-          <v:rect id="_x0000_i1046" style="width:0;height:1.5pt" o:hralign="center" o:hrstd="t" o:hr="t" fillcolor="#a0a0a0" stroked="f"/>
+          <v:rect id="_x0000_i1034" style="width:0;height:1.5pt" o:hralign="center" o:hrstd="t" o:hr="t" fillcolor="#a0a0a0" stroked="f"/>
         </w:pict>
       </w:r>
     </w:p>
@@ -1332,7 +2969,6 @@
         </w:numPr>
       </w:pPr>
       <w:r>
-        <w:lastRenderedPageBreak/>
         <w:t>Entrar en lista de espera.</w:t>
       </w:r>
     </w:p>
@@ -1350,6 +2986,453 @@
 <file path=word/numbering.xml><?xml version="1.0" encoding="utf-8"?>
 <w:numbering xmlns:wpc="http://schemas.microsoft.com/office/word/2010/wordprocessingCanvas" xmlns:cx="http://schemas.microsoft.com/office/drawing/2014/chartex" xmlns:cx1="http://schemas.microsoft.com/office/drawing/2015/9/8/chartex" xmlns:cx2="http://schemas.microsoft.com/office/drawing/2015/10/21/chartex" xmlns:cx3="http://schemas.microsoft.com/office/drawing/2016/5/9/chartex" xmlns:cx4="http://schemas.microsoft.com/office/drawing/2016/5/10/chartex" xmlns:cx5="http://schemas.microsoft.com/office/drawing/2016/5/11/chartex" xmlns:cx6="http://schemas.microsoft.com/office/drawing/2016/5/12/chartex" xmlns:cx7="http://schemas.microsoft.com/office/drawing/2016/5/13/chartex" xmlns:cx8="http://schemas.microsoft.com/office/drawing/2016/5/14/chartex" xmlns:mc="http://schemas.openxmlformats.org/markup-compatibility/2006" xmlns:aink="http://schemas.microsoft.com/office/drawing/2016/ink" xmlns:am3d="http://schemas.microsoft.com/office/drawing/2017/model3d" xmlns:o="urn:schemas-microsoft-com:office:office" xmlns:oel="http://schemas.microsoft.com/office/2019/extlst" xmlns:r="http://schemas.openxmlformats.org/officeDocument/2006/relationships" xmlns:m="http://schemas.openxmlformats.org/officeDocument/2006/math" xmlns:v="urn:schemas-microsoft-com:vml" xmlns:wp14="http://schemas.microsoft.com/office/word/2010/wordprocessingDrawing" xmlns:wp="http://schemas.openxmlformats.org/drawingml/2006/wordprocessingDrawing" xmlns:w10="urn:schemas-microsoft-com:office:word" xmlns:w="http://schemas.openxmlformats.org/wordprocessingml/2006/main" xmlns:w14="http://schemas.microsoft.com/office/word/2010/wordml" xmlns:w15="http://schemas.microsoft.com/office/word/2012/wordml" xmlns:w16cex="http://schemas.microsoft.com/office/word/2018/wordml/cex" xmlns:w16cid="http://schemas.microsoft.com/office/word/2016/wordml/cid" xmlns:w16="http://schemas.microsoft.com/office/word/2018/wordml" xmlns:w16du="http://schemas.microsoft.com/office/word/2023/wordml/word16du" xmlns:w16sdtdh="http://schemas.microsoft.com/office/word/2020/wordml/sdtdatahash" xmlns:w16sdtfl="http://schemas.microsoft.com/office/word/2024/wordml/sdtformatlock" xmlns:w16se="http://schemas.microsoft.com/office/word/2015/wordml/symex" xmlns:wpg="http://schemas.microsoft.com/office/word/2010/wordprocessingGroup" xmlns:wpi="http://schemas.microsoft.com/office/word/2010/wordprocessingInk" xmlns:wne="http://schemas.microsoft.com/office/word/2006/wordml" xmlns:wps="http://schemas.microsoft.com/office/word/2010/wordprocessingShape" mc:Ignorable="w14 w15 w16se w16cid w16 w16cex w16sdtdh w16sdtfl w16du wp14">
   <w:abstractNum w:abstractNumId="0" w15:restartNumberingAfterBreak="0">
+    <w:nsid w:val="02663231"/>
+    <w:multiLevelType w:val="multilevel"/>
+    <w:tmpl w:val="6E1A672C"/>
+    <w:lvl w:ilvl="0">
+      <w:start w:val="1"/>
+      <w:numFmt w:val="bullet"/>
+      <w:lvlText w:val=""/>
+      <w:lvlJc w:val="left"/>
+      <w:pPr>
+        <w:tabs>
+          <w:tab w:val="num" w:pos="720"/>
+        </w:tabs>
+        <w:ind w:left="720" w:hanging="360"/>
+      </w:pPr>
+      <w:rPr>
+        <w:rFonts w:ascii="Symbol" w:hAnsi="Symbol" w:hint="default"/>
+        <w:sz w:val="20"/>
+      </w:rPr>
+    </w:lvl>
+    <w:lvl w:ilvl="1" w:tentative="1">
+      <w:start w:val="1"/>
+      <w:numFmt w:val="bullet"/>
+      <w:lvlText w:val="o"/>
+      <w:lvlJc w:val="left"/>
+      <w:pPr>
+        <w:tabs>
+          <w:tab w:val="num" w:pos="1440"/>
+        </w:tabs>
+        <w:ind w:left="1440" w:hanging="360"/>
+      </w:pPr>
+      <w:rPr>
+        <w:rFonts w:ascii="Courier New" w:hAnsi="Courier New" w:hint="default"/>
+        <w:sz w:val="20"/>
+      </w:rPr>
+    </w:lvl>
+    <w:lvl w:ilvl="2" w:tentative="1">
+      <w:start w:val="1"/>
+      <w:numFmt w:val="bullet"/>
+      <w:lvlText w:val=""/>
+      <w:lvlJc w:val="left"/>
+      <w:pPr>
+        <w:tabs>
+          <w:tab w:val="num" w:pos="2160"/>
+        </w:tabs>
+        <w:ind w:left="2160" w:hanging="360"/>
+      </w:pPr>
+      <w:rPr>
+        <w:rFonts w:ascii="Wingdings" w:hAnsi="Wingdings" w:hint="default"/>
+        <w:sz w:val="20"/>
+      </w:rPr>
+    </w:lvl>
+    <w:lvl w:ilvl="3" w:tentative="1">
+      <w:start w:val="1"/>
+      <w:numFmt w:val="bullet"/>
+      <w:lvlText w:val=""/>
+      <w:lvlJc w:val="left"/>
+      <w:pPr>
+        <w:tabs>
+          <w:tab w:val="num" w:pos="2880"/>
+        </w:tabs>
+        <w:ind w:left="2880" w:hanging="360"/>
+      </w:pPr>
+      <w:rPr>
+        <w:rFonts w:ascii="Wingdings" w:hAnsi="Wingdings" w:hint="default"/>
+        <w:sz w:val="20"/>
+      </w:rPr>
+    </w:lvl>
+    <w:lvl w:ilvl="4" w:tentative="1">
+      <w:start w:val="1"/>
+      <w:numFmt w:val="bullet"/>
+      <w:lvlText w:val=""/>
+      <w:lvlJc w:val="left"/>
+      <w:pPr>
+        <w:tabs>
+          <w:tab w:val="num" w:pos="3600"/>
+        </w:tabs>
+        <w:ind w:left="3600" w:hanging="360"/>
+      </w:pPr>
+      <w:rPr>
+        <w:rFonts w:ascii="Wingdings" w:hAnsi="Wingdings" w:hint="default"/>
+        <w:sz w:val="20"/>
+      </w:rPr>
+    </w:lvl>
+    <w:lvl w:ilvl="5" w:tentative="1">
+      <w:start w:val="1"/>
+      <w:numFmt w:val="bullet"/>
+      <w:lvlText w:val=""/>
+      <w:lvlJc w:val="left"/>
+      <w:pPr>
+        <w:tabs>
+          <w:tab w:val="num" w:pos="4320"/>
+        </w:tabs>
+        <w:ind w:left="4320" w:hanging="360"/>
+      </w:pPr>
+      <w:rPr>
+        <w:rFonts w:ascii="Wingdings" w:hAnsi="Wingdings" w:hint="default"/>
+        <w:sz w:val="20"/>
+      </w:rPr>
+    </w:lvl>
+    <w:lvl w:ilvl="6" w:tentative="1">
+      <w:start w:val="1"/>
+      <w:numFmt w:val="bullet"/>
+      <w:lvlText w:val=""/>
+      <w:lvlJc w:val="left"/>
+      <w:pPr>
+        <w:tabs>
+          <w:tab w:val="num" w:pos="5040"/>
+        </w:tabs>
+        <w:ind w:left="5040" w:hanging="360"/>
+      </w:pPr>
+      <w:rPr>
+        <w:rFonts w:ascii="Wingdings" w:hAnsi="Wingdings" w:hint="default"/>
+        <w:sz w:val="20"/>
+      </w:rPr>
+    </w:lvl>
+    <w:lvl w:ilvl="7" w:tentative="1">
+      <w:start w:val="1"/>
+      <w:numFmt w:val="bullet"/>
+      <w:lvlText w:val=""/>
+      <w:lvlJc w:val="left"/>
+      <w:pPr>
+        <w:tabs>
+          <w:tab w:val="num" w:pos="5760"/>
+        </w:tabs>
+        <w:ind w:left="5760" w:hanging="360"/>
+      </w:pPr>
+      <w:rPr>
+        <w:rFonts w:ascii="Wingdings" w:hAnsi="Wingdings" w:hint="default"/>
+        <w:sz w:val="20"/>
+      </w:rPr>
+    </w:lvl>
+    <w:lvl w:ilvl="8" w:tentative="1">
+      <w:start w:val="1"/>
+      <w:numFmt w:val="bullet"/>
+      <w:lvlText w:val=""/>
+      <w:lvlJc w:val="left"/>
+      <w:pPr>
+        <w:tabs>
+          <w:tab w:val="num" w:pos="6480"/>
+        </w:tabs>
+        <w:ind w:left="6480" w:hanging="360"/>
+      </w:pPr>
+      <w:rPr>
+        <w:rFonts w:ascii="Wingdings" w:hAnsi="Wingdings" w:hint="default"/>
+        <w:sz w:val="20"/>
+      </w:rPr>
+    </w:lvl>
+  </w:abstractNum>
+  <w:abstractNum w:abstractNumId="1" w15:restartNumberingAfterBreak="0">
+    <w:nsid w:val="08D752C4"/>
+    <w:multiLevelType w:val="multilevel"/>
+    <w:tmpl w:val="E6EEF0D2"/>
+    <w:lvl w:ilvl="0">
+      <w:start w:val="1"/>
+      <w:numFmt w:val="bullet"/>
+      <w:lvlText w:val=""/>
+      <w:lvlJc w:val="left"/>
+      <w:pPr>
+        <w:tabs>
+          <w:tab w:val="num" w:pos="720"/>
+        </w:tabs>
+        <w:ind w:left="720" w:hanging="360"/>
+      </w:pPr>
+      <w:rPr>
+        <w:rFonts w:ascii="Symbol" w:hAnsi="Symbol" w:hint="default"/>
+        <w:sz w:val="20"/>
+      </w:rPr>
+    </w:lvl>
+    <w:lvl w:ilvl="1" w:tentative="1">
+      <w:start w:val="1"/>
+      <w:numFmt w:val="bullet"/>
+      <w:lvlText w:val="o"/>
+      <w:lvlJc w:val="left"/>
+      <w:pPr>
+        <w:tabs>
+          <w:tab w:val="num" w:pos="1440"/>
+        </w:tabs>
+        <w:ind w:left="1440" w:hanging="360"/>
+      </w:pPr>
+      <w:rPr>
+        <w:rFonts w:ascii="Courier New" w:hAnsi="Courier New" w:hint="default"/>
+        <w:sz w:val="20"/>
+      </w:rPr>
+    </w:lvl>
+    <w:lvl w:ilvl="2" w:tentative="1">
+      <w:start w:val="1"/>
+      <w:numFmt w:val="bullet"/>
+      <w:lvlText w:val=""/>
+      <w:lvlJc w:val="left"/>
+      <w:pPr>
+        <w:tabs>
+          <w:tab w:val="num" w:pos="2160"/>
+        </w:tabs>
+        <w:ind w:left="2160" w:hanging="360"/>
+      </w:pPr>
+      <w:rPr>
+        <w:rFonts w:ascii="Wingdings" w:hAnsi="Wingdings" w:hint="default"/>
+        <w:sz w:val="20"/>
+      </w:rPr>
+    </w:lvl>
+    <w:lvl w:ilvl="3" w:tentative="1">
+      <w:start w:val="1"/>
+      <w:numFmt w:val="bullet"/>
+      <w:lvlText w:val=""/>
+      <w:lvlJc w:val="left"/>
+      <w:pPr>
+        <w:tabs>
+          <w:tab w:val="num" w:pos="2880"/>
+        </w:tabs>
+        <w:ind w:left="2880" w:hanging="360"/>
+      </w:pPr>
+      <w:rPr>
+        <w:rFonts w:ascii="Wingdings" w:hAnsi="Wingdings" w:hint="default"/>
+        <w:sz w:val="20"/>
+      </w:rPr>
+    </w:lvl>
+    <w:lvl w:ilvl="4" w:tentative="1">
+      <w:start w:val="1"/>
+      <w:numFmt w:val="bullet"/>
+      <w:lvlText w:val=""/>
+      <w:lvlJc w:val="left"/>
+      <w:pPr>
+        <w:tabs>
+          <w:tab w:val="num" w:pos="3600"/>
+        </w:tabs>
+        <w:ind w:left="3600" w:hanging="360"/>
+      </w:pPr>
+      <w:rPr>
+        <w:rFonts w:ascii="Wingdings" w:hAnsi="Wingdings" w:hint="default"/>
+        <w:sz w:val="20"/>
+      </w:rPr>
+    </w:lvl>
+    <w:lvl w:ilvl="5" w:tentative="1">
+      <w:start w:val="1"/>
+      <w:numFmt w:val="bullet"/>
+      <w:lvlText w:val=""/>
+      <w:lvlJc w:val="left"/>
+      <w:pPr>
+        <w:tabs>
+          <w:tab w:val="num" w:pos="4320"/>
+        </w:tabs>
+        <w:ind w:left="4320" w:hanging="360"/>
+      </w:pPr>
+      <w:rPr>
+        <w:rFonts w:ascii="Wingdings" w:hAnsi="Wingdings" w:hint="default"/>
+        <w:sz w:val="20"/>
+      </w:rPr>
+    </w:lvl>
+    <w:lvl w:ilvl="6" w:tentative="1">
+      <w:start w:val="1"/>
+      <w:numFmt w:val="bullet"/>
+      <w:lvlText w:val=""/>
+      <w:lvlJc w:val="left"/>
+      <w:pPr>
+        <w:tabs>
+          <w:tab w:val="num" w:pos="5040"/>
+        </w:tabs>
+        <w:ind w:left="5040" w:hanging="360"/>
+      </w:pPr>
+      <w:rPr>
+        <w:rFonts w:ascii="Wingdings" w:hAnsi="Wingdings" w:hint="default"/>
+        <w:sz w:val="20"/>
+      </w:rPr>
+    </w:lvl>
+    <w:lvl w:ilvl="7" w:tentative="1">
+      <w:start w:val="1"/>
+      <w:numFmt w:val="bullet"/>
+      <w:lvlText w:val=""/>
+      <w:lvlJc w:val="left"/>
+      <w:pPr>
+        <w:tabs>
+          <w:tab w:val="num" w:pos="5760"/>
+        </w:tabs>
+        <w:ind w:left="5760" w:hanging="360"/>
+      </w:pPr>
+      <w:rPr>
+        <w:rFonts w:ascii="Wingdings" w:hAnsi="Wingdings" w:hint="default"/>
+        <w:sz w:val="20"/>
+      </w:rPr>
+    </w:lvl>
+    <w:lvl w:ilvl="8" w:tentative="1">
+      <w:start w:val="1"/>
+      <w:numFmt w:val="bullet"/>
+      <w:lvlText w:val=""/>
+      <w:lvlJc w:val="left"/>
+      <w:pPr>
+        <w:tabs>
+          <w:tab w:val="num" w:pos="6480"/>
+        </w:tabs>
+        <w:ind w:left="6480" w:hanging="360"/>
+      </w:pPr>
+      <w:rPr>
+        <w:rFonts w:ascii="Wingdings" w:hAnsi="Wingdings" w:hint="default"/>
+        <w:sz w:val="20"/>
+      </w:rPr>
+    </w:lvl>
+  </w:abstractNum>
+  <w:abstractNum w:abstractNumId="2" w15:restartNumberingAfterBreak="0">
+    <w:nsid w:val="27EE130B"/>
+    <w:multiLevelType w:val="multilevel"/>
+    <w:tmpl w:val="7F4293A0"/>
+    <w:lvl w:ilvl="0">
+      <w:start w:val="1"/>
+      <w:numFmt w:val="bullet"/>
+      <w:lvlText w:val=""/>
+      <w:lvlJc w:val="left"/>
+      <w:pPr>
+        <w:tabs>
+          <w:tab w:val="num" w:pos="720"/>
+        </w:tabs>
+        <w:ind w:left="720" w:hanging="360"/>
+      </w:pPr>
+      <w:rPr>
+        <w:rFonts w:ascii="Symbol" w:hAnsi="Symbol" w:hint="default"/>
+        <w:sz w:val="20"/>
+      </w:rPr>
+    </w:lvl>
+    <w:lvl w:ilvl="1" w:tentative="1">
+      <w:start w:val="1"/>
+      <w:numFmt w:val="bullet"/>
+      <w:lvlText w:val="o"/>
+      <w:lvlJc w:val="left"/>
+      <w:pPr>
+        <w:tabs>
+          <w:tab w:val="num" w:pos="1440"/>
+        </w:tabs>
+        <w:ind w:left="1440" w:hanging="360"/>
+      </w:pPr>
+      <w:rPr>
+        <w:rFonts w:ascii="Courier New" w:hAnsi="Courier New" w:hint="default"/>
+        <w:sz w:val="20"/>
+      </w:rPr>
+    </w:lvl>
+    <w:lvl w:ilvl="2" w:tentative="1">
+      <w:start w:val="1"/>
+      <w:numFmt w:val="bullet"/>
+      <w:lvlText w:val=""/>
+      <w:lvlJc w:val="left"/>
+      <w:pPr>
+        <w:tabs>
+          <w:tab w:val="num" w:pos="2160"/>
+        </w:tabs>
+        <w:ind w:left="2160" w:hanging="360"/>
+      </w:pPr>
+      <w:rPr>
+        <w:rFonts w:ascii="Wingdings" w:hAnsi="Wingdings" w:hint="default"/>
+        <w:sz w:val="20"/>
+      </w:rPr>
+    </w:lvl>
+    <w:lvl w:ilvl="3" w:tentative="1">
+      <w:start w:val="1"/>
+      <w:numFmt w:val="bullet"/>
+      <w:lvlText w:val=""/>
+      <w:lvlJc w:val="left"/>
+      <w:pPr>
+        <w:tabs>
+          <w:tab w:val="num" w:pos="2880"/>
+        </w:tabs>
+        <w:ind w:left="2880" w:hanging="360"/>
+      </w:pPr>
+      <w:rPr>
+        <w:rFonts w:ascii="Wingdings" w:hAnsi="Wingdings" w:hint="default"/>
+        <w:sz w:val="20"/>
+      </w:rPr>
+    </w:lvl>
+    <w:lvl w:ilvl="4" w:tentative="1">
+      <w:start w:val="1"/>
+      <w:numFmt w:val="bullet"/>
+      <w:lvlText w:val=""/>
+      <w:lvlJc w:val="left"/>
+      <w:pPr>
+        <w:tabs>
+          <w:tab w:val="num" w:pos="3600"/>
+        </w:tabs>
+        <w:ind w:left="3600" w:hanging="360"/>
+      </w:pPr>
+      <w:rPr>
+        <w:rFonts w:ascii="Wingdings" w:hAnsi="Wingdings" w:hint="default"/>
+        <w:sz w:val="20"/>
+      </w:rPr>
+    </w:lvl>
+    <w:lvl w:ilvl="5" w:tentative="1">
+      <w:start w:val="1"/>
+      <w:numFmt w:val="bullet"/>
+      <w:lvlText w:val=""/>
+      <w:lvlJc w:val="left"/>
+      <w:pPr>
+        <w:tabs>
+          <w:tab w:val="num" w:pos="4320"/>
+        </w:tabs>
+        <w:ind w:left="4320" w:hanging="360"/>
+      </w:pPr>
+      <w:rPr>
+        <w:rFonts w:ascii="Wingdings" w:hAnsi="Wingdings" w:hint="default"/>
+        <w:sz w:val="20"/>
+      </w:rPr>
+    </w:lvl>
+    <w:lvl w:ilvl="6" w:tentative="1">
+      <w:start w:val="1"/>
+      <w:numFmt w:val="bullet"/>
+      <w:lvlText w:val=""/>
+      <w:lvlJc w:val="left"/>
+      <w:pPr>
+        <w:tabs>
+          <w:tab w:val="num" w:pos="5040"/>
+        </w:tabs>
+        <w:ind w:left="5040" w:hanging="360"/>
+      </w:pPr>
+      <w:rPr>
+        <w:rFonts w:ascii="Wingdings" w:hAnsi="Wingdings" w:hint="default"/>
+        <w:sz w:val="20"/>
+      </w:rPr>
+    </w:lvl>
+    <w:lvl w:ilvl="7" w:tentative="1">
+      <w:start w:val="1"/>
+      <w:numFmt w:val="bullet"/>
+      <w:lvlText w:val=""/>
+      <w:lvlJc w:val="left"/>
+      <w:pPr>
+        <w:tabs>
+          <w:tab w:val="num" w:pos="5760"/>
+        </w:tabs>
+        <w:ind w:left="5760" w:hanging="360"/>
+      </w:pPr>
+      <w:rPr>
+        <w:rFonts w:ascii="Wingdings" w:hAnsi="Wingdings" w:hint="default"/>
+        <w:sz w:val="20"/>
+      </w:rPr>
+    </w:lvl>
+    <w:lvl w:ilvl="8" w:tentative="1">
+      <w:start w:val="1"/>
+      <w:numFmt w:val="bullet"/>
+      <w:lvlText w:val=""/>
+      <w:lvlJc w:val="left"/>
+      <w:pPr>
+        <w:tabs>
+          <w:tab w:val="num" w:pos="6480"/>
+        </w:tabs>
+        <w:ind w:left="6480" w:hanging="360"/>
+      </w:pPr>
+      <w:rPr>
+        <w:rFonts w:ascii="Wingdings" w:hAnsi="Wingdings" w:hint="default"/>
+        <w:sz w:val="20"/>
+      </w:rPr>
+    </w:lvl>
+  </w:abstractNum>
+  <w:abstractNum w:abstractNumId="3" w15:restartNumberingAfterBreak="0">
     <w:nsid w:val="296373B1"/>
     <w:multiLevelType w:val="multilevel"/>
     <w:tmpl w:val="2E5C01D2"/>
@@ -1498,7 +3581,7 @@
       </w:rPr>
     </w:lvl>
   </w:abstractNum>
-  <w:abstractNum w:abstractNumId="1" w15:restartNumberingAfterBreak="0">
+  <w:abstractNum w:abstractNumId="4" w15:restartNumberingAfterBreak="0">
     <w:nsid w:val="41E479F2"/>
     <w:multiLevelType w:val="multilevel"/>
     <w:tmpl w:val="11264DF2"/>
@@ -1647,7 +3730,1199 @@
       </w:rPr>
     </w:lvl>
   </w:abstractNum>
-  <w:abstractNum w:abstractNumId="2" w15:restartNumberingAfterBreak="0">
+  <w:abstractNum w:abstractNumId="5" w15:restartNumberingAfterBreak="0">
+    <w:nsid w:val="538D0F51"/>
+    <w:multiLevelType w:val="multilevel"/>
+    <w:tmpl w:val="9F145198"/>
+    <w:lvl w:ilvl="0">
+      <w:start w:val="1"/>
+      <w:numFmt w:val="bullet"/>
+      <w:lvlText w:val=""/>
+      <w:lvlJc w:val="left"/>
+      <w:pPr>
+        <w:tabs>
+          <w:tab w:val="num" w:pos="720"/>
+        </w:tabs>
+        <w:ind w:left="720" w:hanging="360"/>
+      </w:pPr>
+      <w:rPr>
+        <w:rFonts w:ascii="Symbol" w:hAnsi="Symbol" w:hint="default"/>
+        <w:sz w:val="20"/>
+      </w:rPr>
+    </w:lvl>
+    <w:lvl w:ilvl="1" w:tentative="1">
+      <w:start w:val="1"/>
+      <w:numFmt w:val="bullet"/>
+      <w:lvlText w:val="o"/>
+      <w:lvlJc w:val="left"/>
+      <w:pPr>
+        <w:tabs>
+          <w:tab w:val="num" w:pos="1440"/>
+        </w:tabs>
+        <w:ind w:left="1440" w:hanging="360"/>
+      </w:pPr>
+      <w:rPr>
+        <w:rFonts w:ascii="Courier New" w:hAnsi="Courier New" w:hint="default"/>
+        <w:sz w:val="20"/>
+      </w:rPr>
+    </w:lvl>
+    <w:lvl w:ilvl="2" w:tentative="1">
+      <w:start w:val="1"/>
+      <w:numFmt w:val="bullet"/>
+      <w:lvlText w:val=""/>
+      <w:lvlJc w:val="left"/>
+      <w:pPr>
+        <w:tabs>
+          <w:tab w:val="num" w:pos="2160"/>
+        </w:tabs>
+        <w:ind w:left="2160" w:hanging="360"/>
+      </w:pPr>
+      <w:rPr>
+        <w:rFonts w:ascii="Wingdings" w:hAnsi="Wingdings" w:hint="default"/>
+        <w:sz w:val="20"/>
+      </w:rPr>
+    </w:lvl>
+    <w:lvl w:ilvl="3" w:tentative="1">
+      <w:start w:val="1"/>
+      <w:numFmt w:val="bullet"/>
+      <w:lvlText w:val=""/>
+      <w:lvlJc w:val="left"/>
+      <w:pPr>
+        <w:tabs>
+          <w:tab w:val="num" w:pos="2880"/>
+        </w:tabs>
+        <w:ind w:left="2880" w:hanging="360"/>
+      </w:pPr>
+      <w:rPr>
+        <w:rFonts w:ascii="Wingdings" w:hAnsi="Wingdings" w:hint="default"/>
+        <w:sz w:val="20"/>
+      </w:rPr>
+    </w:lvl>
+    <w:lvl w:ilvl="4" w:tentative="1">
+      <w:start w:val="1"/>
+      <w:numFmt w:val="bullet"/>
+      <w:lvlText w:val=""/>
+      <w:lvlJc w:val="left"/>
+      <w:pPr>
+        <w:tabs>
+          <w:tab w:val="num" w:pos="3600"/>
+        </w:tabs>
+        <w:ind w:left="3600" w:hanging="360"/>
+      </w:pPr>
+      <w:rPr>
+        <w:rFonts w:ascii="Wingdings" w:hAnsi="Wingdings" w:hint="default"/>
+        <w:sz w:val="20"/>
+      </w:rPr>
+    </w:lvl>
+    <w:lvl w:ilvl="5" w:tentative="1">
+      <w:start w:val="1"/>
+      <w:numFmt w:val="bullet"/>
+      <w:lvlText w:val=""/>
+      <w:lvlJc w:val="left"/>
+      <w:pPr>
+        <w:tabs>
+          <w:tab w:val="num" w:pos="4320"/>
+        </w:tabs>
+        <w:ind w:left="4320" w:hanging="360"/>
+      </w:pPr>
+      <w:rPr>
+        <w:rFonts w:ascii="Wingdings" w:hAnsi="Wingdings" w:hint="default"/>
+        <w:sz w:val="20"/>
+      </w:rPr>
+    </w:lvl>
+    <w:lvl w:ilvl="6" w:tentative="1">
+      <w:start w:val="1"/>
+      <w:numFmt w:val="bullet"/>
+      <w:lvlText w:val=""/>
+      <w:lvlJc w:val="left"/>
+      <w:pPr>
+        <w:tabs>
+          <w:tab w:val="num" w:pos="5040"/>
+        </w:tabs>
+        <w:ind w:left="5040" w:hanging="360"/>
+      </w:pPr>
+      <w:rPr>
+        <w:rFonts w:ascii="Wingdings" w:hAnsi="Wingdings" w:hint="default"/>
+        <w:sz w:val="20"/>
+      </w:rPr>
+    </w:lvl>
+    <w:lvl w:ilvl="7" w:tentative="1">
+      <w:start w:val="1"/>
+      <w:numFmt w:val="bullet"/>
+      <w:lvlText w:val=""/>
+      <w:lvlJc w:val="left"/>
+      <w:pPr>
+        <w:tabs>
+          <w:tab w:val="num" w:pos="5760"/>
+        </w:tabs>
+        <w:ind w:left="5760" w:hanging="360"/>
+      </w:pPr>
+      <w:rPr>
+        <w:rFonts w:ascii="Wingdings" w:hAnsi="Wingdings" w:hint="default"/>
+        <w:sz w:val="20"/>
+      </w:rPr>
+    </w:lvl>
+    <w:lvl w:ilvl="8" w:tentative="1">
+      <w:start w:val="1"/>
+      <w:numFmt w:val="bullet"/>
+      <w:lvlText w:val=""/>
+      <w:lvlJc w:val="left"/>
+      <w:pPr>
+        <w:tabs>
+          <w:tab w:val="num" w:pos="6480"/>
+        </w:tabs>
+        <w:ind w:left="6480" w:hanging="360"/>
+      </w:pPr>
+      <w:rPr>
+        <w:rFonts w:ascii="Wingdings" w:hAnsi="Wingdings" w:hint="default"/>
+        <w:sz w:val="20"/>
+      </w:rPr>
+    </w:lvl>
+  </w:abstractNum>
+  <w:abstractNum w:abstractNumId="6" w15:restartNumberingAfterBreak="0">
+    <w:nsid w:val="5F0D50C3"/>
+    <w:multiLevelType w:val="multilevel"/>
+    <w:tmpl w:val="421C854E"/>
+    <w:lvl w:ilvl="0">
+      <w:start w:val="1"/>
+      <w:numFmt w:val="bullet"/>
+      <w:lvlText w:val=""/>
+      <w:lvlJc w:val="left"/>
+      <w:pPr>
+        <w:tabs>
+          <w:tab w:val="num" w:pos="720"/>
+        </w:tabs>
+        <w:ind w:left="720" w:hanging="360"/>
+      </w:pPr>
+      <w:rPr>
+        <w:rFonts w:ascii="Symbol" w:hAnsi="Symbol" w:hint="default"/>
+        <w:sz w:val="20"/>
+      </w:rPr>
+    </w:lvl>
+    <w:lvl w:ilvl="1" w:tentative="1">
+      <w:start w:val="1"/>
+      <w:numFmt w:val="bullet"/>
+      <w:lvlText w:val="o"/>
+      <w:lvlJc w:val="left"/>
+      <w:pPr>
+        <w:tabs>
+          <w:tab w:val="num" w:pos="1440"/>
+        </w:tabs>
+        <w:ind w:left="1440" w:hanging="360"/>
+      </w:pPr>
+      <w:rPr>
+        <w:rFonts w:ascii="Courier New" w:hAnsi="Courier New" w:hint="default"/>
+        <w:sz w:val="20"/>
+      </w:rPr>
+    </w:lvl>
+    <w:lvl w:ilvl="2" w:tentative="1">
+      <w:start w:val="1"/>
+      <w:numFmt w:val="bullet"/>
+      <w:lvlText w:val=""/>
+      <w:lvlJc w:val="left"/>
+      <w:pPr>
+        <w:tabs>
+          <w:tab w:val="num" w:pos="2160"/>
+        </w:tabs>
+        <w:ind w:left="2160" w:hanging="360"/>
+      </w:pPr>
+      <w:rPr>
+        <w:rFonts w:ascii="Wingdings" w:hAnsi="Wingdings" w:hint="default"/>
+        <w:sz w:val="20"/>
+      </w:rPr>
+    </w:lvl>
+    <w:lvl w:ilvl="3" w:tentative="1">
+      <w:start w:val="1"/>
+      <w:numFmt w:val="bullet"/>
+      <w:lvlText w:val=""/>
+      <w:lvlJc w:val="left"/>
+      <w:pPr>
+        <w:tabs>
+          <w:tab w:val="num" w:pos="2880"/>
+        </w:tabs>
+        <w:ind w:left="2880" w:hanging="360"/>
+      </w:pPr>
+      <w:rPr>
+        <w:rFonts w:ascii="Wingdings" w:hAnsi="Wingdings" w:hint="default"/>
+        <w:sz w:val="20"/>
+      </w:rPr>
+    </w:lvl>
+    <w:lvl w:ilvl="4" w:tentative="1">
+      <w:start w:val="1"/>
+      <w:numFmt w:val="bullet"/>
+      <w:lvlText w:val=""/>
+      <w:lvlJc w:val="left"/>
+      <w:pPr>
+        <w:tabs>
+          <w:tab w:val="num" w:pos="3600"/>
+        </w:tabs>
+        <w:ind w:left="3600" w:hanging="360"/>
+      </w:pPr>
+      <w:rPr>
+        <w:rFonts w:ascii="Wingdings" w:hAnsi="Wingdings" w:hint="default"/>
+        <w:sz w:val="20"/>
+      </w:rPr>
+    </w:lvl>
+    <w:lvl w:ilvl="5" w:tentative="1">
+      <w:start w:val="1"/>
+      <w:numFmt w:val="bullet"/>
+      <w:lvlText w:val=""/>
+      <w:lvlJc w:val="left"/>
+      <w:pPr>
+        <w:tabs>
+          <w:tab w:val="num" w:pos="4320"/>
+        </w:tabs>
+        <w:ind w:left="4320" w:hanging="360"/>
+      </w:pPr>
+      <w:rPr>
+        <w:rFonts w:ascii="Wingdings" w:hAnsi="Wingdings" w:hint="default"/>
+        <w:sz w:val="20"/>
+      </w:rPr>
+    </w:lvl>
+    <w:lvl w:ilvl="6" w:tentative="1">
+      <w:start w:val="1"/>
+      <w:numFmt w:val="bullet"/>
+      <w:lvlText w:val=""/>
+      <w:lvlJc w:val="left"/>
+      <w:pPr>
+        <w:tabs>
+          <w:tab w:val="num" w:pos="5040"/>
+        </w:tabs>
+        <w:ind w:left="5040" w:hanging="360"/>
+      </w:pPr>
+      <w:rPr>
+        <w:rFonts w:ascii="Wingdings" w:hAnsi="Wingdings" w:hint="default"/>
+        <w:sz w:val="20"/>
+      </w:rPr>
+    </w:lvl>
+    <w:lvl w:ilvl="7" w:tentative="1">
+      <w:start w:val="1"/>
+      <w:numFmt w:val="bullet"/>
+      <w:lvlText w:val=""/>
+      <w:lvlJc w:val="left"/>
+      <w:pPr>
+        <w:tabs>
+          <w:tab w:val="num" w:pos="5760"/>
+        </w:tabs>
+        <w:ind w:left="5760" w:hanging="360"/>
+      </w:pPr>
+      <w:rPr>
+        <w:rFonts w:ascii="Wingdings" w:hAnsi="Wingdings" w:hint="default"/>
+        <w:sz w:val="20"/>
+      </w:rPr>
+    </w:lvl>
+    <w:lvl w:ilvl="8" w:tentative="1">
+      <w:start w:val="1"/>
+      <w:numFmt w:val="bullet"/>
+      <w:lvlText w:val=""/>
+      <w:lvlJc w:val="left"/>
+      <w:pPr>
+        <w:tabs>
+          <w:tab w:val="num" w:pos="6480"/>
+        </w:tabs>
+        <w:ind w:left="6480" w:hanging="360"/>
+      </w:pPr>
+      <w:rPr>
+        <w:rFonts w:ascii="Wingdings" w:hAnsi="Wingdings" w:hint="default"/>
+        <w:sz w:val="20"/>
+      </w:rPr>
+    </w:lvl>
+  </w:abstractNum>
+  <w:abstractNum w:abstractNumId="7" w15:restartNumberingAfterBreak="0">
+    <w:nsid w:val="600E40A5"/>
+    <w:multiLevelType w:val="multilevel"/>
+    <w:tmpl w:val="7A162FCA"/>
+    <w:lvl w:ilvl="0">
+      <w:start w:val="1"/>
+      <w:numFmt w:val="bullet"/>
+      <w:lvlText w:val=""/>
+      <w:lvlJc w:val="left"/>
+      <w:pPr>
+        <w:tabs>
+          <w:tab w:val="num" w:pos="720"/>
+        </w:tabs>
+        <w:ind w:left="720" w:hanging="360"/>
+      </w:pPr>
+      <w:rPr>
+        <w:rFonts w:ascii="Symbol" w:hAnsi="Symbol" w:hint="default"/>
+        <w:sz w:val="20"/>
+      </w:rPr>
+    </w:lvl>
+    <w:lvl w:ilvl="1" w:tentative="1">
+      <w:start w:val="1"/>
+      <w:numFmt w:val="bullet"/>
+      <w:lvlText w:val="o"/>
+      <w:lvlJc w:val="left"/>
+      <w:pPr>
+        <w:tabs>
+          <w:tab w:val="num" w:pos="1440"/>
+        </w:tabs>
+        <w:ind w:left="1440" w:hanging="360"/>
+      </w:pPr>
+      <w:rPr>
+        <w:rFonts w:ascii="Courier New" w:hAnsi="Courier New" w:hint="default"/>
+        <w:sz w:val="20"/>
+      </w:rPr>
+    </w:lvl>
+    <w:lvl w:ilvl="2" w:tentative="1">
+      <w:start w:val="1"/>
+      <w:numFmt w:val="bullet"/>
+      <w:lvlText w:val=""/>
+      <w:lvlJc w:val="left"/>
+      <w:pPr>
+        <w:tabs>
+          <w:tab w:val="num" w:pos="2160"/>
+        </w:tabs>
+        <w:ind w:left="2160" w:hanging="360"/>
+      </w:pPr>
+      <w:rPr>
+        <w:rFonts w:ascii="Wingdings" w:hAnsi="Wingdings" w:hint="default"/>
+        <w:sz w:val="20"/>
+      </w:rPr>
+    </w:lvl>
+    <w:lvl w:ilvl="3" w:tentative="1">
+      <w:start w:val="1"/>
+      <w:numFmt w:val="bullet"/>
+      <w:lvlText w:val=""/>
+      <w:lvlJc w:val="left"/>
+      <w:pPr>
+        <w:tabs>
+          <w:tab w:val="num" w:pos="2880"/>
+        </w:tabs>
+        <w:ind w:left="2880" w:hanging="360"/>
+      </w:pPr>
+      <w:rPr>
+        <w:rFonts w:ascii="Wingdings" w:hAnsi="Wingdings" w:hint="default"/>
+        <w:sz w:val="20"/>
+      </w:rPr>
+    </w:lvl>
+    <w:lvl w:ilvl="4" w:tentative="1">
+      <w:start w:val="1"/>
+      <w:numFmt w:val="bullet"/>
+      <w:lvlText w:val=""/>
+      <w:lvlJc w:val="left"/>
+      <w:pPr>
+        <w:tabs>
+          <w:tab w:val="num" w:pos="3600"/>
+        </w:tabs>
+        <w:ind w:left="3600" w:hanging="360"/>
+      </w:pPr>
+      <w:rPr>
+        <w:rFonts w:ascii="Wingdings" w:hAnsi="Wingdings" w:hint="default"/>
+        <w:sz w:val="20"/>
+      </w:rPr>
+    </w:lvl>
+    <w:lvl w:ilvl="5" w:tentative="1">
+      <w:start w:val="1"/>
+      <w:numFmt w:val="bullet"/>
+      <w:lvlText w:val=""/>
+      <w:lvlJc w:val="left"/>
+      <w:pPr>
+        <w:tabs>
+          <w:tab w:val="num" w:pos="4320"/>
+        </w:tabs>
+        <w:ind w:left="4320" w:hanging="360"/>
+      </w:pPr>
+      <w:rPr>
+        <w:rFonts w:ascii="Wingdings" w:hAnsi="Wingdings" w:hint="default"/>
+        <w:sz w:val="20"/>
+      </w:rPr>
+    </w:lvl>
+    <w:lvl w:ilvl="6" w:tentative="1">
+      <w:start w:val="1"/>
+      <w:numFmt w:val="bullet"/>
+      <w:lvlText w:val=""/>
+      <w:lvlJc w:val="left"/>
+      <w:pPr>
+        <w:tabs>
+          <w:tab w:val="num" w:pos="5040"/>
+        </w:tabs>
+        <w:ind w:left="5040" w:hanging="360"/>
+      </w:pPr>
+      <w:rPr>
+        <w:rFonts w:ascii="Wingdings" w:hAnsi="Wingdings" w:hint="default"/>
+        <w:sz w:val="20"/>
+      </w:rPr>
+    </w:lvl>
+    <w:lvl w:ilvl="7" w:tentative="1">
+      <w:start w:val="1"/>
+      <w:numFmt w:val="bullet"/>
+      <w:lvlText w:val=""/>
+      <w:lvlJc w:val="left"/>
+      <w:pPr>
+        <w:tabs>
+          <w:tab w:val="num" w:pos="5760"/>
+        </w:tabs>
+        <w:ind w:left="5760" w:hanging="360"/>
+      </w:pPr>
+      <w:rPr>
+        <w:rFonts w:ascii="Wingdings" w:hAnsi="Wingdings" w:hint="default"/>
+        <w:sz w:val="20"/>
+      </w:rPr>
+    </w:lvl>
+    <w:lvl w:ilvl="8" w:tentative="1">
+      <w:start w:val="1"/>
+      <w:numFmt w:val="bullet"/>
+      <w:lvlText w:val=""/>
+      <w:lvlJc w:val="left"/>
+      <w:pPr>
+        <w:tabs>
+          <w:tab w:val="num" w:pos="6480"/>
+        </w:tabs>
+        <w:ind w:left="6480" w:hanging="360"/>
+      </w:pPr>
+      <w:rPr>
+        <w:rFonts w:ascii="Wingdings" w:hAnsi="Wingdings" w:hint="default"/>
+        <w:sz w:val="20"/>
+      </w:rPr>
+    </w:lvl>
+  </w:abstractNum>
+  <w:abstractNum w:abstractNumId="8" w15:restartNumberingAfterBreak="0">
+    <w:nsid w:val="64613C82"/>
+    <w:multiLevelType w:val="multilevel"/>
+    <w:tmpl w:val="2068802A"/>
+    <w:lvl w:ilvl="0">
+      <w:start w:val="1"/>
+      <w:numFmt w:val="bullet"/>
+      <w:lvlText w:val=""/>
+      <w:lvlJc w:val="left"/>
+      <w:pPr>
+        <w:tabs>
+          <w:tab w:val="num" w:pos="720"/>
+        </w:tabs>
+        <w:ind w:left="720" w:hanging="360"/>
+      </w:pPr>
+      <w:rPr>
+        <w:rFonts w:ascii="Symbol" w:hAnsi="Symbol" w:hint="default"/>
+        <w:sz w:val="20"/>
+      </w:rPr>
+    </w:lvl>
+    <w:lvl w:ilvl="1" w:tentative="1">
+      <w:start w:val="1"/>
+      <w:numFmt w:val="bullet"/>
+      <w:lvlText w:val="o"/>
+      <w:lvlJc w:val="left"/>
+      <w:pPr>
+        <w:tabs>
+          <w:tab w:val="num" w:pos="1440"/>
+        </w:tabs>
+        <w:ind w:left="1440" w:hanging="360"/>
+      </w:pPr>
+      <w:rPr>
+        <w:rFonts w:ascii="Courier New" w:hAnsi="Courier New" w:hint="default"/>
+        <w:sz w:val="20"/>
+      </w:rPr>
+    </w:lvl>
+    <w:lvl w:ilvl="2" w:tentative="1">
+      <w:start w:val="1"/>
+      <w:numFmt w:val="bullet"/>
+      <w:lvlText w:val=""/>
+      <w:lvlJc w:val="left"/>
+      <w:pPr>
+        <w:tabs>
+          <w:tab w:val="num" w:pos="2160"/>
+        </w:tabs>
+        <w:ind w:left="2160" w:hanging="360"/>
+      </w:pPr>
+      <w:rPr>
+        <w:rFonts w:ascii="Wingdings" w:hAnsi="Wingdings" w:hint="default"/>
+        <w:sz w:val="20"/>
+      </w:rPr>
+    </w:lvl>
+    <w:lvl w:ilvl="3" w:tentative="1">
+      <w:start w:val="1"/>
+      <w:numFmt w:val="bullet"/>
+      <w:lvlText w:val=""/>
+      <w:lvlJc w:val="left"/>
+      <w:pPr>
+        <w:tabs>
+          <w:tab w:val="num" w:pos="2880"/>
+        </w:tabs>
+        <w:ind w:left="2880" w:hanging="360"/>
+      </w:pPr>
+      <w:rPr>
+        <w:rFonts w:ascii="Wingdings" w:hAnsi="Wingdings" w:hint="default"/>
+        <w:sz w:val="20"/>
+      </w:rPr>
+    </w:lvl>
+    <w:lvl w:ilvl="4" w:tentative="1">
+      <w:start w:val="1"/>
+      <w:numFmt w:val="bullet"/>
+      <w:lvlText w:val=""/>
+      <w:lvlJc w:val="left"/>
+      <w:pPr>
+        <w:tabs>
+          <w:tab w:val="num" w:pos="3600"/>
+        </w:tabs>
+        <w:ind w:left="3600" w:hanging="360"/>
+      </w:pPr>
+      <w:rPr>
+        <w:rFonts w:ascii="Wingdings" w:hAnsi="Wingdings" w:hint="default"/>
+        <w:sz w:val="20"/>
+      </w:rPr>
+    </w:lvl>
+    <w:lvl w:ilvl="5" w:tentative="1">
+      <w:start w:val="1"/>
+      <w:numFmt w:val="bullet"/>
+      <w:lvlText w:val=""/>
+      <w:lvlJc w:val="left"/>
+      <w:pPr>
+        <w:tabs>
+          <w:tab w:val="num" w:pos="4320"/>
+        </w:tabs>
+        <w:ind w:left="4320" w:hanging="360"/>
+      </w:pPr>
+      <w:rPr>
+        <w:rFonts w:ascii="Wingdings" w:hAnsi="Wingdings" w:hint="default"/>
+        <w:sz w:val="20"/>
+      </w:rPr>
+    </w:lvl>
+    <w:lvl w:ilvl="6" w:tentative="1">
+      <w:start w:val="1"/>
+      <w:numFmt w:val="bullet"/>
+      <w:lvlText w:val=""/>
+      <w:lvlJc w:val="left"/>
+      <w:pPr>
+        <w:tabs>
+          <w:tab w:val="num" w:pos="5040"/>
+        </w:tabs>
+        <w:ind w:left="5040" w:hanging="360"/>
+      </w:pPr>
+      <w:rPr>
+        <w:rFonts w:ascii="Wingdings" w:hAnsi="Wingdings" w:hint="default"/>
+        <w:sz w:val="20"/>
+      </w:rPr>
+    </w:lvl>
+    <w:lvl w:ilvl="7" w:tentative="1">
+      <w:start w:val="1"/>
+      <w:numFmt w:val="bullet"/>
+      <w:lvlText w:val=""/>
+      <w:lvlJc w:val="left"/>
+      <w:pPr>
+        <w:tabs>
+          <w:tab w:val="num" w:pos="5760"/>
+        </w:tabs>
+        <w:ind w:left="5760" w:hanging="360"/>
+      </w:pPr>
+      <w:rPr>
+        <w:rFonts w:ascii="Wingdings" w:hAnsi="Wingdings" w:hint="default"/>
+        <w:sz w:val="20"/>
+      </w:rPr>
+    </w:lvl>
+    <w:lvl w:ilvl="8" w:tentative="1">
+      <w:start w:val="1"/>
+      <w:numFmt w:val="bullet"/>
+      <w:lvlText w:val=""/>
+      <w:lvlJc w:val="left"/>
+      <w:pPr>
+        <w:tabs>
+          <w:tab w:val="num" w:pos="6480"/>
+        </w:tabs>
+        <w:ind w:left="6480" w:hanging="360"/>
+      </w:pPr>
+      <w:rPr>
+        <w:rFonts w:ascii="Wingdings" w:hAnsi="Wingdings" w:hint="default"/>
+        <w:sz w:val="20"/>
+      </w:rPr>
+    </w:lvl>
+  </w:abstractNum>
+  <w:abstractNum w:abstractNumId="9" w15:restartNumberingAfterBreak="0">
+    <w:nsid w:val="65857E41"/>
+    <w:multiLevelType w:val="multilevel"/>
+    <w:tmpl w:val="9098B070"/>
+    <w:lvl w:ilvl="0">
+      <w:start w:val="1"/>
+      <w:numFmt w:val="bullet"/>
+      <w:lvlText w:val=""/>
+      <w:lvlJc w:val="left"/>
+      <w:pPr>
+        <w:tabs>
+          <w:tab w:val="num" w:pos="720"/>
+        </w:tabs>
+        <w:ind w:left="720" w:hanging="360"/>
+      </w:pPr>
+      <w:rPr>
+        <w:rFonts w:ascii="Symbol" w:hAnsi="Symbol" w:hint="default"/>
+        <w:sz w:val="20"/>
+      </w:rPr>
+    </w:lvl>
+    <w:lvl w:ilvl="1" w:tentative="1">
+      <w:start w:val="1"/>
+      <w:numFmt w:val="bullet"/>
+      <w:lvlText w:val="o"/>
+      <w:lvlJc w:val="left"/>
+      <w:pPr>
+        <w:tabs>
+          <w:tab w:val="num" w:pos="1440"/>
+        </w:tabs>
+        <w:ind w:left="1440" w:hanging="360"/>
+      </w:pPr>
+      <w:rPr>
+        <w:rFonts w:ascii="Courier New" w:hAnsi="Courier New" w:hint="default"/>
+        <w:sz w:val="20"/>
+      </w:rPr>
+    </w:lvl>
+    <w:lvl w:ilvl="2" w:tentative="1">
+      <w:start w:val="1"/>
+      <w:numFmt w:val="bullet"/>
+      <w:lvlText w:val=""/>
+      <w:lvlJc w:val="left"/>
+      <w:pPr>
+        <w:tabs>
+          <w:tab w:val="num" w:pos="2160"/>
+        </w:tabs>
+        <w:ind w:left="2160" w:hanging="360"/>
+      </w:pPr>
+      <w:rPr>
+        <w:rFonts w:ascii="Wingdings" w:hAnsi="Wingdings" w:hint="default"/>
+        <w:sz w:val="20"/>
+      </w:rPr>
+    </w:lvl>
+    <w:lvl w:ilvl="3" w:tentative="1">
+      <w:start w:val="1"/>
+      <w:numFmt w:val="bullet"/>
+      <w:lvlText w:val=""/>
+      <w:lvlJc w:val="left"/>
+      <w:pPr>
+        <w:tabs>
+          <w:tab w:val="num" w:pos="2880"/>
+        </w:tabs>
+        <w:ind w:left="2880" w:hanging="360"/>
+      </w:pPr>
+      <w:rPr>
+        <w:rFonts w:ascii="Wingdings" w:hAnsi="Wingdings" w:hint="default"/>
+        <w:sz w:val="20"/>
+      </w:rPr>
+    </w:lvl>
+    <w:lvl w:ilvl="4" w:tentative="1">
+      <w:start w:val="1"/>
+      <w:numFmt w:val="bullet"/>
+      <w:lvlText w:val=""/>
+      <w:lvlJc w:val="left"/>
+      <w:pPr>
+        <w:tabs>
+          <w:tab w:val="num" w:pos="3600"/>
+        </w:tabs>
+        <w:ind w:left="3600" w:hanging="360"/>
+      </w:pPr>
+      <w:rPr>
+        <w:rFonts w:ascii="Wingdings" w:hAnsi="Wingdings" w:hint="default"/>
+        <w:sz w:val="20"/>
+      </w:rPr>
+    </w:lvl>
+    <w:lvl w:ilvl="5" w:tentative="1">
+      <w:start w:val="1"/>
+      <w:numFmt w:val="bullet"/>
+      <w:lvlText w:val=""/>
+      <w:lvlJc w:val="left"/>
+      <w:pPr>
+        <w:tabs>
+          <w:tab w:val="num" w:pos="4320"/>
+        </w:tabs>
+        <w:ind w:left="4320" w:hanging="360"/>
+      </w:pPr>
+      <w:rPr>
+        <w:rFonts w:ascii="Wingdings" w:hAnsi="Wingdings" w:hint="default"/>
+        <w:sz w:val="20"/>
+      </w:rPr>
+    </w:lvl>
+    <w:lvl w:ilvl="6" w:tentative="1">
+      <w:start w:val="1"/>
+      <w:numFmt w:val="bullet"/>
+      <w:lvlText w:val=""/>
+      <w:lvlJc w:val="left"/>
+      <w:pPr>
+        <w:tabs>
+          <w:tab w:val="num" w:pos="5040"/>
+        </w:tabs>
+        <w:ind w:left="5040" w:hanging="360"/>
+      </w:pPr>
+      <w:rPr>
+        <w:rFonts w:ascii="Wingdings" w:hAnsi="Wingdings" w:hint="default"/>
+        <w:sz w:val="20"/>
+      </w:rPr>
+    </w:lvl>
+    <w:lvl w:ilvl="7" w:tentative="1">
+      <w:start w:val="1"/>
+      <w:numFmt w:val="bullet"/>
+      <w:lvlText w:val=""/>
+      <w:lvlJc w:val="left"/>
+      <w:pPr>
+        <w:tabs>
+          <w:tab w:val="num" w:pos="5760"/>
+        </w:tabs>
+        <w:ind w:left="5760" w:hanging="360"/>
+      </w:pPr>
+      <w:rPr>
+        <w:rFonts w:ascii="Wingdings" w:hAnsi="Wingdings" w:hint="default"/>
+        <w:sz w:val="20"/>
+      </w:rPr>
+    </w:lvl>
+    <w:lvl w:ilvl="8" w:tentative="1">
+      <w:start w:val="1"/>
+      <w:numFmt w:val="bullet"/>
+      <w:lvlText w:val=""/>
+      <w:lvlJc w:val="left"/>
+      <w:pPr>
+        <w:tabs>
+          <w:tab w:val="num" w:pos="6480"/>
+        </w:tabs>
+        <w:ind w:left="6480" w:hanging="360"/>
+      </w:pPr>
+      <w:rPr>
+        <w:rFonts w:ascii="Wingdings" w:hAnsi="Wingdings" w:hint="default"/>
+        <w:sz w:val="20"/>
+      </w:rPr>
+    </w:lvl>
+  </w:abstractNum>
+  <w:abstractNum w:abstractNumId="10" w15:restartNumberingAfterBreak="0">
+    <w:nsid w:val="6A4B7D6E"/>
+    <w:multiLevelType w:val="multilevel"/>
+    <w:tmpl w:val="4FE6AA9E"/>
+    <w:lvl w:ilvl="0">
+      <w:start w:val="1"/>
+      <w:numFmt w:val="bullet"/>
+      <w:lvlText w:val=""/>
+      <w:lvlJc w:val="left"/>
+      <w:pPr>
+        <w:tabs>
+          <w:tab w:val="num" w:pos="720"/>
+        </w:tabs>
+        <w:ind w:left="720" w:hanging="360"/>
+      </w:pPr>
+      <w:rPr>
+        <w:rFonts w:ascii="Symbol" w:hAnsi="Symbol" w:hint="default"/>
+        <w:sz w:val="20"/>
+      </w:rPr>
+    </w:lvl>
+    <w:lvl w:ilvl="1" w:tentative="1">
+      <w:start w:val="1"/>
+      <w:numFmt w:val="bullet"/>
+      <w:lvlText w:val="o"/>
+      <w:lvlJc w:val="left"/>
+      <w:pPr>
+        <w:tabs>
+          <w:tab w:val="num" w:pos="1440"/>
+        </w:tabs>
+        <w:ind w:left="1440" w:hanging="360"/>
+      </w:pPr>
+      <w:rPr>
+        <w:rFonts w:ascii="Courier New" w:hAnsi="Courier New" w:hint="default"/>
+        <w:sz w:val="20"/>
+      </w:rPr>
+    </w:lvl>
+    <w:lvl w:ilvl="2" w:tentative="1">
+      <w:start w:val="1"/>
+      <w:numFmt w:val="bullet"/>
+      <w:lvlText w:val=""/>
+      <w:lvlJc w:val="left"/>
+      <w:pPr>
+        <w:tabs>
+          <w:tab w:val="num" w:pos="2160"/>
+        </w:tabs>
+        <w:ind w:left="2160" w:hanging="360"/>
+      </w:pPr>
+      <w:rPr>
+        <w:rFonts w:ascii="Wingdings" w:hAnsi="Wingdings" w:hint="default"/>
+        <w:sz w:val="20"/>
+      </w:rPr>
+    </w:lvl>
+    <w:lvl w:ilvl="3" w:tentative="1">
+      <w:start w:val="1"/>
+      <w:numFmt w:val="bullet"/>
+      <w:lvlText w:val=""/>
+      <w:lvlJc w:val="left"/>
+      <w:pPr>
+        <w:tabs>
+          <w:tab w:val="num" w:pos="2880"/>
+        </w:tabs>
+        <w:ind w:left="2880" w:hanging="360"/>
+      </w:pPr>
+      <w:rPr>
+        <w:rFonts w:ascii="Wingdings" w:hAnsi="Wingdings" w:hint="default"/>
+        <w:sz w:val="20"/>
+      </w:rPr>
+    </w:lvl>
+    <w:lvl w:ilvl="4" w:tentative="1">
+      <w:start w:val="1"/>
+      <w:numFmt w:val="bullet"/>
+      <w:lvlText w:val=""/>
+      <w:lvlJc w:val="left"/>
+      <w:pPr>
+        <w:tabs>
+          <w:tab w:val="num" w:pos="3600"/>
+        </w:tabs>
+        <w:ind w:left="3600" w:hanging="360"/>
+      </w:pPr>
+      <w:rPr>
+        <w:rFonts w:ascii="Wingdings" w:hAnsi="Wingdings" w:hint="default"/>
+        <w:sz w:val="20"/>
+      </w:rPr>
+    </w:lvl>
+    <w:lvl w:ilvl="5" w:tentative="1">
+      <w:start w:val="1"/>
+      <w:numFmt w:val="bullet"/>
+      <w:lvlText w:val=""/>
+      <w:lvlJc w:val="left"/>
+      <w:pPr>
+        <w:tabs>
+          <w:tab w:val="num" w:pos="4320"/>
+        </w:tabs>
+        <w:ind w:left="4320" w:hanging="360"/>
+      </w:pPr>
+      <w:rPr>
+        <w:rFonts w:ascii="Wingdings" w:hAnsi="Wingdings" w:hint="default"/>
+        <w:sz w:val="20"/>
+      </w:rPr>
+    </w:lvl>
+    <w:lvl w:ilvl="6" w:tentative="1">
+      <w:start w:val="1"/>
+      <w:numFmt w:val="bullet"/>
+      <w:lvlText w:val=""/>
+      <w:lvlJc w:val="left"/>
+      <w:pPr>
+        <w:tabs>
+          <w:tab w:val="num" w:pos="5040"/>
+        </w:tabs>
+        <w:ind w:left="5040" w:hanging="360"/>
+      </w:pPr>
+      <w:rPr>
+        <w:rFonts w:ascii="Wingdings" w:hAnsi="Wingdings" w:hint="default"/>
+        <w:sz w:val="20"/>
+      </w:rPr>
+    </w:lvl>
+    <w:lvl w:ilvl="7" w:tentative="1">
+      <w:start w:val="1"/>
+      <w:numFmt w:val="bullet"/>
+      <w:lvlText w:val=""/>
+      <w:lvlJc w:val="left"/>
+      <w:pPr>
+        <w:tabs>
+          <w:tab w:val="num" w:pos="5760"/>
+        </w:tabs>
+        <w:ind w:left="5760" w:hanging="360"/>
+      </w:pPr>
+      <w:rPr>
+        <w:rFonts w:ascii="Wingdings" w:hAnsi="Wingdings" w:hint="default"/>
+        <w:sz w:val="20"/>
+      </w:rPr>
+    </w:lvl>
+    <w:lvl w:ilvl="8" w:tentative="1">
+      <w:start w:val="1"/>
+      <w:numFmt w:val="bullet"/>
+      <w:lvlText w:val=""/>
+      <w:lvlJc w:val="left"/>
+      <w:pPr>
+        <w:tabs>
+          <w:tab w:val="num" w:pos="6480"/>
+        </w:tabs>
+        <w:ind w:left="6480" w:hanging="360"/>
+      </w:pPr>
+      <w:rPr>
+        <w:rFonts w:ascii="Wingdings" w:hAnsi="Wingdings" w:hint="default"/>
+        <w:sz w:val="20"/>
+      </w:rPr>
+    </w:lvl>
+  </w:abstractNum>
+  <w:abstractNum w:abstractNumId="11" w15:restartNumberingAfterBreak="0">
+    <w:nsid w:val="75A102D4"/>
+    <w:multiLevelType w:val="multilevel"/>
+    <w:tmpl w:val="42BA341E"/>
+    <w:lvl w:ilvl="0">
+      <w:start w:val="1"/>
+      <w:numFmt w:val="bullet"/>
+      <w:lvlText w:val=""/>
+      <w:lvlJc w:val="left"/>
+      <w:pPr>
+        <w:tabs>
+          <w:tab w:val="num" w:pos="720"/>
+        </w:tabs>
+        <w:ind w:left="720" w:hanging="360"/>
+      </w:pPr>
+      <w:rPr>
+        <w:rFonts w:ascii="Symbol" w:hAnsi="Symbol" w:hint="default"/>
+        <w:sz w:val="20"/>
+      </w:rPr>
+    </w:lvl>
+    <w:lvl w:ilvl="1" w:tentative="1">
+      <w:start w:val="1"/>
+      <w:numFmt w:val="bullet"/>
+      <w:lvlText w:val="o"/>
+      <w:lvlJc w:val="left"/>
+      <w:pPr>
+        <w:tabs>
+          <w:tab w:val="num" w:pos="1440"/>
+        </w:tabs>
+        <w:ind w:left="1440" w:hanging="360"/>
+      </w:pPr>
+      <w:rPr>
+        <w:rFonts w:ascii="Courier New" w:hAnsi="Courier New" w:hint="default"/>
+        <w:sz w:val="20"/>
+      </w:rPr>
+    </w:lvl>
+    <w:lvl w:ilvl="2" w:tentative="1">
+      <w:start w:val="1"/>
+      <w:numFmt w:val="bullet"/>
+      <w:lvlText w:val=""/>
+      <w:lvlJc w:val="left"/>
+      <w:pPr>
+        <w:tabs>
+          <w:tab w:val="num" w:pos="2160"/>
+        </w:tabs>
+        <w:ind w:left="2160" w:hanging="360"/>
+      </w:pPr>
+      <w:rPr>
+        <w:rFonts w:ascii="Wingdings" w:hAnsi="Wingdings" w:hint="default"/>
+        <w:sz w:val="20"/>
+      </w:rPr>
+    </w:lvl>
+    <w:lvl w:ilvl="3" w:tentative="1">
+      <w:start w:val="1"/>
+      <w:numFmt w:val="bullet"/>
+      <w:lvlText w:val=""/>
+      <w:lvlJc w:val="left"/>
+      <w:pPr>
+        <w:tabs>
+          <w:tab w:val="num" w:pos="2880"/>
+        </w:tabs>
+        <w:ind w:left="2880" w:hanging="360"/>
+      </w:pPr>
+      <w:rPr>
+        <w:rFonts w:ascii="Wingdings" w:hAnsi="Wingdings" w:hint="default"/>
+        <w:sz w:val="20"/>
+      </w:rPr>
+    </w:lvl>
+    <w:lvl w:ilvl="4" w:tentative="1">
+      <w:start w:val="1"/>
+      <w:numFmt w:val="bullet"/>
+      <w:lvlText w:val=""/>
+      <w:lvlJc w:val="left"/>
+      <w:pPr>
+        <w:tabs>
+          <w:tab w:val="num" w:pos="3600"/>
+        </w:tabs>
+        <w:ind w:left="3600" w:hanging="360"/>
+      </w:pPr>
+      <w:rPr>
+        <w:rFonts w:ascii="Wingdings" w:hAnsi="Wingdings" w:hint="default"/>
+        <w:sz w:val="20"/>
+      </w:rPr>
+    </w:lvl>
+    <w:lvl w:ilvl="5" w:tentative="1">
+      <w:start w:val="1"/>
+      <w:numFmt w:val="bullet"/>
+      <w:lvlText w:val=""/>
+      <w:lvlJc w:val="left"/>
+      <w:pPr>
+        <w:tabs>
+          <w:tab w:val="num" w:pos="4320"/>
+        </w:tabs>
+        <w:ind w:left="4320" w:hanging="360"/>
+      </w:pPr>
+      <w:rPr>
+        <w:rFonts w:ascii="Wingdings" w:hAnsi="Wingdings" w:hint="default"/>
+        <w:sz w:val="20"/>
+      </w:rPr>
+    </w:lvl>
+    <w:lvl w:ilvl="6" w:tentative="1">
+      <w:start w:val="1"/>
+      <w:numFmt w:val="bullet"/>
+      <w:lvlText w:val=""/>
+      <w:lvlJc w:val="left"/>
+      <w:pPr>
+        <w:tabs>
+          <w:tab w:val="num" w:pos="5040"/>
+        </w:tabs>
+        <w:ind w:left="5040" w:hanging="360"/>
+      </w:pPr>
+      <w:rPr>
+        <w:rFonts w:ascii="Wingdings" w:hAnsi="Wingdings" w:hint="default"/>
+        <w:sz w:val="20"/>
+      </w:rPr>
+    </w:lvl>
+    <w:lvl w:ilvl="7" w:tentative="1">
+      <w:start w:val="1"/>
+      <w:numFmt w:val="bullet"/>
+      <w:lvlText w:val=""/>
+      <w:lvlJc w:val="left"/>
+      <w:pPr>
+        <w:tabs>
+          <w:tab w:val="num" w:pos="5760"/>
+        </w:tabs>
+        <w:ind w:left="5760" w:hanging="360"/>
+      </w:pPr>
+      <w:rPr>
+        <w:rFonts w:ascii="Wingdings" w:hAnsi="Wingdings" w:hint="default"/>
+        <w:sz w:val="20"/>
+      </w:rPr>
+    </w:lvl>
+    <w:lvl w:ilvl="8" w:tentative="1">
+      <w:start w:val="1"/>
+      <w:numFmt w:val="bullet"/>
+      <w:lvlText w:val=""/>
+      <w:lvlJc w:val="left"/>
+      <w:pPr>
+        <w:tabs>
+          <w:tab w:val="num" w:pos="6480"/>
+        </w:tabs>
+        <w:ind w:left="6480" w:hanging="360"/>
+      </w:pPr>
+      <w:rPr>
+        <w:rFonts w:ascii="Wingdings" w:hAnsi="Wingdings" w:hint="default"/>
+        <w:sz w:val="20"/>
+      </w:rPr>
+    </w:lvl>
+  </w:abstractNum>
+  <w:abstractNum w:abstractNumId="12" w15:restartNumberingAfterBreak="0">
+    <w:nsid w:val="7AF731B4"/>
+    <w:multiLevelType w:val="multilevel"/>
+    <w:tmpl w:val="286E4670"/>
+    <w:lvl w:ilvl="0">
+      <w:start w:val="1"/>
+      <w:numFmt w:val="bullet"/>
+      <w:lvlText w:val=""/>
+      <w:lvlJc w:val="left"/>
+      <w:pPr>
+        <w:tabs>
+          <w:tab w:val="num" w:pos="720"/>
+        </w:tabs>
+        <w:ind w:left="720" w:hanging="360"/>
+      </w:pPr>
+      <w:rPr>
+        <w:rFonts w:ascii="Symbol" w:hAnsi="Symbol" w:hint="default"/>
+        <w:sz w:val="20"/>
+      </w:rPr>
+    </w:lvl>
+    <w:lvl w:ilvl="1" w:tentative="1">
+      <w:start w:val="1"/>
+      <w:numFmt w:val="bullet"/>
+      <w:lvlText w:val="o"/>
+      <w:lvlJc w:val="left"/>
+      <w:pPr>
+        <w:tabs>
+          <w:tab w:val="num" w:pos="1440"/>
+        </w:tabs>
+        <w:ind w:left="1440" w:hanging="360"/>
+      </w:pPr>
+      <w:rPr>
+        <w:rFonts w:ascii="Courier New" w:hAnsi="Courier New" w:hint="default"/>
+        <w:sz w:val="20"/>
+      </w:rPr>
+    </w:lvl>
+    <w:lvl w:ilvl="2" w:tentative="1">
+      <w:start w:val="1"/>
+      <w:numFmt w:val="bullet"/>
+      <w:lvlText w:val=""/>
+      <w:lvlJc w:val="left"/>
+      <w:pPr>
+        <w:tabs>
+          <w:tab w:val="num" w:pos="2160"/>
+        </w:tabs>
+        <w:ind w:left="2160" w:hanging="360"/>
+      </w:pPr>
+      <w:rPr>
+        <w:rFonts w:ascii="Wingdings" w:hAnsi="Wingdings" w:hint="default"/>
+        <w:sz w:val="20"/>
+      </w:rPr>
+    </w:lvl>
+    <w:lvl w:ilvl="3" w:tentative="1">
+      <w:start w:val="1"/>
+      <w:numFmt w:val="bullet"/>
+      <w:lvlText w:val=""/>
+      <w:lvlJc w:val="left"/>
+      <w:pPr>
+        <w:tabs>
+          <w:tab w:val="num" w:pos="2880"/>
+        </w:tabs>
+        <w:ind w:left="2880" w:hanging="360"/>
+      </w:pPr>
+      <w:rPr>
+        <w:rFonts w:ascii="Wingdings" w:hAnsi="Wingdings" w:hint="default"/>
+        <w:sz w:val="20"/>
+      </w:rPr>
+    </w:lvl>
+    <w:lvl w:ilvl="4" w:tentative="1">
+      <w:start w:val="1"/>
+      <w:numFmt w:val="bullet"/>
+      <w:lvlText w:val=""/>
+      <w:lvlJc w:val="left"/>
+      <w:pPr>
+        <w:tabs>
+          <w:tab w:val="num" w:pos="3600"/>
+        </w:tabs>
+        <w:ind w:left="3600" w:hanging="360"/>
+      </w:pPr>
+      <w:rPr>
+        <w:rFonts w:ascii="Wingdings" w:hAnsi="Wingdings" w:hint="default"/>
+        <w:sz w:val="20"/>
+      </w:rPr>
+    </w:lvl>
+    <w:lvl w:ilvl="5" w:tentative="1">
+      <w:start w:val="1"/>
+      <w:numFmt w:val="bullet"/>
+      <w:lvlText w:val=""/>
+      <w:lvlJc w:val="left"/>
+      <w:pPr>
+        <w:tabs>
+          <w:tab w:val="num" w:pos="4320"/>
+        </w:tabs>
+        <w:ind w:left="4320" w:hanging="360"/>
+      </w:pPr>
+      <w:rPr>
+        <w:rFonts w:ascii="Wingdings" w:hAnsi="Wingdings" w:hint="default"/>
+        <w:sz w:val="20"/>
+      </w:rPr>
+    </w:lvl>
+    <w:lvl w:ilvl="6" w:tentative="1">
+      <w:start w:val="1"/>
+      <w:numFmt w:val="bullet"/>
+      <w:lvlText w:val=""/>
+      <w:lvlJc w:val="left"/>
+      <w:pPr>
+        <w:tabs>
+          <w:tab w:val="num" w:pos="5040"/>
+        </w:tabs>
+        <w:ind w:left="5040" w:hanging="360"/>
+      </w:pPr>
+      <w:rPr>
+        <w:rFonts w:ascii="Wingdings" w:hAnsi="Wingdings" w:hint="default"/>
+        <w:sz w:val="20"/>
+      </w:rPr>
+    </w:lvl>
+    <w:lvl w:ilvl="7" w:tentative="1">
+      <w:start w:val="1"/>
+      <w:numFmt w:val="bullet"/>
+      <w:lvlText w:val=""/>
+      <w:lvlJc w:val="left"/>
+      <w:pPr>
+        <w:tabs>
+          <w:tab w:val="num" w:pos="5760"/>
+        </w:tabs>
+        <w:ind w:left="5760" w:hanging="360"/>
+      </w:pPr>
+      <w:rPr>
+        <w:rFonts w:ascii="Wingdings" w:hAnsi="Wingdings" w:hint="default"/>
+        <w:sz w:val="20"/>
+      </w:rPr>
+    </w:lvl>
+    <w:lvl w:ilvl="8" w:tentative="1">
+      <w:start w:val="1"/>
+      <w:numFmt w:val="bullet"/>
+      <w:lvlText w:val=""/>
+      <w:lvlJc w:val="left"/>
+      <w:pPr>
+        <w:tabs>
+          <w:tab w:val="num" w:pos="6480"/>
+        </w:tabs>
+        <w:ind w:left="6480" w:hanging="360"/>
+      </w:pPr>
+      <w:rPr>
+        <w:rFonts w:ascii="Wingdings" w:hAnsi="Wingdings" w:hint="default"/>
+        <w:sz w:val="20"/>
+      </w:rPr>
+    </w:lvl>
+  </w:abstractNum>
+  <w:abstractNum w:abstractNumId="13" w15:restartNumberingAfterBreak="0">
     <w:nsid w:val="7BD74BB7"/>
     <w:multiLevelType w:val="multilevel"/>
     <w:tmpl w:val="F64686CA"/>
@@ -1797,13 +5072,46 @@
     </w:lvl>
   </w:abstractNum>
   <w:num w:numId="1" w16cid:durableId="1447694239">
-    <w:abstractNumId w:val="1"/>
+    <w:abstractNumId w:val="4"/>
   </w:num>
   <w:num w:numId="2" w16cid:durableId="989020114">
+    <w:abstractNumId w:val="13"/>
+  </w:num>
+  <w:num w:numId="3" w16cid:durableId="523445481">
+    <w:abstractNumId w:val="3"/>
+  </w:num>
+  <w:num w:numId="4" w16cid:durableId="1391735958">
+    <w:abstractNumId w:val="6"/>
+  </w:num>
+  <w:num w:numId="5" w16cid:durableId="2125809731">
     <w:abstractNumId w:val="2"/>
   </w:num>
-  <w:num w:numId="3" w16cid:durableId="523445481">
+  <w:num w:numId="6" w16cid:durableId="805046568">
+    <w:abstractNumId w:val="9"/>
+  </w:num>
+  <w:num w:numId="7" w16cid:durableId="1058631172">
     <w:abstractNumId w:val="0"/>
+  </w:num>
+  <w:num w:numId="8" w16cid:durableId="497041357">
+    <w:abstractNumId w:val="8"/>
+  </w:num>
+  <w:num w:numId="9" w16cid:durableId="1869567580">
+    <w:abstractNumId w:val="10"/>
+  </w:num>
+  <w:num w:numId="10" w16cid:durableId="1465614256">
+    <w:abstractNumId w:val="7"/>
+  </w:num>
+  <w:num w:numId="11" w16cid:durableId="1194735001">
+    <w:abstractNumId w:val="5"/>
+  </w:num>
+  <w:num w:numId="12" w16cid:durableId="1852138755">
+    <w:abstractNumId w:val="11"/>
+  </w:num>
+  <w:num w:numId="13" w16cid:durableId="1457866980">
+    <w:abstractNumId w:val="12"/>
+  </w:num>
+  <w:num w:numId="14" w16cid:durableId="717558786">
+    <w:abstractNumId w:val="1"/>
   </w:num>
 </w:numbering>
 </file>

</xml_diff>